<commit_message>
Put a border around the tools.
</commit_message>
<xml_diff>
--- a/Documentation/DevelopmentEnvironment.docx
+++ b/Documentation/DevelopmentEnvironment.docx
@@ -2836,15 +2836,25 @@
       <w:r>
         <w:t xml:space="preserve"> </w:t>
       </w:r>
-      <w:hyperlink r:id="rId8" w:history="1">
-        <w:r>
-          <w:rPr>
-            <w:rStyle w:val="Hyperlink"/>
-            <w:sz w:val="18"/>
-          </w:rPr>
-          <w:t>git-scm.com</w:t>
-        </w:r>
-      </w:hyperlink>
+      <w:r>
+        <w:fldChar w:fldCharType="begin"/>
+      </w:r>
+      <w:r>
+        <w:instrText>HYPERLINK "https://git-scm.com/"</w:instrText>
+      </w:r>
+      <w:r>
+        <w:fldChar w:fldCharType="separate"/>
+      </w:r>
+      <w:r>
+        <w:rPr>
+          <w:rStyle w:val="Hyperlink"/>
+          <w:sz w:val="18"/>
+        </w:rPr>
+        <w:t>git-scm.com</w:t>
+      </w:r>
+      <w:r>
+        <w:fldChar w:fldCharType="end"/>
+      </w:r>
       <w:r>
         <w:t>.</w:t>
       </w:r>
@@ -2880,15 +2890,25 @@
       <w:r>
         <w:t xml:space="preserve">at </w:t>
       </w:r>
-      <w:hyperlink r:id="rId9" w:history="1">
-        <w:r>
-          <w:rPr>
-            <w:rStyle w:val="Hyperlink"/>
-            <w:sz w:val="18"/>
-          </w:rPr>
-          <w:t>github.com</w:t>
-        </w:r>
-      </w:hyperlink>
+      <w:r>
+        <w:fldChar w:fldCharType="begin"/>
+      </w:r>
+      <w:r>
+        <w:instrText>HYPERLINK "https://github.com/"</w:instrText>
+      </w:r>
+      <w:r>
+        <w:fldChar w:fldCharType="separate"/>
+      </w:r>
+      <w:r>
+        <w:rPr>
+          <w:rStyle w:val="Hyperlink"/>
+          <w:sz w:val="18"/>
+        </w:rPr>
+        <w:t>github.com</w:t>
+      </w:r>
+      <w:r>
+        <w:fldChar w:fldCharType="end"/>
+      </w:r>
       <w:r>
         <w:t>.</w:t>
       </w:r>
@@ -5091,12 +5111,10 @@
         <w:t xml:space="preserve">$ </w:t>
       </w:r>
       <w:proofErr w:type="spellStart"/>
-      <w:proofErr w:type="gramStart"/>
       <w:r>
         <w:t>git</w:t>
       </w:r>
       <w:proofErr w:type="spellEnd"/>
-      <w:proofErr w:type="gramEnd"/>
       <w:r>
         <w:t xml:space="preserve"> switch develop</w:t>
       </w:r>
@@ -5134,12 +5152,10 @@
         <w:t xml:space="preserve">$ </w:t>
       </w:r>
       <w:proofErr w:type="spellStart"/>
-      <w:proofErr w:type="gramStart"/>
       <w:r>
         <w:t>git</w:t>
       </w:r>
       <w:proofErr w:type="spellEnd"/>
-      <w:proofErr w:type="gramEnd"/>
       <w:r>
         <w:t xml:space="preserve"> add .</w:t>
       </w:r>
@@ -5152,12 +5168,10 @@
         <w:t xml:space="preserve">$ </w:t>
       </w:r>
       <w:proofErr w:type="spellStart"/>
-      <w:proofErr w:type="gramStart"/>
       <w:r>
         <w:t>git</w:t>
       </w:r>
       <w:proofErr w:type="spellEnd"/>
-      <w:proofErr w:type="gramEnd"/>
       <w:r>
         <w:t xml:space="preserve"> commit –m “Create new development version.”</w:t>
       </w:r>
@@ -5246,12 +5260,10 @@
         <w:t xml:space="preserve">$ </w:t>
       </w:r>
       <w:proofErr w:type="spellStart"/>
-      <w:proofErr w:type="gramStart"/>
       <w:r>
         <w:t>git</w:t>
       </w:r>
       <w:proofErr w:type="spellEnd"/>
-      <w:proofErr w:type="gramEnd"/>
       <w:r>
         <w:t xml:space="preserve"> push –u origin develop</w:t>
       </w:r>
@@ -5465,122 +5477,106 @@
         <w:rPr>
           <w:rStyle w:val="SourceCodechar"/>
         </w:rPr>
-        <w:t>$</w:t>
-      </w:r>
-      <w:proofErr w:type="gramStart"/>
+        <w:t>$HOME/.</w:t>
+      </w:r>
+      <w:proofErr w:type="spellStart"/>
       <w:r>
         <w:rPr>
           <w:rStyle w:val="SourceCodechar"/>
         </w:rPr>
-        <w:t>HOME/.</w:t>
-      </w:r>
-      <w:proofErr w:type="spellStart"/>
+        <w:t>gitconfig</w:t>
+      </w:r>
+      <w:proofErr w:type="spellEnd"/>
+      <w:r>
+        <w:rPr>
+          <w:lang w:eastAsia="ar-SA"/>
+        </w:rPr>
+        <w:t>, and</w:t>
+      </w:r>
+      <w:r>
+        <w:rPr>
+          <w:lang w:eastAsia="ar-SA"/>
+        </w:rPr>
+        <w:t xml:space="preserve"> repository configuration settings are stored in the file</w:t>
+      </w:r>
+      <w:r>
+        <w:rPr>
+          <w:rStyle w:val="SourceCodenon-literal"/>
+        </w:rPr>
+        <w:t xml:space="preserve"> </w:t>
+      </w:r>
       <w:r>
         <w:rPr>
           <w:rStyle w:val="SourceCodechar"/>
         </w:rPr>
-        <w:t>gitconfig</w:t>
-      </w:r>
-      <w:proofErr w:type="spellEnd"/>
-      <w:r>
-        <w:rPr>
-          <w:lang w:eastAsia="ar-SA"/>
-        </w:rPr>
-        <w:t>,</w:t>
-      </w:r>
-      <w:proofErr w:type="gramEnd"/>
-      <w:r>
-        <w:rPr>
-          <w:lang w:eastAsia="ar-SA"/>
-        </w:rPr>
-        <w:t xml:space="preserve"> and</w:t>
-      </w:r>
-      <w:r>
-        <w:rPr>
-          <w:lang w:eastAsia="ar-SA"/>
-        </w:rPr>
-        <w:t xml:space="preserve"> repository configuration settings are stored in the file</w:t>
-      </w:r>
-      <w:r>
-        <w:rPr>
-          <w:rStyle w:val="SourceCodenon-literal"/>
-        </w:rPr>
-        <w:t xml:space="preserve"> </w:t>
-      </w:r>
+        <w:t>.</w:t>
+      </w:r>
+      <w:proofErr w:type="spellStart"/>
       <w:r>
         <w:rPr>
           <w:rStyle w:val="SourceCodechar"/>
         </w:rPr>
-        <w:t>.</w:t>
-      </w:r>
-      <w:proofErr w:type="spellStart"/>
+        <w:t>git</w:t>
+      </w:r>
+      <w:proofErr w:type="spellEnd"/>
       <w:r>
         <w:rPr>
           <w:rStyle w:val="SourceCodechar"/>
         </w:rPr>
+        <w:t>/</w:t>
+      </w:r>
+      <w:proofErr w:type="spellStart"/>
+      <w:r>
+        <w:rPr>
+          <w:rStyle w:val="SourceCodechar"/>
+        </w:rPr>
+        <w:t>config</w:t>
+      </w:r>
+      <w:proofErr w:type="spellEnd"/>
+      <w:r>
+        <w:rPr>
+          <w:lang w:eastAsia="ar-SA"/>
+        </w:rPr>
+        <w:t xml:space="preserve"> at the top of the repository.</w:t>
+      </w:r>
+    </w:p>
+    <w:p>
+      <w:pPr>
+        <w:pStyle w:val="Heading4"/>
+      </w:pPr>
+      <w:r>
+        <w:t>User Settings</w:t>
+      </w:r>
+    </w:p>
+    <w:p>
+      <w:pPr>
+        <w:pStyle w:val="Body-Text"/>
+      </w:pPr>
+      <w:r>
+        <w:t>Before using Git to make changes, you need to set your name and email address in Git. This information is needed to track changes to the files.</w:t>
+      </w:r>
+    </w:p>
+    <w:p>
+      <w:pPr>
+        <w:pStyle w:val="SourceCode"/>
+        <w:rPr>
+          <w:lang w:eastAsia="ar-SA"/>
+        </w:rPr>
+      </w:pPr>
+      <w:r>
+        <w:rPr>
+          <w:lang w:eastAsia="ar-SA"/>
+        </w:rPr>
+        <w:t xml:space="preserve">$ </w:t>
+      </w:r>
+      <w:proofErr w:type="spellStart"/>
+      <w:r>
+        <w:rPr>
+          <w:lang w:eastAsia="ar-SA"/>
+        </w:rPr>
         <w:t>git</w:t>
       </w:r>
       <w:proofErr w:type="spellEnd"/>
-      <w:r>
-        <w:rPr>
-          <w:rStyle w:val="SourceCodechar"/>
-        </w:rPr>
-        <w:t>/</w:t>
-      </w:r>
-      <w:proofErr w:type="spellStart"/>
-      <w:r>
-        <w:rPr>
-          <w:rStyle w:val="SourceCodechar"/>
-        </w:rPr>
-        <w:t>config</w:t>
-      </w:r>
-      <w:proofErr w:type="spellEnd"/>
-      <w:r>
-        <w:rPr>
-          <w:lang w:eastAsia="ar-SA"/>
-        </w:rPr>
-        <w:t xml:space="preserve"> at the top of the repository.</w:t>
-      </w:r>
-    </w:p>
-    <w:p>
-      <w:pPr>
-        <w:pStyle w:val="Heading4"/>
-      </w:pPr>
-      <w:r>
-        <w:t>User Settings</w:t>
-      </w:r>
-    </w:p>
-    <w:p>
-      <w:pPr>
-        <w:pStyle w:val="Body-Text"/>
-      </w:pPr>
-      <w:r>
-        <w:t>Before using Git to make changes, you need to set your name and email address in Git. This information is needed to track changes to the files.</w:t>
-      </w:r>
-    </w:p>
-    <w:p>
-      <w:pPr>
-        <w:pStyle w:val="SourceCode"/>
-        <w:rPr>
-          <w:lang w:eastAsia="ar-SA"/>
-        </w:rPr>
-      </w:pPr>
-      <w:r>
-        <w:rPr>
-          <w:lang w:eastAsia="ar-SA"/>
-        </w:rPr>
-        <w:t xml:space="preserve">$ </w:t>
-      </w:r>
-      <w:proofErr w:type="spellStart"/>
-      <w:proofErr w:type="gramStart"/>
-      <w:r>
-        <w:rPr>
-          <w:lang w:eastAsia="ar-SA"/>
-        </w:rPr>
-        <w:t>git</w:t>
-      </w:r>
-      <w:proofErr w:type="spellEnd"/>
-      <w:proofErr w:type="gramEnd"/>
       <w:r>
         <w:rPr>
           <w:lang w:eastAsia="ar-SA"/>
@@ -5635,7 +5631,6 @@
         <w:t xml:space="preserve">$ </w:t>
       </w:r>
       <w:proofErr w:type="spellStart"/>
-      <w:proofErr w:type="gramStart"/>
       <w:r>
         <w:rPr>
           <w:lang w:eastAsia="ar-SA"/>
@@ -5643,7 +5638,6 @@
         <w:t>git</w:t>
       </w:r>
       <w:proofErr w:type="spellEnd"/>
-      <w:proofErr w:type="gramEnd"/>
       <w:r>
         <w:rPr>
           <w:lang w:eastAsia="ar-SA"/>
@@ -5706,19 +5700,11 @@
           <w:lang w:eastAsia="ar-SA"/>
         </w:rPr>
       </w:pPr>
-      <w:proofErr w:type="gramStart"/>
-      <w:r>
-        <w:rPr>
-          <w:lang w:eastAsia="ar-SA"/>
-        </w:rPr>
-        <w:t>The default name for the initial branch when creating a Git repository is “master”.</w:t>
-      </w:r>
-      <w:proofErr w:type="gramEnd"/>
-      <w:r>
-        <w:rPr>
-          <w:lang w:eastAsia="ar-SA"/>
-        </w:rPr>
-        <w:t xml:space="preserve"> This term is deemed improper so it is recommended </w:t>
+      <w:r>
+        <w:rPr>
+          <w:lang w:eastAsia="ar-SA"/>
+        </w:rPr>
+        <w:t xml:space="preserve">The default name for the initial branch when creating a Git repository is “master”. This term is deemed improper so it is recommended </w:t>
       </w:r>
       <w:r>
         <w:rPr>
@@ -5753,7 +5739,6 @@
         <w:t xml:space="preserve">$ </w:t>
       </w:r>
       <w:proofErr w:type="spellStart"/>
-      <w:proofErr w:type="gramStart"/>
       <w:r>
         <w:rPr>
           <w:lang w:eastAsia="ar-SA"/>
@@ -5761,7 +5746,6 @@
         <w:t>git</w:t>
       </w:r>
       <w:proofErr w:type="spellEnd"/>
-      <w:proofErr w:type="gramEnd"/>
       <w:r>
         <w:rPr>
           <w:lang w:eastAsia="ar-SA"/>
@@ -5881,7 +5865,6 @@
         <w:t xml:space="preserve">$ </w:t>
       </w:r>
       <w:proofErr w:type="spellStart"/>
-      <w:proofErr w:type="gramStart"/>
       <w:r>
         <w:rPr>
           <w:lang w:eastAsia="ar-SA"/>
@@ -5889,7 +5872,6 @@
         <w:t>git</w:t>
       </w:r>
       <w:proofErr w:type="spellEnd"/>
-      <w:proofErr w:type="gramEnd"/>
       <w:r>
         <w:rPr>
           <w:lang w:eastAsia="ar-SA"/>
@@ -6113,7 +6095,6 @@
         <w:t xml:space="preserve">$ </w:t>
       </w:r>
       <w:proofErr w:type="spellStart"/>
-      <w:proofErr w:type="gramStart"/>
       <w:r>
         <w:rPr>
           <w:lang w:eastAsia="ar-SA"/>
@@ -6121,7 +6102,6 @@
         <w:t>cd</w:t>
       </w:r>
       <w:proofErr w:type="spellEnd"/>
-      <w:proofErr w:type="gramEnd"/>
       <w:r>
         <w:rPr>
           <w:lang w:eastAsia="ar-SA"/>
@@ -6155,7 +6135,6 @@
         <w:t xml:space="preserve">$ </w:t>
       </w:r>
       <w:proofErr w:type="spellStart"/>
-      <w:proofErr w:type="gramStart"/>
       <w:r>
         <w:rPr>
           <w:lang w:eastAsia="ar-SA"/>
@@ -6163,7 +6142,6 @@
         <w:t>git</w:t>
       </w:r>
       <w:proofErr w:type="spellEnd"/>
-      <w:proofErr w:type="gramEnd"/>
       <w:r>
         <w:rPr>
           <w:lang w:eastAsia="ar-SA"/>
@@ -6385,12 +6363,10 @@
         <w:t xml:space="preserve">$ </w:t>
       </w:r>
       <w:proofErr w:type="spellStart"/>
-      <w:proofErr w:type="gramStart"/>
       <w:r>
         <w:t>git</w:t>
       </w:r>
       <w:proofErr w:type="spellEnd"/>
-      <w:proofErr w:type="gramEnd"/>
       <w:r>
         <w:t xml:space="preserve"> switch </w:t>
       </w:r>
@@ -6416,12 +6392,10 @@
         <w:t xml:space="preserve">$ </w:t>
       </w:r>
       <w:proofErr w:type="spellStart"/>
-      <w:proofErr w:type="gramStart"/>
       <w:r>
         <w:t>git</w:t>
       </w:r>
       <w:proofErr w:type="spellEnd"/>
-      <w:proofErr w:type="gramEnd"/>
       <w:r>
         <w:t xml:space="preserve"> pull</w:t>
       </w:r>
@@ -6866,6 +6840,14 @@
       </w:r>
       <w:r>
         <w:t>”</w:t>
+      </w:r>
+    </w:p>
+    <w:p>
+      <w:pPr>
+        <w:pStyle w:val="SourceCode"/>
+      </w:pPr>
+      <w:r>
+        <w:t>$ git push</w:t>
       </w:r>
     </w:p>
     <w:p>
@@ -10607,7 +10589,7 @@
         <w:pStyle w:val="Body-Text-tight"/>
         <w:ind w:left="1440"/>
       </w:pPr>
-      <w:hyperlink r:id="rId10" w:history="1">
+      <w:hyperlink r:id="rId8" w:history="1">
         <w:r>
           <w:rPr>
             <w:rStyle w:val="Hyperlink"/>
@@ -10623,7 +10605,7 @@
         <w:pStyle w:val="Body-Text-tight"/>
         <w:ind w:left="1440"/>
       </w:pPr>
-      <w:hyperlink r:id="rId11" w:history="1">
+      <w:hyperlink r:id="rId9" w:history="1">
         <w:r>
           <w:rPr>
             <w:rStyle w:val="Hyperlink"/>
@@ -11207,7 +11189,7 @@
       <w:r>
         <w:t xml:space="preserve">Visual Studio Code, usually called VS Code, is a popular, free editor for developers. There are many extensions that give it additional capabilities and interoperability with other tools, but it comes with build in support for HTML, CSS, and JavaScript. For more information on VS Code, go to </w:t>
       </w:r>
-      <w:hyperlink r:id="rId12" w:history="1">
+      <w:hyperlink r:id="rId10" w:history="1">
         <w:r>
           <w:rPr>
             <w:rStyle w:val="Hyperlink"/>
@@ -11240,7 +11222,7 @@
       <w:r>
         <w:t xml:space="preserve">Go to </w:t>
       </w:r>
-      <w:hyperlink r:id="rId13" w:history="1">
+      <w:hyperlink r:id="rId11" w:history="1">
         <w:r>
           <w:rPr>
             <w:rStyle w:val="Hyperlink"/>
@@ -12144,12 +12126,12 @@
       <w:pPr>
         <w:pStyle w:val="Heading2"/>
       </w:pPr>
-      <w:bookmarkStart w:id="32" w:name="_Toc227669205"/>
-      <w:bookmarkStart w:id="33" w:name="_Toc229820421"/>
+      <w:bookmarkStart w:id="32" w:name="_Toc229820421"/>
+      <w:bookmarkStart w:id="33" w:name="_Toc227669205"/>
       <w:r>
         <w:t>Node and NPM</w:t>
       </w:r>
-      <w:bookmarkEnd w:id="33"/>
+      <w:bookmarkEnd w:id="32"/>
     </w:p>
     <w:p>
       <w:pPr>
@@ -12202,7 +12184,7 @@
       <w:r>
         <w:t xml:space="preserve">Go to </w:t>
       </w:r>
-      <w:hyperlink r:id="rId14" w:history="1">
+      <w:hyperlink r:id="rId12" w:history="1">
         <w:r>
           <w:rPr>
             <w:rStyle w:val="Hyperlink"/>
@@ -13099,7 +13081,7 @@
         <w:pStyle w:val="SourceCode"/>
       </w:pPr>
     </w:p>
-    <w:bookmarkEnd w:id="32"/>
+    <w:bookmarkEnd w:id="33"/>
     <w:p>
       <w:pPr>
         <w:pStyle w:val="Body-Text"/>
@@ -13165,7 +13147,7 @@
       <w:r>
         <w:t xml:space="preserve">Go to </w:t>
       </w:r>
-      <w:hyperlink r:id="rId15" w:history="1">
+      <w:hyperlink r:id="rId13" w:history="1">
         <w:r>
           <w:rPr>
             <w:rStyle w:val="Hyperlink"/>
@@ -13369,7 +13351,7 @@
       </w:pPr>
     </w:p>
     <w:sectPr>
-      <w:footerReference w:type="default" r:id="rId16"/>
+      <w:footerReference w:type="default" r:id="rId14"/>
       <w:pgSz w:w="12240" w:h="15840"/>
       <w:pgMar w:top="1440" w:right="1440" w:bottom="1440" w:left="1440" w:header="720" w:footer="720" w:gutter="0"/>
       <w:cols w:space="720"/>
@@ -16673,7 +16655,7 @@
 </file>
 
 <file path=customXml/itemProps1.xml><?xml version="1.0" encoding="utf-8"?>
-<ds:datastoreItem xmlns:ds="http://schemas.openxmlformats.org/officeDocument/2006/customXml" ds:itemID="{092BC927-870F-4C25-9E8C-BA658057938E}">
+<ds:datastoreItem xmlns:ds="http://schemas.openxmlformats.org/officeDocument/2006/customXml" ds:itemID="{A2B58079-CC2D-4CEB-B9D2-008CF21F0485}">
   <ds:schemaRefs>
     <ds:schemaRef ds:uri="http://schemas.openxmlformats.org/officeDocument/2006/bibliography"/>
   </ds:schemaRefs>

</xml_diff>

<commit_message>
Put border around help files.
</commit_message>
<xml_diff>
--- a/Documentation/DevelopmentEnvironment.docx
+++ b/Documentation/DevelopmentEnvironment.docx
@@ -132,7 +132,7 @@
         </w:rPr>
         <w:fldChar w:fldCharType="separate"/>
       </w:r>
-      <w:hyperlink w:anchor="_Toc229820390" w:history="1">
+      <w:hyperlink w:anchor="_Toc229855151" w:history="1">
         <w:r>
           <w:rPr>
             <w:rStyle w:val="Hyperlink"/>
@@ -155,7 +155,7 @@
           <w:rPr>
             <w:webHidden/>
           </w:rPr>
-          <w:instrText xml:space="preserve"> PAGEREF _Toc229820390 \h </w:instrText>
+          <w:instrText xml:space="preserve"> PAGEREF _Toc229855151 \h </w:instrText>
         </w:r>
         <w:r>
           <w:rPr>
@@ -193,7 +193,7 @@
           <w:lang w:eastAsia="en-US"/>
         </w:rPr>
       </w:pPr>
-      <w:hyperlink w:anchor="_Toc229820391" w:history="1">
+      <w:hyperlink w:anchor="_Toc229855152" w:history="1">
         <w:r>
           <w:rPr>
             <w:rStyle w:val="Hyperlink"/>
@@ -220,7 +220,7 @@
             <w:noProof/>
             <w:webHidden/>
           </w:rPr>
-          <w:instrText xml:space="preserve"> PAGEREF _Toc229820391 \h </w:instrText>
+          <w:instrText xml:space="preserve"> PAGEREF _Toc229855152 \h </w:instrText>
         </w:r>
         <w:r>
           <w:rPr>
@@ -262,7 +262,7 @@
           <w:lang w:eastAsia="en-US"/>
         </w:rPr>
       </w:pPr>
-      <w:hyperlink w:anchor="_Toc229820392" w:history="1">
+      <w:hyperlink w:anchor="_Toc229855153" w:history="1">
         <w:r>
           <w:rPr>
             <w:rStyle w:val="Hyperlink"/>
@@ -289,7 +289,7 @@
             <w:noProof/>
             <w:webHidden/>
           </w:rPr>
-          <w:instrText xml:space="preserve"> PAGEREF _Toc229820392 \h </w:instrText>
+          <w:instrText xml:space="preserve"> PAGEREF _Toc229855153 \h </w:instrText>
         </w:r>
         <w:r>
           <w:rPr>
@@ -331,7 +331,7 @@
           <w:lang w:eastAsia="en-US"/>
         </w:rPr>
       </w:pPr>
-      <w:hyperlink w:anchor="_Toc229820393" w:history="1">
+      <w:hyperlink w:anchor="_Toc229855154" w:history="1">
         <w:r>
           <w:rPr>
             <w:rStyle w:val="Hyperlink"/>
@@ -358,7 +358,7 @@
             <w:noProof/>
             <w:webHidden/>
           </w:rPr>
-          <w:instrText xml:space="preserve"> PAGEREF _Toc229820393 \h </w:instrText>
+          <w:instrText xml:space="preserve"> PAGEREF _Toc229855154 \h </w:instrText>
         </w:r>
         <w:r>
           <w:rPr>
@@ -400,7 +400,7 @@
           <w:lang w:eastAsia="en-US"/>
         </w:rPr>
       </w:pPr>
-      <w:hyperlink w:anchor="_Toc229820394" w:history="1">
+      <w:hyperlink w:anchor="_Toc229855155" w:history="1">
         <w:r>
           <w:rPr>
             <w:rStyle w:val="Hyperlink"/>
@@ -427,7 +427,7 @@
             <w:noProof/>
             <w:webHidden/>
           </w:rPr>
-          <w:instrText xml:space="preserve"> PAGEREF _Toc229820394 \h </w:instrText>
+          <w:instrText xml:space="preserve"> PAGEREF _Toc229855155 \h </w:instrText>
         </w:r>
         <w:r>
           <w:rPr>
@@ -469,7 +469,7 @@
           <w:lang w:eastAsia="en-US"/>
         </w:rPr>
       </w:pPr>
-      <w:hyperlink w:anchor="_Toc229820395" w:history="1">
+      <w:hyperlink w:anchor="_Toc229855156" w:history="1">
         <w:r>
           <w:rPr>
             <w:rStyle w:val="Hyperlink"/>
@@ -496,7 +496,7 @@
             <w:noProof/>
             <w:webHidden/>
           </w:rPr>
-          <w:instrText xml:space="preserve"> PAGEREF _Toc229820395 \h </w:instrText>
+          <w:instrText xml:space="preserve"> PAGEREF _Toc229855156 \h </w:instrText>
         </w:r>
         <w:r>
           <w:rPr>
@@ -538,7 +538,7 @@
           <w:lang w:eastAsia="en-US"/>
         </w:rPr>
       </w:pPr>
-      <w:hyperlink w:anchor="_Toc229820396" w:history="1">
+      <w:hyperlink w:anchor="_Toc229855157" w:history="1">
         <w:r>
           <w:rPr>
             <w:rStyle w:val="Hyperlink"/>
@@ -565,7 +565,7 @@
             <w:noProof/>
             <w:webHidden/>
           </w:rPr>
-          <w:instrText xml:space="preserve"> PAGEREF _Toc229820396 \h </w:instrText>
+          <w:instrText xml:space="preserve"> PAGEREF _Toc229855157 \h </w:instrText>
         </w:r>
         <w:r>
           <w:rPr>
@@ -607,7 +607,7 @@
           <w:lang w:eastAsia="en-US"/>
         </w:rPr>
       </w:pPr>
-      <w:hyperlink w:anchor="_Toc229820397" w:history="1">
+      <w:hyperlink w:anchor="_Toc229855158" w:history="1">
         <w:r>
           <w:rPr>
             <w:rStyle w:val="Hyperlink"/>
@@ -634,7 +634,7 @@
             <w:noProof/>
             <w:webHidden/>
           </w:rPr>
-          <w:instrText xml:space="preserve"> PAGEREF _Toc229820397 \h </w:instrText>
+          <w:instrText xml:space="preserve"> PAGEREF _Toc229855158 \h </w:instrText>
         </w:r>
         <w:r>
           <w:rPr>
@@ -676,7 +676,7 @@
           <w:lang w:eastAsia="en-US"/>
         </w:rPr>
       </w:pPr>
-      <w:hyperlink w:anchor="_Toc229820398" w:history="1">
+      <w:hyperlink w:anchor="_Toc229855159" w:history="1">
         <w:r>
           <w:rPr>
             <w:rStyle w:val="Hyperlink"/>
@@ -703,7 +703,7 @@
             <w:noProof/>
             <w:webHidden/>
           </w:rPr>
-          <w:instrText xml:space="preserve"> PAGEREF _Toc229820398 \h </w:instrText>
+          <w:instrText xml:space="preserve"> PAGEREF _Toc229855159 \h </w:instrText>
         </w:r>
         <w:r>
           <w:rPr>
@@ -745,7 +745,7 @@
           <w:lang w:eastAsia="en-US"/>
         </w:rPr>
       </w:pPr>
-      <w:hyperlink w:anchor="_Toc229820399" w:history="1">
+      <w:hyperlink w:anchor="_Toc229855160" w:history="1">
         <w:r>
           <w:rPr>
             <w:rStyle w:val="Hyperlink"/>
@@ -772,7 +772,7 @@
             <w:noProof/>
             <w:webHidden/>
           </w:rPr>
-          <w:instrText xml:space="preserve"> PAGEREF _Toc229820399 \h </w:instrText>
+          <w:instrText xml:space="preserve"> PAGEREF _Toc229855160 \h </w:instrText>
         </w:r>
         <w:r>
           <w:rPr>
@@ -814,7 +814,7 @@
           <w:lang w:eastAsia="en-US"/>
         </w:rPr>
       </w:pPr>
-      <w:hyperlink w:anchor="_Toc229820400" w:history="1">
+      <w:hyperlink w:anchor="_Toc229855161" w:history="1">
         <w:r>
           <w:rPr>
             <w:rStyle w:val="Hyperlink"/>
@@ -841,7 +841,7 @@
             <w:noProof/>
             <w:webHidden/>
           </w:rPr>
-          <w:instrText xml:space="preserve"> PAGEREF _Toc229820400 \h </w:instrText>
+          <w:instrText xml:space="preserve"> PAGEREF _Toc229855161 \h </w:instrText>
         </w:r>
         <w:r>
           <w:rPr>
@@ -883,7 +883,7 @@
           <w:lang w:eastAsia="en-US"/>
         </w:rPr>
       </w:pPr>
-      <w:hyperlink w:anchor="_Toc229820401" w:history="1">
+      <w:hyperlink w:anchor="_Toc229855162" w:history="1">
         <w:r>
           <w:rPr>
             <w:rStyle w:val="Hyperlink"/>
@@ -910,7 +910,7 @@
             <w:noProof/>
             <w:webHidden/>
           </w:rPr>
-          <w:instrText xml:space="preserve"> PAGEREF _Toc229820401 \h </w:instrText>
+          <w:instrText xml:space="preserve"> PAGEREF _Toc229855162 \h </w:instrText>
         </w:r>
         <w:r>
           <w:rPr>
@@ -952,7 +952,7 @@
           <w:lang w:eastAsia="en-US"/>
         </w:rPr>
       </w:pPr>
-      <w:hyperlink w:anchor="_Toc229820402" w:history="1">
+      <w:hyperlink w:anchor="_Toc229855163" w:history="1">
         <w:r>
           <w:rPr>
             <w:rStyle w:val="Hyperlink"/>
@@ -979,7 +979,7 @@
             <w:noProof/>
             <w:webHidden/>
           </w:rPr>
-          <w:instrText xml:space="preserve"> PAGEREF _Toc229820402 \h </w:instrText>
+          <w:instrText xml:space="preserve"> PAGEREF _Toc229855163 \h </w:instrText>
         </w:r>
         <w:r>
           <w:rPr>
@@ -1021,7 +1021,7 @@
           <w:lang w:eastAsia="en-US"/>
         </w:rPr>
       </w:pPr>
-      <w:hyperlink w:anchor="_Toc229820403" w:history="1">
+      <w:hyperlink w:anchor="_Toc229855164" w:history="1">
         <w:r>
           <w:rPr>
             <w:rStyle w:val="Hyperlink"/>
@@ -1048,7 +1048,7 @@
             <w:noProof/>
             <w:webHidden/>
           </w:rPr>
-          <w:instrText xml:space="preserve"> PAGEREF _Toc229820403 \h </w:instrText>
+          <w:instrText xml:space="preserve"> PAGEREF _Toc229855164 \h </w:instrText>
         </w:r>
         <w:r>
           <w:rPr>
@@ -1090,7 +1090,7 @@
           <w:lang w:eastAsia="en-US"/>
         </w:rPr>
       </w:pPr>
-      <w:hyperlink w:anchor="_Toc229820404" w:history="1">
+      <w:hyperlink w:anchor="_Toc229855165" w:history="1">
         <w:r>
           <w:rPr>
             <w:rStyle w:val="Hyperlink"/>
@@ -1117,7 +1117,7 @@
             <w:noProof/>
             <w:webHidden/>
           </w:rPr>
-          <w:instrText xml:space="preserve"> PAGEREF _Toc229820404 \h </w:instrText>
+          <w:instrText xml:space="preserve"> PAGEREF _Toc229855165 \h </w:instrText>
         </w:r>
         <w:r>
           <w:rPr>
@@ -1159,7 +1159,7 @@
           <w:lang w:eastAsia="en-US"/>
         </w:rPr>
       </w:pPr>
-      <w:hyperlink w:anchor="_Toc229820405" w:history="1">
+      <w:hyperlink w:anchor="_Toc229855166" w:history="1">
         <w:r>
           <w:rPr>
             <w:rStyle w:val="Hyperlink"/>
@@ -1186,7 +1186,7 @@
             <w:noProof/>
             <w:webHidden/>
           </w:rPr>
-          <w:instrText xml:space="preserve"> PAGEREF _Toc229820405 \h </w:instrText>
+          <w:instrText xml:space="preserve"> PAGEREF _Toc229855166 \h </w:instrText>
         </w:r>
         <w:r>
           <w:rPr>
@@ -1228,7 +1228,7 @@
           <w:lang w:eastAsia="en-US"/>
         </w:rPr>
       </w:pPr>
-      <w:hyperlink w:anchor="_Toc229820406" w:history="1">
+      <w:hyperlink w:anchor="_Toc229855167" w:history="1">
         <w:r>
           <w:rPr>
             <w:rStyle w:val="Hyperlink"/>
@@ -1255,7 +1255,7 @@
             <w:noProof/>
             <w:webHidden/>
           </w:rPr>
-          <w:instrText xml:space="preserve"> PAGEREF _Toc229820406 \h </w:instrText>
+          <w:instrText xml:space="preserve"> PAGEREF _Toc229855167 \h </w:instrText>
         </w:r>
         <w:r>
           <w:rPr>
@@ -1297,7 +1297,7 @@
           <w:lang w:eastAsia="en-US"/>
         </w:rPr>
       </w:pPr>
-      <w:hyperlink w:anchor="_Toc229820407" w:history="1">
+      <w:hyperlink w:anchor="_Toc229855168" w:history="1">
         <w:r>
           <w:rPr>
             <w:rStyle w:val="Hyperlink"/>
@@ -1324,7 +1324,7 @@
             <w:noProof/>
             <w:webHidden/>
           </w:rPr>
-          <w:instrText xml:space="preserve"> PAGEREF _Toc229820407 \h </w:instrText>
+          <w:instrText xml:space="preserve"> PAGEREF _Toc229855168 \h </w:instrText>
         </w:r>
         <w:r>
           <w:rPr>
@@ -1366,7 +1366,7 @@
           <w:lang w:eastAsia="en-US"/>
         </w:rPr>
       </w:pPr>
-      <w:hyperlink w:anchor="_Toc229820408" w:history="1">
+      <w:hyperlink w:anchor="_Toc229855169" w:history="1">
         <w:r>
           <w:rPr>
             <w:rStyle w:val="Hyperlink"/>
@@ -1393,7 +1393,7 @@
             <w:noProof/>
             <w:webHidden/>
           </w:rPr>
-          <w:instrText xml:space="preserve"> PAGEREF _Toc229820408 \h </w:instrText>
+          <w:instrText xml:space="preserve"> PAGEREF _Toc229855169 \h </w:instrText>
         </w:r>
         <w:r>
           <w:rPr>
@@ -1435,7 +1435,7 @@
           <w:lang w:eastAsia="en-US"/>
         </w:rPr>
       </w:pPr>
-      <w:hyperlink w:anchor="_Toc229820409" w:history="1">
+      <w:hyperlink w:anchor="_Toc229855170" w:history="1">
         <w:r>
           <w:rPr>
             <w:rStyle w:val="Hyperlink"/>
@@ -1462,7 +1462,7 @@
             <w:noProof/>
             <w:webHidden/>
           </w:rPr>
-          <w:instrText xml:space="preserve"> PAGEREF _Toc229820409 \h </w:instrText>
+          <w:instrText xml:space="preserve"> PAGEREF _Toc229855170 \h </w:instrText>
         </w:r>
         <w:r>
           <w:rPr>
@@ -1504,7 +1504,7 @@
           <w:lang w:eastAsia="en-US"/>
         </w:rPr>
       </w:pPr>
-      <w:hyperlink w:anchor="_Toc229820410" w:history="1">
+      <w:hyperlink w:anchor="_Toc229855171" w:history="1">
         <w:r>
           <w:rPr>
             <w:rStyle w:val="Hyperlink"/>
@@ -1531,7 +1531,7 @@
             <w:noProof/>
             <w:webHidden/>
           </w:rPr>
-          <w:instrText xml:space="preserve"> PAGEREF _Toc229820410 \h </w:instrText>
+          <w:instrText xml:space="preserve"> PAGEREF _Toc229855171 \h </w:instrText>
         </w:r>
         <w:r>
           <w:rPr>
@@ -1573,7 +1573,7 @@
           <w:lang w:eastAsia="en-US"/>
         </w:rPr>
       </w:pPr>
-      <w:hyperlink w:anchor="_Toc229820411" w:history="1">
+      <w:hyperlink w:anchor="_Toc229855172" w:history="1">
         <w:r>
           <w:rPr>
             <w:rStyle w:val="Hyperlink"/>
@@ -1600,7 +1600,7 @@
             <w:noProof/>
             <w:webHidden/>
           </w:rPr>
-          <w:instrText xml:space="preserve"> PAGEREF _Toc229820411 \h </w:instrText>
+          <w:instrText xml:space="preserve"> PAGEREF _Toc229855172 \h </w:instrText>
         </w:r>
         <w:r>
           <w:rPr>
@@ -1642,7 +1642,7 @@
           <w:lang w:eastAsia="en-US"/>
         </w:rPr>
       </w:pPr>
-      <w:hyperlink w:anchor="_Toc229820412" w:history="1">
+      <w:hyperlink w:anchor="_Toc229855173" w:history="1">
         <w:r>
           <w:rPr>
             <w:rStyle w:val="Hyperlink"/>
@@ -1669,7 +1669,7 @@
             <w:noProof/>
             <w:webHidden/>
           </w:rPr>
-          <w:instrText xml:space="preserve"> PAGEREF _Toc229820412 \h </w:instrText>
+          <w:instrText xml:space="preserve"> PAGEREF _Toc229855173 \h </w:instrText>
         </w:r>
         <w:r>
           <w:rPr>
@@ -1711,7 +1711,7 @@
           <w:lang w:eastAsia="en-US"/>
         </w:rPr>
       </w:pPr>
-      <w:hyperlink w:anchor="_Toc229820413" w:history="1">
+      <w:hyperlink w:anchor="_Toc229855174" w:history="1">
         <w:r>
           <w:rPr>
             <w:rStyle w:val="Hyperlink"/>
@@ -1738,7 +1738,7 @@
             <w:noProof/>
             <w:webHidden/>
           </w:rPr>
-          <w:instrText xml:space="preserve"> PAGEREF _Toc229820413 \h </w:instrText>
+          <w:instrText xml:space="preserve"> PAGEREF _Toc229855174 \h </w:instrText>
         </w:r>
         <w:r>
           <w:rPr>
@@ -1780,7 +1780,7 @@
           <w:lang w:eastAsia="en-US"/>
         </w:rPr>
       </w:pPr>
-      <w:hyperlink w:anchor="_Toc229820414" w:history="1">
+      <w:hyperlink w:anchor="_Toc229855175" w:history="1">
         <w:r>
           <w:rPr>
             <w:rStyle w:val="Hyperlink"/>
@@ -1807,7 +1807,7 @@
             <w:noProof/>
             <w:webHidden/>
           </w:rPr>
-          <w:instrText xml:space="preserve"> PAGEREF _Toc229820414 \h </w:instrText>
+          <w:instrText xml:space="preserve"> PAGEREF _Toc229855175 \h </w:instrText>
         </w:r>
         <w:r>
           <w:rPr>
@@ -1849,7 +1849,7 @@
           <w:lang w:eastAsia="en-US"/>
         </w:rPr>
       </w:pPr>
-      <w:hyperlink w:anchor="_Toc229820415" w:history="1">
+      <w:hyperlink w:anchor="_Toc229855176" w:history="1">
         <w:r>
           <w:rPr>
             <w:rStyle w:val="Hyperlink"/>
@@ -1872,7 +1872,7 @@
           <w:rPr>
             <w:webHidden/>
           </w:rPr>
-          <w:instrText xml:space="preserve"> PAGEREF _Toc229820415 \h </w:instrText>
+          <w:instrText xml:space="preserve"> PAGEREF _Toc229855176 \h </w:instrText>
         </w:r>
         <w:r>
           <w:rPr>
@@ -1910,7 +1910,7 @@
           <w:lang w:eastAsia="en-US"/>
         </w:rPr>
       </w:pPr>
-      <w:hyperlink w:anchor="_Toc229820416" w:history="1">
+      <w:hyperlink w:anchor="_Toc229855177" w:history="1">
         <w:r>
           <w:rPr>
             <w:rStyle w:val="Hyperlink"/>
@@ -1937,7 +1937,7 @@
             <w:noProof/>
             <w:webHidden/>
           </w:rPr>
-          <w:instrText xml:space="preserve"> PAGEREF _Toc229820416 \h </w:instrText>
+          <w:instrText xml:space="preserve"> PAGEREF _Toc229855177 \h </w:instrText>
         </w:r>
         <w:r>
           <w:rPr>
@@ -1979,7 +1979,7 @@
           <w:lang w:eastAsia="en-US"/>
         </w:rPr>
       </w:pPr>
-      <w:hyperlink w:anchor="_Toc229820417" w:history="1">
+      <w:hyperlink w:anchor="_Toc229855178" w:history="1">
         <w:r>
           <w:rPr>
             <w:rStyle w:val="Hyperlink"/>
@@ -2006,7 +2006,7 @@
             <w:noProof/>
             <w:webHidden/>
           </w:rPr>
-          <w:instrText xml:space="preserve"> PAGEREF _Toc229820417 \h </w:instrText>
+          <w:instrText xml:space="preserve"> PAGEREF _Toc229855178 \h </w:instrText>
         </w:r>
         <w:r>
           <w:rPr>
@@ -2048,7 +2048,7 @@
           <w:lang w:eastAsia="en-US"/>
         </w:rPr>
       </w:pPr>
-      <w:hyperlink w:anchor="_Toc229820418" w:history="1">
+      <w:hyperlink w:anchor="_Toc229855179" w:history="1">
         <w:r>
           <w:rPr>
             <w:rStyle w:val="Hyperlink"/>
@@ -2075,7 +2075,7 @@
             <w:noProof/>
             <w:webHidden/>
           </w:rPr>
-          <w:instrText xml:space="preserve"> PAGEREF _Toc229820418 \h </w:instrText>
+          <w:instrText xml:space="preserve"> PAGEREF _Toc229855179 \h </w:instrText>
         </w:r>
         <w:r>
           <w:rPr>
@@ -2117,7 +2117,7 @@
           <w:lang w:eastAsia="en-US"/>
         </w:rPr>
       </w:pPr>
-      <w:hyperlink w:anchor="_Toc229820419" w:history="1">
+      <w:hyperlink w:anchor="_Toc229855180" w:history="1">
         <w:r>
           <w:rPr>
             <w:rStyle w:val="Hyperlink"/>
@@ -2144,7 +2144,7 @@
             <w:noProof/>
             <w:webHidden/>
           </w:rPr>
-          <w:instrText xml:space="preserve"> PAGEREF _Toc229820419 \h </w:instrText>
+          <w:instrText xml:space="preserve"> PAGEREF _Toc229855180 \h </w:instrText>
         </w:r>
         <w:r>
           <w:rPr>
@@ -2186,7 +2186,7 @@
           <w:lang w:eastAsia="en-US"/>
         </w:rPr>
       </w:pPr>
-      <w:hyperlink w:anchor="_Toc229820420" w:history="1">
+      <w:hyperlink w:anchor="_Toc229855181" w:history="1">
         <w:r>
           <w:rPr>
             <w:rStyle w:val="Hyperlink"/>
@@ -2213,7 +2213,7 @@
             <w:noProof/>
             <w:webHidden/>
           </w:rPr>
-          <w:instrText xml:space="preserve"> PAGEREF _Toc229820420 \h </w:instrText>
+          <w:instrText xml:space="preserve"> PAGEREF _Toc229855181 \h </w:instrText>
         </w:r>
         <w:r>
           <w:rPr>
@@ -2255,7 +2255,7 @@
           <w:lang w:eastAsia="en-US"/>
         </w:rPr>
       </w:pPr>
-      <w:hyperlink w:anchor="_Toc229820421" w:history="1">
+      <w:hyperlink w:anchor="_Toc229855182" w:history="1">
         <w:r>
           <w:rPr>
             <w:rStyle w:val="Hyperlink"/>
@@ -2282,7 +2282,7 @@
             <w:noProof/>
             <w:webHidden/>
           </w:rPr>
-          <w:instrText xml:space="preserve"> PAGEREF _Toc229820421 \h </w:instrText>
+          <w:instrText xml:space="preserve"> PAGEREF _Toc229855182 \h </w:instrText>
         </w:r>
         <w:r>
           <w:rPr>
@@ -2324,7 +2324,7 @@
           <w:lang w:eastAsia="en-US"/>
         </w:rPr>
       </w:pPr>
-      <w:hyperlink w:anchor="_Toc229820422" w:history="1">
+      <w:hyperlink w:anchor="_Toc229855183" w:history="1">
         <w:r>
           <w:rPr>
             <w:rStyle w:val="Hyperlink"/>
@@ -2351,7 +2351,7 @@
             <w:noProof/>
             <w:webHidden/>
           </w:rPr>
-          <w:instrText xml:space="preserve"> PAGEREF _Toc229820422 \h </w:instrText>
+          <w:instrText xml:space="preserve"> PAGEREF _Toc229855183 \h </w:instrText>
         </w:r>
         <w:r>
           <w:rPr>
@@ -2393,7 +2393,7 @@
           <w:lang w:eastAsia="en-US"/>
         </w:rPr>
       </w:pPr>
-      <w:hyperlink w:anchor="_Toc229820423" w:history="1">
+      <w:hyperlink w:anchor="_Toc229855184" w:history="1">
         <w:r>
           <w:rPr>
             <w:rStyle w:val="Hyperlink"/>
@@ -2420,7 +2420,7 @@
             <w:noProof/>
             <w:webHidden/>
           </w:rPr>
-          <w:instrText xml:space="preserve"> PAGEREF _Toc229820423 \h </w:instrText>
+          <w:instrText xml:space="preserve"> PAGEREF _Toc229855184 \h </w:instrText>
         </w:r>
         <w:r>
           <w:rPr>
@@ -2462,7 +2462,7 @@
           <w:lang w:eastAsia="en-US"/>
         </w:rPr>
       </w:pPr>
-      <w:hyperlink w:anchor="_Toc229820424" w:history="1">
+      <w:hyperlink w:anchor="_Toc229855185" w:history="1">
         <w:r>
           <w:rPr>
             <w:rStyle w:val="Hyperlink"/>
@@ -2489,7 +2489,7 @@
             <w:noProof/>
             <w:webHidden/>
           </w:rPr>
-          <w:instrText xml:space="preserve"> PAGEREF _Toc229820424 \h </w:instrText>
+          <w:instrText xml:space="preserve"> PAGEREF _Toc229855185 \h </w:instrText>
         </w:r>
         <w:r>
           <w:rPr>
@@ -2531,7 +2531,7 @@
           <w:lang w:eastAsia="en-US"/>
         </w:rPr>
       </w:pPr>
-      <w:hyperlink w:anchor="_Toc229820425" w:history="1">
+      <w:hyperlink w:anchor="_Toc229855186" w:history="1">
         <w:r>
           <w:rPr>
             <w:rStyle w:val="Hyperlink"/>
@@ -2558,7 +2558,7 @@
             <w:noProof/>
             <w:webHidden/>
           </w:rPr>
-          <w:instrText xml:space="preserve"> PAGEREF _Toc229820425 \h </w:instrText>
+          <w:instrText xml:space="preserve"> PAGEREF _Toc229855186 \h </w:instrText>
         </w:r>
         <w:r>
           <w:rPr>
@@ -2600,7 +2600,7 @@
           <w:lang w:eastAsia="en-US"/>
         </w:rPr>
       </w:pPr>
-      <w:hyperlink w:anchor="_Toc229820426" w:history="1">
+      <w:hyperlink w:anchor="_Toc229855187" w:history="1">
         <w:r>
           <w:rPr>
             <w:rStyle w:val="Hyperlink"/>
@@ -2627,7 +2627,7 @@
             <w:noProof/>
             <w:webHidden/>
           </w:rPr>
-          <w:instrText xml:space="preserve"> PAGEREF _Toc229820426 \h </w:instrText>
+          <w:instrText xml:space="preserve"> PAGEREF _Toc229855187 \h </w:instrText>
         </w:r>
         <w:r>
           <w:rPr>
@@ -2669,7 +2669,7 @@
           <w:lang w:eastAsia="en-US"/>
         </w:rPr>
       </w:pPr>
-      <w:hyperlink w:anchor="_Toc229820427" w:history="1">
+      <w:hyperlink w:anchor="_Toc229855188" w:history="1">
         <w:r>
           <w:rPr>
             <w:rStyle w:val="Hyperlink"/>
@@ -2692,7 +2692,7 @@
           <w:rPr>
             <w:webHidden/>
           </w:rPr>
-          <w:instrText xml:space="preserve"> PAGEREF _Toc229820427 \h </w:instrText>
+          <w:instrText xml:space="preserve"> PAGEREF _Toc229855188 \h </w:instrText>
         </w:r>
         <w:r>
           <w:rPr>
@@ -2730,7 +2730,7 @@
           <w:lang w:eastAsia="en-US"/>
         </w:rPr>
       </w:pPr>
-      <w:hyperlink w:anchor="_Toc229820428" w:history="1">
+      <w:hyperlink w:anchor="_Toc229855189" w:history="1">
         <w:r>
           <w:rPr>
             <w:rStyle w:val="Hyperlink"/>
@@ -2757,7 +2757,7 @@
             <w:noProof/>
             <w:webHidden/>
           </w:rPr>
-          <w:instrText xml:space="preserve"> PAGEREF _Toc229820428 \h </w:instrText>
+          <w:instrText xml:space="preserve"> PAGEREF _Toc229855189 \h </w:instrText>
         </w:r>
         <w:r>
           <w:rPr>
@@ -2810,7 +2810,7 @@
       <w:pPr>
         <w:pStyle w:val="Heading1"/>
       </w:pPr>
-      <w:bookmarkStart w:id="0" w:name="_Toc229820390"/>
+      <w:bookmarkStart w:id="0" w:name="_Toc229855151"/>
       <w:r>
         <w:lastRenderedPageBreak/>
         <w:t>Source Control</w:t>
@@ -2836,25 +2836,15 @@
       <w:r>
         <w:t xml:space="preserve"> </w:t>
       </w:r>
-      <w:r>
-        <w:fldChar w:fldCharType="begin"/>
-      </w:r>
-      <w:r>
-        <w:instrText>HYPERLINK "https://git-scm.com/"</w:instrText>
-      </w:r>
-      <w:r>
-        <w:fldChar w:fldCharType="separate"/>
-      </w:r>
-      <w:r>
-        <w:rPr>
-          <w:rStyle w:val="Hyperlink"/>
-          <w:sz w:val="18"/>
-        </w:rPr>
-        <w:t>git-scm.com</w:t>
-      </w:r>
-      <w:r>
-        <w:fldChar w:fldCharType="end"/>
-      </w:r>
+      <w:hyperlink r:id="rId8" w:history="1">
+        <w:r>
+          <w:rPr>
+            <w:rStyle w:val="Hyperlink"/>
+            <w:sz w:val="18"/>
+          </w:rPr>
+          <w:t>git-scm.com</w:t>
+        </w:r>
+      </w:hyperlink>
       <w:r>
         <w:t>.</w:t>
       </w:r>
@@ -2890,25 +2880,15 @@
       <w:r>
         <w:t xml:space="preserve">at </w:t>
       </w:r>
-      <w:r>
-        <w:fldChar w:fldCharType="begin"/>
-      </w:r>
-      <w:r>
-        <w:instrText>HYPERLINK "https://github.com/"</w:instrText>
-      </w:r>
-      <w:r>
-        <w:fldChar w:fldCharType="separate"/>
-      </w:r>
-      <w:r>
-        <w:rPr>
-          <w:rStyle w:val="Hyperlink"/>
-          <w:sz w:val="18"/>
-        </w:rPr>
-        <w:t>github.com</w:t>
-      </w:r>
-      <w:r>
-        <w:fldChar w:fldCharType="end"/>
-      </w:r>
+      <w:hyperlink r:id="rId9" w:history="1">
+        <w:r>
+          <w:rPr>
+            <w:rStyle w:val="Hyperlink"/>
+            <w:sz w:val="18"/>
+          </w:rPr>
+          <w:t>github.com</w:t>
+        </w:r>
+      </w:hyperlink>
       <w:r>
         <w:t>.</w:t>
       </w:r>
@@ -2917,7 +2897,7 @@
       <w:pPr>
         <w:pStyle w:val="Heading2"/>
       </w:pPr>
-      <w:bookmarkStart w:id="1" w:name="_Toc229820391"/>
+      <w:bookmarkStart w:id="1" w:name="_Toc229855152"/>
       <w:r>
         <w:t>Repositories</w:t>
       </w:r>
@@ -3127,7 +3107,7 @@
       <w:pPr>
         <w:pStyle w:val="Heading3"/>
       </w:pPr>
-      <w:bookmarkStart w:id="2" w:name="_Toc229820392"/>
+      <w:bookmarkStart w:id="2" w:name="_Toc229855153"/>
       <w:r>
         <w:t>Authentication</w:t>
       </w:r>
@@ -3492,7 +3472,7 @@
       <w:pPr>
         <w:pStyle w:val="Heading2"/>
       </w:pPr>
-      <w:bookmarkStart w:id="3" w:name="_Toc229820393"/>
+      <w:bookmarkStart w:id="3" w:name="_Toc229855154"/>
       <w:r>
         <w:t>Branches</w:t>
       </w:r>
@@ -3717,7 +3697,7 @@
       <w:pPr>
         <w:pStyle w:val="Heading2"/>
       </w:pPr>
-      <w:bookmarkStart w:id="4" w:name="_Toc229820394"/>
+      <w:bookmarkStart w:id="4" w:name="_Toc229855155"/>
       <w:r>
         <w:t>Creat</w:t>
       </w:r>
@@ -5295,7 +5275,7 @@
       <w:pPr>
         <w:pStyle w:val="Heading2"/>
       </w:pPr>
-      <w:bookmarkStart w:id="5" w:name="_Toc229820395"/>
+      <w:bookmarkStart w:id="5" w:name="_Toc229855156"/>
       <w:r>
         <w:t xml:space="preserve">Using Git </w:t>
       </w:r>
@@ -5311,7 +5291,7 @@
       <w:pPr>
         <w:pStyle w:val="Heading3"/>
       </w:pPr>
-      <w:bookmarkStart w:id="6" w:name="_Toc229820396"/>
+      <w:bookmarkStart w:id="6" w:name="_Toc229855157"/>
       <w:r>
         <w:t>Configuration</w:t>
       </w:r>
@@ -5974,7 +5954,7 @@
       <w:pPr>
         <w:pStyle w:val="Heading3"/>
       </w:pPr>
-      <w:bookmarkStart w:id="7" w:name="_Toc229820397"/>
+      <w:bookmarkStart w:id="7" w:name="_Toc229855158"/>
       <w:r>
         <w:t>Create</w:t>
       </w:r>
@@ -6159,7 +6139,7 @@
       <w:pPr>
         <w:pStyle w:val="Heading3"/>
       </w:pPr>
-      <w:bookmarkStart w:id="8" w:name="_Toc229820398"/>
+      <w:bookmarkStart w:id="8" w:name="_Toc229855159"/>
       <w:r>
         <w:t>Create</w:t>
       </w:r>
@@ -6294,7 +6274,7 @@
       <w:pPr>
         <w:pStyle w:val="Heading3"/>
       </w:pPr>
-      <w:bookmarkStart w:id="9" w:name="_Toc229820399"/>
+      <w:bookmarkStart w:id="9" w:name="_Toc229855160"/>
       <w:r>
         <w:t>Synchronize with Remote Repository</w:t>
       </w:r>
@@ -6404,7 +6384,7 @@
       <w:pPr>
         <w:pStyle w:val="Heading3"/>
       </w:pPr>
-      <w:bookmarkStart w:id="10" w:name="_Toc229820400"/>
+      <w:bookmarkStart w:id="10" w:name="_Toc229855161"/>
       <w:r>
         <w:t>Get Status</w:t>
       </w:r>
@@ -6846,15 +6826,36 @@
       <w:pPr>
         <w:pStyle w:val="SourceCode"/>
       </w:pPr>
-      <w:r>
-        <w:t>$ git push</w:t>
+    </w:p>
+    <w:p>
+      <w:pPr>
+        <w:pStyle w:val="Body-Text"/>
+      </w:pPr>
+      <w:r>
+        <w:t>Sync with GitHub.</w:t>
+      </w:r>
+    </w:p>
+    <w:p>
+      <w:pPr>
+        <w:pStyle w:val="SourceCode"/>
+      </w:pPr>
+      <w:r>
+        <w:t xml:space="preserve">$ </w:t>
+      </w:r>
+      <w:proofErr w:type="gramStart"/>
+      <w:r>
+        <w:t>git</w:t>
+      </w:r>
+      <w:proofErr w:type="gramEnd"/>
+      <w:r>
+        <w:t xml:space="preserve"> push</w:t>
       </w:r>
     </w:p>
     <w:p>
       <w:pPr>
         <w:pStyle w:val="Heading3"/>
       </w:pPr>
-      <w:bookmarkStart w:id="11" w:name="_Toc229820401"/>
+      <w:bookmarkStart w:id="11" w:name="_Toc229855162"/>
       <w:r>
         <w:t>Select a Branch</w:t>
       </w:r>
@@ -7517,7 +7518,7 @@
       <w:pPr>
         <w:pStyle w:val="Heading3"/>
       </w:pPr>
-      <w:bookmarkStart w:id="12" w:name="_Toc229820402"/>
+      <w:bookmarkStart w:id="12" w:name="_Toc229855163"/>
       <w:r>
         <w:t>Create a New Branch</w:t>
       </w:r>
@@ -7658,6 +7659,7 @@
         <w:pStyle w:val="SourceCode"/>
       </w:pPr>
       <w:r>
+        <w:lastRenderedPageBreak/>
         <w:t xml:space="preserve">$ </w:t>
       </w:r>
       <w:proofErr w:type="spellStart"/>
@@ -7693,9 +7695,8 @@
       <w:pPr>
         <w:pStyle w:val="Heading3"/>
       </w:pPr>
-      <w:bookmarkStart w:id="13" w:name="_Toc229820403"/>
-      <w:r>
-        <w:lastRenderedPageBreak/>
+      <w:bookmarkStart w:id="13" w:name="_Toc229855164"/>
+      <w:r>
         <w:t>Add</w:t>
       </w:r>
       <w:r>
@@ -7931,7 +7932,7 @@
       <w:pPr>
         <w:pStyle w:val="Heading3"/>
       </w:pPr>
-      <w:bookmarkStart w:id="14" w:name="_Toc229820404"/>
+      <w:bookmarkStart w:id="14" w:name="_Toc229855165"/>
       <w:r>
         <w:t>Delete a file</w:t>
       </w:r>
@@ -8070,7 +8071,7 @@
       <w:pPr>
         <w:pStyle w:val="Heading3"/>
       </w:pPr>
-      <w:bookmarkStart w:id="15" w:name="_Toc229820405"/>
+      <w:bookmarkStart w:id="15" w:name="_Toc229855166"/>
       <w:r>
         <w:t>Change a File</w:t>
       </w:r>
@@ -8381,7 +8382,7 @@
       <w:pPr>
         <w:pStyle w:val="Heading3"/>
       </w:pPr>
-      <w:bookmarkStart w:id="16" w:name="_Toc229820406"/>
+      <w:bookmarkStart w:id="16" w:name="_Toc229855167"/>
       <w:r>
         <w:t>Stage a File</w:t>
       </w:r>
@@ -8768,7 +8769,7 @@
       <w:pPr>
         <w:pStyle w:val="Heading3"/>
       </w:pPr>
-      <w:bookmarkStart w:id="17" w:name="_Toc229820407"/>
+      <w:bookmarkStart w:id="17" w:name="_Toc229855168"/>
       <w:r>
         <w:t xml:space="preserve">Commit a </w:t>
       </w:r>
@@ -8899,7 +8900,7 @@
       <w:pPr>
         <w:pStyle w:val="Heading3"/>
       </w:pPr>
-      <w:bookmarkStart w:id="18" w:name="_Toc229820408"/>
+      <w:bookmarkStart w:id="18" w:name="_Toc229855169"/>
       <w:r>
         <w:t>Push Changes to the Remote Repository</w:t>
       </w:r>
@@ -9038,7 +9039,7 @@
       <w:pPr>
         <w:pStyle w:val="Heading3"/>
       </w:pPr>
-      <w:bookmarkStart w:id="19" w:name="_Toc229820409"/>
+      <w:bookmarkStart w:id="19" w:name="_Toc229855170"/>
       <w:r>
         <w:t>Make a Change</w:t>
       </w:r>
@@ -9545,7 +9546,7 @@
       <w:pPr>
         <w:pStyle w:val="Heading3"/>
       </w:pPr>
-      <w:bookmarkStart w:id="20" w:name="_Toc229820410"/>
+      <w:bookmarkStart w:id="20" w:name="_Toc229855171"/>
       <w:r>
         <w:t>Make Change to Main Branch</w:t>
       </w:r>
@@ -9856,7 +9857,7 @@
       <w:pPr>
         <w:pStyle w:val="Heading3"/>
       </w:pPr>
-      <w:bookmarkStart w:id="21" w:name="_Toc229820411"/>
+      <w:bookmarkStart w:id="21" w:name="_Toc229855172"/>
       <w:r>
         <w:t xml:space="preserve">Merge Development Branch into </w:t>
       </w:r>
@@ -10539,7 +10540,7 @@
       <w:pPr>
         <w:pStyle w:val="Heading3"/>
       </w:pPr>
-      <w:bookmarkStart w:id="22" w:name="_Toc229820412"/>
+      <w:bookmarkStart w:id="22" w:name="_Toc229855173"/>
       <w:r>
         <w:t>Get</w:t>
       </w:r>
@@ -10558,7 +10559,7 @@
       <w:pPr>
         <w:pStyle w:val="Heading2"/>
       </w:pPr>
-      <w:bookmarkStart w:id="23" w:name="_Toc229820413"/>
+      <w:bookmarkStart w:id="23" w:name="_Toc229855174"/>
       <w:r>
         <w:rPr>
           <w:lang w:eastAsia="ar-SA"/>
@@ -10589,7 +10590,7 @@
         <w:pStyle w:val="Body-Text-tight"/>
         <w:ind w:left="1440"/>
       </w:pPr>
-      <w:hyperlink r:id="rId8" w:history="1">
+      <w:hyperlink r:id="rId10" w:history="1">
         <w:r>
           <w:rPr>
             <w:rStyle w:val="Hyperlink"/>
@@ -10605,7 +10606,7 @@
         <w:pStyle w:val="Body-Text-tight"/>
         <w:ind w:left="1440"/>
       </w:pPr>
-      <w:hyperlink r:id="rId9" w:history="1">
+      <w:hyperlink r:id="rId11" w:history="1">
         <w:r>
           <w:rPr>
             <w:rStyle w:val="Hyperlink"/>
@@ -10866,7 +10867,7 @@
       <w:pPr>
         <w:pStyle w:val="Heading2"/>
       </w:pPr>
-      <w:bookmarkStart w:id="24" w:name="_Toc229820414"/>
+      <w:bookmarkStart w:id="24" w:name="_Toc229855175"/>
       <w:r>
         <w:t>Git Terminology</w:t>
       </w:r>
@@ -11164,7 +11165,7 @@
       <w:pPr>
         <w:pStyle w:val="Heading1"/>
       </w:pPr>
-      <w:bookmarkStart w:id="25" w:name="_Toc229820415"/>
+      <w:bookmarkStart w:id="25" w:name="_Toc229855176"/>
       <w:r>
         <w:t>Editing Tools</w:t>
       </w:r>
@@ -11175,7 +11176,7 @@
         <w:pStyle w:val="Heading2"/>
       </w:pPr>
       <w:bookmarkStart w:id="26" w:name="_Toc227669204"/>
-      <w:bookmarkStart w:id="27" w:name="_Toc229820416"/>
+      <w:bookmarkStart w:id="27" w:name="_Toc229855177"/>
       <w:r>
         <w:t>VS Code</w:t>
       </w:r>
@@ -11189,7 +11190,7 @@
       <w:r>
         <w:t xml:space="preserve">Visual Studio Code, usually called VS Code, is a popular, free editor for developers. There are many extensions that give it additional capabilities and interoperability with other tools, but it comes with build in support for HTML, CSS, and JavaScript. For more information on VS Code, go to </w:t>
       </w:r>
-      <w:hyperlink r:id="rId10" w:history="1">
+      <w:hyperlink r:id="rId12" w:history="1">
         <w:r>
           <w:rPr>
             <w:rStyle w:val="Hyperlink"/>
@@ -11205,7 +11206,7 @@
       <w:pPr>
         <w:pStyle w:val="Heading3"/>
       </w:pPr>
-      <w:bookmarkStart w:id="28" w:name="_Toc229820417"/>
+      <w:bookmarkStart w:id="28" w:name="_Toc229855178"/>
       <w:r>
         <w:t>Installation</w:t>
       </w:r>
@@ -11222,7 +11223,7 @@
       <w:r>
         <w:t xml:space="preserve">Go to </w:t>
       </w:r>
-      <w:hyperlink r:id="rId11" w:history="1">
+      <w:hyperlink r:id="rId13" w:history="1">
         <w:r>
           <w:rPr>
             <w:rStyle w:val="Hyperlink"/>
@@ -11377,7 +11378,7 @@
       <w:pPr>
         <w:pStyle w:val="Heading3"/>
       </w:pPr>
-      <w:bookmarkStart w:id="29" w:name="_Toc229820418"/>
+      <w:bookmarkStart w:id="29" w:name="_Toc229855179"/>
       <w:r>
         <w:t>Configuration Settings</w:t>
       </w:r>
@@ -11810,7 +11811,7 @@
       <w:pPr>
         <w:pStyle w:val="Heading3"/>
       </w:pPr>
-      <w:bookmarkStart w:id="30" w:name="_Toc229820419"/>
+      <w:bookmarkStart w:id="30" w:name="_Toc229855180"/>
       <w:r>
         <w:t>Extensions</w:t>
       </w:r>
@@ -11956,7 +11957,7 @@
       <w:pPr>
         <w:pStyle w:val="Heading3"/>
       </w:pPr>
-      <w:bookmarkStart w:id="31" w:name="_Toc229820420"/>
+      <w:bookmarkStart w:id="31" w:name="_Toc229855181"/>
       <w:r>
         <w:t>Command Summary</w:t>
       </w:r>
@@ -12126,12 +12127,12 @@
       <w:pPr>
         <w:pStyle w:val="Heading2"/>
       </w:pPr>
-      <w:bookmarkStart w:id="32" w:name="_Toc229820421"/>
-      <w:bookmarkStart w:id="33" w:name="_Toc227669205"/>
+      <w:bookmarkStart w:id="32" w:name="_Toc227669205"/>
+      <w:bookmarkStart w:id="33" w:name="_Toc229855182"/>
       <w:r>
         <w:t>Node and NPM</w:t>
       </w:r>
-      <w:bookmarkEnd w:id="32"/>
+      <w:bookmarkEnd w:id="33"/>
     </w:p>
     <w:p>
       <w:pPr>
@@ -12167,7 +12168,7 @@
       <w:pPr>
         <w:pStyle w:val="Heading3"/>
       </w:pPr>
-      <w:bookmarkStart w:id="34" w:name="_Toc229820422"/>
+      <w:bookmarkStart w:id="34" w:name="_Toc229855183"/>
       <w:r>
         <w:t>Installation</w:t>
       </w:r>
@@ -12184,7 +12185,7 @@
       <w:r>
         <w:t xml:space="preserve">Go to </w:t>
       </w:r>
-      <w:hyperlink r:id="rId12" w:history="1">
+      <w:hyperlink r:id="rId14" w:history="1">
         <w:r>
           <w:rPr>
             <w:rStyle w:val="Hyperlink"/>
@@ -12426,7 +12427,7 @@
       <w:pPr>
         <w:pStyle w:val="Heading3"/>
       </w:pPr>
-      <w:bookmarkStart w:id="35" w:name="_Toc229820423"/>
+      <w:bookmarkStart w:id="35" w:name="_Toc229855184"/>
       <w:r>
         <w:t>Prettier</w:t>
       </w:r>
@@ -12735,7 +12736,7 @@
       <w:pPr>
         <w:pStyle w:val="Heading3"/>
       </w:pPr>
-      <w:bookmarkStart w:id="36" w:name="_Toc229820424"/>
+      <w:bookmarkStart w:id="36" w:name="_Toc229855185"/>
       <w:proofErr w:type="spellStart"/>
       <w:r>
         <w:t>ESLint</w:t>
@@ -13081,7 +13082,7 @@
         <w:pStyle w:val="SourceCode"/>
       </w:pPr>
     </w:p>
-    <w:bookmarkEnd w:id="33"/>
+    <w:bookmarkEnd w:id="32"/>
     <w:p>
       <w:pPr>
         <w:pStyle w:val="Body-Text"/>
@@ -13106,7 +13107,7 @@
       <w:pPr>
         <w:pStyle w:val="Heading2"/>
       </w:pPr>
-      <w:bookmarkStart w:id="37" w:name="_Toc229820425"/>
+      <w:bookmarkStart w:id="37" w:name="_Toc229855186"/>
       <w:r>
         <w:t>Git</w:t>
       </w:r>
@@ -13124,7 +13125,7 @@
       <w:pPr>
         <w:pStyle w:val="Heading3"/>
       </w:pPr>
-      <w:bookmarkStart w:id="38" w:name="_Toc229820426"/>
+      <w:bookmarkStart w:id="38" w:name="_Toc229855187"/>
       <w:r>
         <w:t>Inst</w:t>
       </w:r>
@@ -13147,7 +13148,7 @@
       <w:r>
         <w:t xml:space="preserve">Go to </w:t>
       </w:r>
-      <w:hyperlink r:id="rId13" w:history="1">
+      <w:hyperlink r:id="rId15" w:history="1">
         <w:r>
           <w:rPr>
             <w:rStyle w:val="Hyperlink"/>
@@ -13250,7 +13251,7 @@
       <w:pPr>
         <w:pStyle w:val="Heading1"/>
       </w:pPr>
-      <w:bookmarkStart w:id="39" w:name="_Toc229820427"/>
+      <w:bookmarkStart w:id="39" w:name="_Toc229855188"/>
       <w:r>
         <w:t>Notes</w:t>
       </w:r>
@@ -13260,7 +13261,7 @@
       <w:pPr>
         <w:pStyle w:val="Heading2"/>
       </w:pPr>
-      <w:bookmarkStart w:id="40" w:name="_Toc229820428"/>
+      <w:bookmarkStart w:id="40" w:name="_Toc229855189"/>
       <w:r>
         <w:t>Coding Conventions</w:t>
       </w:r>
@@ -13351,7 +13352,7 @@
       </w:pPr>
     </w:p>
     <w:sectPr>
-      <w:footerReference w:type="default" r:id="rId14"/>
+      <w:footerReference w:type="default" r:id="rId16"/>
       <w:pgSz w:w="12240" w:h="15840"/>
       <w:pgMar w:top="1440" w:right="1440" w:bottom="1440" w:left="1440" w:header="720" w:footer="720" w:gutter="0"/>
       <w:cols w:space="720"/>
@@ -16655,7 +16656,7 @@
 </file>
 
 <file path=customXml/itemProps1.xml><?xml version="1.0" encoding="utf-8"?>
-<ds:datastoreItem xmlns:ds="http://schemas.openxmlformats.org/officeDocument/2006/customXml" ds:itemID="{A2B58079-CC2D-4CEB-B9D2-008CF21F0485}">
+<ds:datastoreItem xmlns:ds="http://schemas.openxmlformats.org/officeDocument/2006/customXml" ds:itemID="{DF1BE714-233E-4507-9438-46295FBB40C7}">
   <ds:schemaRefs>
     <ds:schemaRef ds:uri="http://schemas.openxmlformats.org/officeDocument/2006/bibliography"/>
   </ds:schemaRefs>

</xml_diff>

<commit_message>
Update documentation for release.
</commit_message>
<xml_diff>
--- a/Documentation/DevelopmentEnvironment.docx
+++ b/Documentation/DevelopmentEnvironment.docx
@@ -47,7 +47,7 @@
         <w:rPr>
           <w:noProof/>
         </w:rPr>
-        <w:t>May 16, 2026</w:t>
+        <w:t>May 21, 2026</w:t>
       </w:r>
       <w:r>
         <w:rPr>
@@ -132,7 +132,7 @@
         </w:rPr>
         <w:fldChar w:fldCharType="separate"/>
       </w:r>
-      <w:hyperlink w:anchor="_Toc229855151" w:history="1">
+      <w:hyperlink w:anchor="_Toc230285570" w:history="1">
         <w:r>
           <w:rPr>
             <w:rStyle w:val="Hyperlink"/>
@@ -155,7 +155,7 @@
           <w:rPr>
             <w:webHidden/>
           </w:rPr>
-          <w:instrText xml:space="preserve"> PAGEREF _Toc229855151 \h </w:instrText>
+          <w:instrText xml:space="preserve"> PAGEREF _Toc230285570 \h </w:instrText>
         </w:r>
         <w:r>
           <w:rPr>
@@ -193,7 +193,7 @@
           <w:lang w:eastAsia="en-US"/>
         </w:rPr>
       </w:pPr>
-      <w:hyperlink w:anchor="_Toc229855152" w:history="1">
+      <w:hyperlink w:anchor="_Toc230285571" w:history="1">
         <w:r>
           <w:rPr>
             <w:rStyle w:val="Hyperlink"/>
@@ -220,7 +220,7 @@
             <w:noProof/>
             <w:webHidden/>
           </w:rPr>
-          <w:instrText xml:space="preserve"> PAGEREF _Toc229855152 \h </w:instrText>
+          <w:instrText xml:space="preserve"> PAGEREF _Toc230285571 \h </w:instrText>
         </w:r>
         <w:r>
           <w:rPr>
@@ -262,7 +262,7 @@
           <w:lang w:eastAsia="en-US"/>
         </w:rPr>
       </w:pPr>
-      <w:hyperlink w:anchor="_Toc229855153" w:history="1">
+      <w:hyperlink w:anchor="_Toc230285572" w:history="1">
         <w:r>
           <w:rPr>
             <w:rStyle w:val="Hyperlink"/>
@@ -289,7 +289,7 @@
             <w:noProof/>
             <w:webHidden/>
           </w:rPr>
-          <w:instrText xml:space="preserve"> PAGEREF _Toc229855153 \h </w:instrText>
+          <w:instrText xml:space="preserve"> PAGEREF _Toc230285572 \h </w:instrText>
         </w:r>
         <w:r>
           <w:rPr>
@@ -331,7 +331,7 @@
           <w:lang w:eastAsia="en-US"/>
         </w:rPr>
       </w:pPr>
-      <w:hyperlink w:anchor="_Toc229855154" w:history="1">
+      <w:hyperlink w:anchor="_Toc230285573" w:history="1">
         <w:r>
           <w:rPr>
             <w:rStyle w:val="Hyperlink"/>
@@ -358,7 +358,7 @@
             <w:noProof/>
             <w:webHidden/>
           </w:rPr>
-          <w:instrText xml:space="preserve"> PAGEREF _Toc229855154 \h </w:instrText>
+          <w:instrText xml:space="preserve"> PAGEREF _Toc230285573 \h </w:instrText>
         </w:r>
         <w:r>
           <w:rPr>
@@ -400,7 +400,7 @@
           <w:lang w:eastAsia="en-US"/>
         </w:rPr>
       </w:pPr>
-      <w:hyperlink w:anchor="_Toc229855155" w:history="1">
+      <w:hyperlink w:anchor="_Toc230285574" w:history="1">
         <w:r>
           <w:rPr>
             <w:rStyle w:val="Hyperlink"/>
@@ -427,7 +427,7 @@
             <w:noProof/>
             <w:webHidden/>
           </w:rPr>
-          <w:instrText xml:space="preserve"> PAGEREF _Toc229855155 \h </w:instrText>
+          <w:instrText xml:space="preserve"> PAGEREF _Toc230285574 \h </w:instrText>
         </w:r>
         <w:r>
           <w:rPr>
@@ -469,7 +469,7 @@
           <w:lang w:eastAsia="en-US"/>
         </w:rPr>
       </w:pPr>
-      <w:hyperlink w:anchor="_Toc229855156" w:history="1">
+      <w:hyperlink w:anchor="_Toc230285575" w:history="1">
         <w:r>
           <w:rPr>
             <w:rStyle w:val="Hyperlink"/>
@@ -496,7 +496,7 @@
             <w:noProof/>
             <w:webHidden/>
           </w:rPr>
-          <w:instrText xml:space="preserve"> PAGEREF _Toc229855156 \h </w:instrText>
+          <w:instrText xml:space="preserve"> PAGEREF _Toc230285575 \h </w:instrText>
         </w:r>
         <w:r>
           <w:rPr>
@@ -538,7 +538,7 @@
           <w:lang w:eastAsia="en-US"/>
         </w:rPr>
       </w:pPr>
-      <w:hyperlink w:anchor="_Toc229855157" w:history="1">
+      <w:hyperlink w:anchor="_Toc230285576" w:history="1">
         <w:r>
           <w:rPr>
             <w:rStyle w:val="Hyperlink"/>
@@ -565,7 +565,7 @@
             <w:noProof/>
             <w:webHidden/>
           </w:rPr>
-          <w:instrText xml:space="preserve"> PAGEREF _Toc229855157 \h </w:instrText>
+          <w:instrText xml:space="preserve"> PAGEREF _Toc230285576 \h </w:instrText>
         </w:r>
         <w:r>
           <w:rPr>
@@ -607,7 +607,7 @@
           <w:lang w:eastAsia="en-US"/>
         </w:rPr>
       </w:pPr>
-      <w:hyperlink w:anchor="_Toc229855158" w:history="1">
+      <w:hyperlink w:anchor="_Toc230285577" w:history="1">
         <w:r>
           <w:rPr>
             <w:rStyle w:val="Hyperlink"/>
@@ -634,7 +634,7 @@
             <w:noProof/>
             <w:webHidden/>
           </w:rPr>
-          <w:instrText xml:space="preserve"> PAGEREF _Toc229855158 \h </w:instrText>
+          <w:instrText xml:space="preserve"> PAGEREF _Toc230285577 \h </w:instrText>
         </w:r>
         <w:r>
           <w:rPr>
@@ -676,7 +676,7 @@
           <w:lang w:eastAsia="en-US"/>
         </w:rPr>
       </w:pPr>
-      <w:hyperlink w:anchor="_Toc229855159" w:history="1">
+      <w:hyperlink w:anchor="_Toc230285578" w:history="1">
         <w:r>
           <w:rPr>
             <w:rStyle w:val="Hyperlink"/>
@@ -703,7 +703,7 @@
             <w:noProof/>
             <w:webHidden/>
           </w:rPr>
-          <w:instrText xml:space="preserve"> PAGEREF _Toc229855159 \h </w:instrText>
+          <w:instrText xml:space="preserve"> PAGEREF _Toc230285578 \h </w:instrText>
         </w:r>
         <w:r>
           <w:rPr>
@@ -745,7 +745,7 @@
           <w:lang w:eastAsia="en-US"/>
         </w:rPr>
       </w:pPr>
-      <w:hyperlink w:anchor="_Toc229855160" w:history="1">
+      <w:hyperlink w:anchor="_Toc230285579" w:history="1">
         <w:r>
           <w:rPr>
             <w:rStyle w:val="Hyperlink"/>
@@ -772,7 +772,7 @@
             <w:noProof/>
             <w:webHidden/>
           </w:rPr>
-          <w:instrText xml:space="preserve"> PAGEREF _Toc229855160 \h </w:instrText>
+          <w:instrText xml:space="preserve"> PAGEREF _Toc230285579 \h </w:instrText>
         </w:r>
         <w:r>
           <w:rPr>
@@ -814,7 +814,7 @@
           <w:lang w:eastAsia="en-US"/>
         </w:rPr>
       </w:pPr>
-      <w:hyperlink w:anchor="_Toc229855161" w:history="1">
+      <w:hyperlink w:anchor="_Toc230285580" w:history="1">
         <w:r>
           <w:rPr>
             <w:rStyle w:val="Hyperlink"/>
@@ -841,7 +841,7 @@
             <w:noProof/>
             <w:webHidden/>
           </w:rPr>
-          <w:instrText xml:space="preserve"> PAGEREF _Toc229855161 \h </w:instrText>
+          <w:instrText xml:space="preserve"> PAGEREF _Toc230285580 \h </w:instrText>
         </w:r>
         <w:r>
           <w:rPr>
@@ -883,7 +883,7 @@
           <w:lang w:eastAsia="en-US"/>
         </w:rPr>
       </w:pPr>
-      <w:hyperlink w:anchor="_Toc229855162" w:history="1">
+      <w:hyperlink w:anchor="_Toc230285581" w:history="1">
         <w:r>
           <w:rPr>
             <w:rStyle w:val="Hyperlink"/>
@@ -910,7 +910,7 @@
             <w:noProof/>
             <w:webHidden/>
           </w:rPr>
-          <w:instrText xml:space="preserve"> PAGEREF _Toc229855162 \h </w:instrText>
+          <w:instrText xml:space="preserve"> PAGEREF _Toc230285581 \h </w:instrText>
         </w:r>
         <w:r>
           <w:rPr>
@@ -952,7 +952,7 @@
           <w:lang w:eastAsia="en-US"/>
         </w:rPr>
       </w:pPr>
-      <w:hyperlink w:anchor="_Toc229855163" w:history="1">
+      <w:hyperlink w:anchor="_Toc230285582" w:history="1">
         <w:r>
           <w:rPr>
             <w:rStyle w:val="Hyperlink"/>
@@ -979,7 +979,7 @@
             <w:noProof/>
             <w:webHidden/>
           </w:rPr>
-          <w:instrText xml:space="preserve"> PAGEREF _Toc229855163 \h </w:instrText>
+          <w:instrText xml:space="preserve"> PAGEREF _Toc230285582 \h </w:instrText>
         </w:r>
         <w:r>
           <w:rPr>
@@ -1021,7 +1021,7 @@
           <w:lang w:eastAsia="en-US"/>
         </w:rPr>
       </w:pPr>
-      <w:hyperlink w:anchor="_Toc229855164" w:history="1">
+      <w:hyperlink w:anchor="_Toc230285583" w:history="1">
         <w:r>
           <w:rPr>
             <w:rStyle w:val="Hyperlink"/>
@@ -1048,7 +1048,7 @@
             <w:noProof/>
             <w:webHidden/>
           </w:rPr>
-          <w:instrText xml:space="preserve"> PAGEREF _Toc229855164 \h </w:instrText>
+          <w:instrText xml:space="preserve"> PAGEREF _Toc230285583 \h </w:instrText>
         </w:r>
         <w:r>
           <w:rPr>
@@ -1090,7 +1090,7 @@
           <w:lang w:eastAsia="en-US"/>
         </w:rPr>
       </w:pPr>
-      <w:hyperlink w:anchor="_Toc229855165" w:history="1">
+      <w:hyperlink w:anchor="_Toc230285584" w:history="1">
         <w:r>
           <w:rPr>
             <w:rStyle w:val="Hyperlink"/>
@@ -1117,7 +1117,7 @@
             <w:noProof/>
             <w:webHidden/>
           </w:rPr>
-          <w:instrText xml:space="preserve"> PAGEREF _Toc229855165 \h </w:instrText>
+          <w:instrText xml:space="preserve"> PAGEREF _Toc230285584 \h </w:instrText>
         </w:r>
         <w:r>
           <w:rPr>
@@ -1159,7 +1159,7 @@
           <w:lang w:eastAsia="en-US"/>
         </w:rPr>
       </w:pPr>
-      <w:hyperlink w:anchor="_Toc229855166" w:history="1">
+      <w:hyperlink w:anchor="_Toc230285585" w:history="1">
         <w:r>
           <w:rPr>
             <w:rStyle w:val="Hyperlink"/>
@@ -1186,7 +1186,7 @@
             <w:noProof/>
             <w:webHidden/>
           </w:rPr>
-          <w:instrText xml:space="preserve"> PAGEREF _Toc229855166 \h </w:instrText>
+          <w:instrText xml:space="preserve"> PAGEREF _Toc230285585 \h </w:instrText>
         </w:r>
         <w:r>
           <w:rPr>
@@ -1228,7 +1228,7 @@
           <w:lang w:eastAsia="en-US"/>
         </w:rPr>
       </w:pPr>
-      <w:hyperlink w:anchor="_Toc229855167" w:history="1">
+      <w:hyperlink w:anchor="_Toc230285586" w:history="1">
         <w:r>
           <w:rPr>
             <w:rStyle w:val="Hyperlink"/>
@@ -1255,7 +1255,7 @@
             <w:noProof/>
             <w:webHidden/>
           </w:rPr>
-          <w:instrText xml:space="preserve"> PAGEREF _Toc229855167 \h </w:instrText>
+          <w:instrText xml:space="preserve"> PAGEREF _Toc230285586 \h </w:instrText>
         </w:r>
         <w:r>
           <w:rPr>
@@ -1297,7 +1297,7 @@
           <w:lang w:eastAsia="en-US"/>
         </w:rPr>
       </w:pPr>
-      <w:hyperlink w:anchor="_Toc229855168" w:history="1">
+      <w:hyperlink w:anchor="_Toc230285587" w:history="1">
         <w:r>
           <w:rPr>
             <w:rStyle w:val="Hyperlink"/>
@@ -1324,7 +1324,7 @@
             <w:noProof/>
             <w:webHidden/>
           </w:rPr>
-          <w:instrText xml:space="preserve"> PAGEREF _Toc229855168 \h </w:instrText>
+          <w:instrText xml:space="preserve"> PAGEREF _Toc230285587 \h </w:instrText>
         </w:r>
         <w:r>
           <w:rPr>
@@ -1366,7 +1366,7 @@
           <w:lang w:eastAsia="en-US"/>
         </w:rPr>
       </w:pPr>
-      <w:hyperlink w:anchor="_Toc229855169" w:history="1">
+      <w:hyperlink w:anchor="_Toc230285588" w:history="1">
         <w:r>
           <w:rPr>
             <w:rStyle w:val="Hyperlink"/>
@@ -1393,7 +1393,7 @@
             <w:noProof/>
             <w:webHidden/>
           </w:rPr>
-          <w:instrText xml:space="preserve"> PAGEREF _Toc229855169 \h </w:instrText>
+          <w:instrText xml:space="preserve"> PAGEREF _Toc230285588 \h </w:instrText>
         </w:r>
         <w:r>
           <w:rPr>
@@ -1435,7 +1435,7 @@
           <w:lang w:eastAsia="en-US"/>
         </w:rPr>
       </w:pPr>
-      <w:hyperlink w:anchor="_Toc229855170" w:history="1">
+      <w:hyperlink w:anchor="_Toc230285589" w:history="1">
         <w:r>
           <w:rPr>
             <w:rStyle w:val="Hyperlink"/>
@@ -1462,7 +1462,7 @@
             <w:noProof/>
             <w:webHidden/>
           </w:rPr>
-          <w:instrText xml:space="preserve"> PAGEREF _Toc229855170 \h </w:instrText>
+          <w:instrText xml:space="preserve"> PAGEREF _Toc230285589 \h </w:instrText>
         </w:r>
         <w:r>
           <w:rPr>
@@ -1504,7 +1504,7 @@
           <w:lang w:eastAsia="en-US"/>
         </w:rPr>
       </w:pPr>
-      <w:hyperlink w:anchor="_Toc229855171" w:history="1">
+      <w:hyperlink w:anchor="_Toc230285590" w:history="1">
         <w:r>
           <w:rPr>
             <w:rStyle w:val="Hyperlink"/>
@@ -1531,7 +1531,7 @@
             <w:noProof/>
             <w:webHidden/>
           </w:rPr>
-          <w:instrText xml:space="preserve"> PAGEREF _Toc229855171 \h </w:instrText>
+          <w:instrText xml:space="preserve"> PAGEREF _Toc230285590 \h </w:instrText>
         </w:r>
         <w:r>
           <w:rPr>
@@ -1573,7 +1573,7 @@
           <w:lang w:eastAsia="en-US"/>
         </w:rPr>
       </w:pPr>
-      <w:hyperlink w:anchor="_Toc229855172" w:history="1">
+      <w:hyperlink w:anchor="_Toc230285591" w:history="1">
         <w:r>
           <w:rPr>
             <w:rStyle w:val="Hyperlink"/>
@@ -1600,7 +1600,7 @@
             <w:noProof/>
             <w:webHidden/>
           </w:rPr>
-          <w:instrText xml:space="preserve"> PAGEREF _Toc229855172 \h </w:instrText>
+          <w:instrText xml:space="preserve"> PAGEREF _Toc230285591 \h </w:instrText>
         </w:r>
         <w:r>
           <w:rPr>
@@ -1642,7 +1642,7 @@
           <w:lang w:eastAsia="en-US"/>
         </w:rPr>
       </w:pPr>
-      <w:hyperlink w:anchor="_Toc229855173" w:history="1">
+      <w:hyperlink w:anchor="_Toc230285592" w:history="1">
         <w:r>
           <w:rPr>
             <w:rStyle w:val="Hyperlink"/>
@@ -1669,7 +1669,7 @@
             <w:noProof/>
             <w:webHidden/>
           </w:rPr>
-          <w:instrText xml:space="preserve"> PAGEREF _Toc229855173 \h </w:instrText>
+          <w:instrText xml:space="preserve"> PAGEREF _Toc230285592 \h </w:instrText>
         </w:r>
         <w:r>
           <w:rPr>
@@ -1711,7 +1711,7 @@
           <w:lang w:eastAsia="en-US"/>
         </w:rPr>
       </w:pPr>
-      <w:hyperlink w:anchor="_Toc229855174" w:history="1">
+      <w:hyperlink w:anchor="_Toc230285593" w:history="1">
         <w:r>
           <w:rPr>
             <w:rStyle w:val="Hyperlink"/>
@@ -1738,7 +1738,7 @@
             <w:noProof/>
             <w:webHidden/>
           </w:rPr>
-          <w:instrText xml:space="preserve"> PAGEREF _Toc229855174 \h </w:instrText>
+          <w:instrText xml:space="preserve"> PAGEREF _Toc230285593 \h </w:instrText>
         </w:r>
         <w:r>
           <w:rPr>
@@ -1780,7 +1780,7 @@
           <w:lang w:eastAsia="en-US"/>
         </w:rPr>
       </w:pPr>
-      <w:hyperlink w:anchor="_Toc229855175" w:history="1">
+      <w:hyperlink w:anchor="_Toc230285594" w:history="1">
         <w:r>
           <w:rPr>
             <w:rStyle w:val="Hyperlink"/>
@@ -1807,7 +1807,7 @@
             <w:noProof/>
             <w:webHidden/>
           </w:rPr>
-          <w:instrText xml:space="preserve"> PAGEREF _Toc229855175 \h </w:instrText>
+          <w:instrText xml:space="preserve"> PAGEREF _Toc230285594 \h </w:instrText>
         </w:r>
         <w:r>
           <w:rPr>
@@ -1849,7 +1849,7 @@
           <w:lang w:eastAsia="en-US"/>
         </w:rPr>
       </w:pPr>
-      <w:hyperlink w:anchor="_Toc229855176" w:history="1">
+      <w:hyperlink w:anchor="_Toc230285595" w:history="1">
         <w:r>
           <w:rPr>
             <w:rStyle w:val="Hyperlink"/>
@@ -1872,7 +1872,7 @@
           <w:rPr>
             <w:webHidden/>
           </w:rPr>
-          <w:instrText xml:space="preserve"> PAGEREF _Toc229855176 \h </w:instrText>
+          <w:instrText xml:space="preserve"> PAGEREF _Toc230285595 \h </w:instrText>
         </w:r>
         <w:r>
           <w:rPr>
@@ -1910,7 +1910,7 @@
           <w:lang w:eastAsia="en-US"/>
         </w:rPr>
       </w:pPr>
-      <w:hyperlink w:anchor="_Toc229855177" w:history="1">
+      <w:hyperlink w:anchor="_Toc230285596" w:history="1">
         <w:r>
           <w:rPr>
             <w:rStyle w:val="Hyperlink"/>
@@ -1937,7 +1937,7 @@
             <w:noProof/>
             <w:webHidden/>
           </w:rPr>
-          <w:instrText xml:space="preserve"> PAGEREF _Toc229855177 \h </w:instrText>
+          <w:instrText xml:space="preserve"> PAGEREF _Toc230285596 \h </w:instrText>
         </w:r>
         <w:r>
           <w:rPr>
@@ -1979,7 +1979,7 @@
           <w:lang w:eastAsia="en-US"/>
         </w:rPr>
       </w:pPr>
-      <w:hyperlink w:anchor="_Toc229855178" w:history="1">
+      <w:hyperlink w:anchor="_Toc230285597" w:history="1">
         <w:r>
           <w:rPr>
             <w:rStyle w:val="Hyperlink"/>
@@ -2006,7 +2006,7 @@
             <w:noProof/>
             <w:webHidden/>
           </w:rPr>
-          <w:instrText xml:space="preserve"> PAGEREF _Toc229855178 \h </w:instrText>
+          <w:instrText xml:space="preserve"> PAGEREF _Toc230285597 \h </w:instrText>
         </w:r>
         <w:r>
           <w:rPr>
@@ -2048,7 +2048,7 @@
           <w:lang w:eastAsia="en-US"/>
         </w:rPr>
       </w:pPr>
-      <w:hyperlink w:anchor="_Toc229855179" w:history="1">
+      <w:hyperlink w:anchor="_Toc230285598" w:history="1">
         <w:r>
           <w:rPr>
             <w:rStyle w:val="Hyperlink"/>
@@ -2075,7 +2075,7 @@
             <w:noProof/>
             <w:webHidden/>
           </w:rPr>
-          <w:instrText xml:space="preserve"> PAGEREF _Toc229855179 \h </w:instrText>
+          <w:instrText xml:space="preserve"> PAGEREF _Toc230285598 \h </w:instrText>
         </w:r>
         <w:r>
           <w:rPr>
@@ -2117,7 +2117,7 @@
           <w:lang w:eastAsia="en-US"/>
         </w:rPr>
       </w:pPr>
-      <w:hyperlink w:anchor="_Toc229855180" w:history="1">
+      <w:hyperlink w:anchor="_Toc230285599" w:history="1">
         <w:r>
           <w:rPr>
             <w:rStyle w:val="Hyperlink"/>
@@ -2144,7 +2144,7 @@
             <w:noProof/>
             <w:webHidden/>
           </w:rPr>
-          <w:instrText xml:space="preserve"> PAGEREF _Toc229855180 \h </w:instrText>
+          <w:instrText xml:space="preserve"> PAGEREF _Toc230285599 \h </w:instrText>
         </w:r>
         <w:r>
           <w:rPr>
@@ -2186,7 +2186,7 @@
           <w:lang w:eastAsia="en-US"/>
         </w:rPr>
       </w:pPr>
-      <w:hyperlink w:anchor="_Toc229855181" w:history="1">
+      <w:hyperlink w:anchor="_Toc230285600" w:history="1">
         <w:r>
           <w:rPr>
             <w:rStyle w:val="Hyperlink"/>
@@ -2213,7 +2213,7 @@
             <w:noProof/>
             <w:webHidden/>
           </w:rPr>
-          <w:instrText xml:space="preserve"> PAGEREF _Toc229855181 \h </w:instrText>
+          <w:instrText xml:space="preserve"> PAGEREF _Toc230285600 \h </w:instrText>
         </w:r>
         <w:r>
           <w:rPr>
@@ -2233,7 +2233,7 @@
             <w:noProof/>
             <w:webHidden/>
           </w:rPr>
-          <w:t>13</w:t>
+          <w:t>14</w:t>
         </w:r>
         <w:r>
           <w:rPr>
@@ -2255,7 +2255,7 @@
           <w:lang w:eastAsia="en-US"/>
         </w:rPr>
       </w:pPr>
-      <w:hyperlink w:anchor="_Toc229855182" w:history="1">
+      <w:hyperlink w:anchor="_Toc230285601" w:history="1">
         <w:r>
           <w:rPr>
             <w:rStyle w:val="Hyperlink"/>
@@ -2282,7 +2282,7 @@
             <w:noProof/>
             <w:webHidden/>
           </w:rPr>
-          <w:instrText xml:space="preserve"> PAGEREF _Toc229855182 \h </w:instrText>
+          <w:instrText xml:space="preserve"> PAGEREF _Toc230285601 \h </w:instrText>
         </w:r>
         <w:r>
           <w:rPr>
@@ -2324,7 +2324,7 @@
           <w:lang w:eastAsia="en-US"/>
         </w:rPr>
       </w:pPr>
-      <w:hyperlink w:anchor="_Toc229855183" w:history="1">
+      <w:hyperlink w:anchor="_Toc230285602" w:history="1">
         <w:r>
           <w:rPr>
             <w:rStyle w:val="Hyperlink"/>
@@ -2351,7 +2351,7 @@
             <w:noProof/>
             <w:webHidden/>
           </w:rPr>
-          <w:instrText xml:space="preserve"> PAGEREF _Toc229855183 \h </w:instrText>
+          <w:instrText xml:space="preserve"> PAGEREF _Toc230285602 \h </w:instrText>
         </w:r>
         <w:r>
           <w:rPr>
@@ -2393,7 +2393,7 @@
           <w:lang w:eastAsia="en-US"/>
         </w:rPr>
       </w:pPr>
-      <w:hyperlink w:anchor="_Toc229855184" w:history="1">
+      <w:hyperlink w:anchor="_Toc230285603" w:history="1">
         <w:r>
           <w:rPr>
             <w:rStyle w:val="Hyperlink"/>
@@ -2420,7 +2420,7 @@
             <w:noProof/>
             <w:webHidden/>
           </w:rPr>
-          <w:instrText xml:space="preserve"> PAGEREF _Toc229855184 \h </w:instrText>
+          <w:instrText xml:space="preserve"> PAGEREF _Toc230285603 \h </w:instrText>
         </w:r>
         <w:r>
           <w:rPr>
@@ -2462,7 +2462,7 @@
           <w:lang w:eastAsia="en-US"/>
         </w:rPr>
       </w:pPr>
-      <w:hyperlink w:anchor="_Toc229855185" w:history="1">
+      <w:hyperlink w:anchor="_Toc230285604" w:history="1">
         <w:r>
           <w:rPr>
             <w:rStyle w:val="Hyperlink"/>
@@ -2489,7 +2489,7 @@
             <w:noProof/>
             <w:webHidden/>
           </w:rPr>
-          <w:instrText xml:space="preserve"> PAGEREF _Toc229855185 \h </w:instrText>
+          <w:instrText xml:space="preserve"> PAGEREF _Toc230285604 \h </w:instrText>
         </w:r>
         <w:r>
           <w:rPr>
@@ -2531,7 +2531,7 @@
           <w:lang w:eastAsia="en-US"/>
         </w:rPr>
       </w:pPr>
-      <w:hyperlink w:anchor="_Toc229855186" w:history="1">
+      <w:hyperlink w:anchor="_Toc230285605" w:history="1">
         <w:r>
           <w:rPr>
             <w:rStyle w:val="Hyperlink"/>
@@ -2558,7 +2558,7 @@
             <w:noProof/>
             <w:webHidden/>
           </w:rPr>
-          <w:instrText xml:space="preserve"> PAGEREF _Toc229855186 \h </w:instrText>
+          <w:instrText xml:space="preserve"> PAGEREF _Toc230285605 \h </w:instrText>
         </w:r>
         <w:r>
           <w:rPr>
@@ -2600,7 +2600,7 @@
           <w:lang w:eastAsia="en-US"/>
         </w:rPr>
       </w:pPr>
-      <w:hyperlink w:anchor="_Toc229855187" w:history="1">
+      <w:hyperlink w:anchor="_Toc230285606" w:history="1">
         <w:r>
           <w:rPr>
             <w:rStyle w:val="Hyperlink"/>
@@ -2627,7 +2627,7 @@
             <w:noProof/>
             <w:webHidden/>
           </w:rPr>
-          <w:instrText xml:space="preserve"> PAGEREF _Toc229855187 \h </w:instrText>
+          <w:instrText xml:space="preserve"> PAGEREF _Toc230285606 \h </w:instrText>
         </w:r>
         <w:r>
           <w:rPr>
@@ -2669,7 +2669,7 @@
           <w:lang w:eastAsia="en-US"/>
         </w:rPr>
       </w:pPr>
-      <w:hyperlink w:anchor="_Toc229855188" w:history="1">
+      <w:hyperlink w:anchor="_Toc230285607" w:history="1">
         <w:r>
           <w:rPr>
             <w:rStyle w:val="Hyperlink"/>
@@ -2692,7 +2692,7 @@
           <w:rPr>
             <w:webHidden/>
           </w:rPr>
-          <w:instrText xml:space="preserve"> PAGEREF _Toc229855188 \h </w:instrText>
+          <w:instrText xml:space="preserve"> PAGEREF _Toc230285607 \h </w:instrText>
         </w:r>
         <w:r>
           <w:rPr>
@@ -2730,7 +2730,7 @@
           <w:lang w:eastAsia="en-US"/>
         </w:rPr>
       </w:pPr>
-      <w:hyperlink w:anchor="_Toc229855189" w:history="1">
+      <w:hyperlink w:anchor="_Toc230285608" w:history="1">
         <w:r>
           <w:rPr>
             <w:rStyle w:val="Hyperlink"/>
@@ -2757,7 +2757,7 @@
             <w:noProof/>
             <w:webHidden/>
           </w:rPr>
-          <w:instrText xml:space="preserve"> PAGEREF _Toc229855189 \h </w:instrText>
+          <w:instrText xml:space="preserve"> PAGEREF _Toc230285608 \h </w:instrText>
         </w:r>
         <w:r>
           <w:rPr>
@@ -2810,7 +2810,7 @@
       <w:pPr>
         <w:pStyle w:val="Heading1"/>
       </w:pPr>
-      <w:bookmarkStart w:id="0" w:name="_Toc229855151"/>
+      <w:bookmarkStart w:id="0" w:name="_Toc230285570"/>
       <w:r>
         <w:lastRenderedPageBreak/>
         <w:t>Source Control</w:t>
@@ -2897,7 +2897,7 @@
       <w:pPr>
         <w:pStyle w:val="Heading2"/>
       </w:pPr>
-      <w:bookmarkStart w:id="1" w:name="_Toc229855152"/>
+      <w:bookmarkStart w:id="1" w:name="_Toc230285571"/>
       <w:r>
         <w:t>Repositories</w:t>
       </w:r>
@@ -3107,7 +3107,7 @@
       <w:pPr>
         <w:pStyle w:val="Heading3"/>
       </w:pPr>
-      <w:bookmarkStart w:id="2" w:name="_Toc229855153"/>
+      <w:bookmarkStart w:id="2" w:name="_Toc230285572"/>
       <w:r>
         <w:t>Authentication</w:t>
       </w:r>
@@ -3472,7 +3472,7 @@
       <w:pPr>
         <w:pStyle w:val="Heading2"/>
       </w:pPr>
-      <w:bookmarkStart w:id="3" w:name="_Toc229855154"/>
+      <w:bookmarkStart w:id="3" w:name="_Toc230285573"/>
       <w:r>
         <w:t>Branches</w:t>
       </w:r>
@@ -3697,7 +3697,7 @@
       <w:pPr>
         <w:pStyle w:val="Heading2"/>
       </w:pPr>
-      <w:bookmarkStart w:id="4" w:name="_Toc229855155"/>
+      <w:bookmarkStart w:id="4" w:name="_Toc230285574"/>
       <w:r>
         <w:t>Creat</w:t>
       </w:r>
@@ -5275,7 +5275,7 @@
       <w:pPr>
         <w:pStyle w:val="Heading2"/>
       </w:pPr>
-      <w:bookmarkStart w:id="5" w:name="_Toc229855156"/>
+      <w:bookmarkStart w:id="5" w:name="_Toc230285575"/>
       <w:r>
         <w:t xml:space="preserve">Using Git </w:t>
       </w:r>
@@ -5291,7 +5291,7 @@
       <w:pPr>
         <w:pStyle w:val="Heading3"/>
       </w:pPr>
-      <w:bookmarkStart w:id="6" w:name="_Toc229855157"/>
+      <w:bookmarkStart w:id="6" w:name="_Toc230285576"/>
       <w:r>
         <w:t>Configuration</w:t>
       </w:r>
@@ -5954,7 +5954,7 @@
       <w:pPr>
         <w:pStyle w:val="Heading3"/>
       </w:pPr>
-      <w:bookmarkStart w:id="7" w:name="_Toc229855158"/>
+      <w:bookmarkStart w:id="7" w:name="_Toc230285577"/>
       <w:r>
         <w:t>Create</w:t>
       </w:r>
@@ -6139,7 +6139,7 @@
       <w:pPr>
         <w:pStyle w:val="Heading3"/>
       </w:pPr>
-      <w:bookmarkStart w:id="8" w:name="_Toc229855159"/>
+      <w:bookmarkStart w:id="8" w:name="_Toc230285578"/>
       <w:r>
         <w:t>Create</w:t>
       </w:r>
@@ -6274,7 +6274,7 @@
       <w:pPr>
         <w:pStyle w:val="Heading3"/>
       </w:pPr>
-      <w:bookmarkStart w:id="9" w:name="_Toc229855160"/>
+      <w:bookmarkStart w:id="9" w:name="_Toc230285579"/>
       <w:r>
         <w:t>Synchronize with Remote Repository</w:t>
       </w:r>
@@ -6384,7 +6384,7 @@
       <w:pPr>
         <w:pStyle w:val="Heading3"/>
       </w:pPr>
-      <w:bookmarkStart w:id="10" w:name="_Toc229855161"/>
+      <w:bookmarkStart w:id="10" w:name="_Toc230285580"/>
       <w:r>
         <w:t>Get Status</w:t>
       </w:r>
@@ -6855,7 +6855,7 @@
       <w:pPr>
         <w:pStyle w:val="Heading3"/>
       </w:pPr>
-      <w:bookmarkStart w:id="11" w:name="_Toc229855162"/>
+      <w:bookmarkStart w:id="11" w:name="_Toc230285581"/>
       <w:r>
         <w:t>Select a Branch</w:t>
       </w:r>
@@ -7518,7 +7518,7 @@
       <w:pPr>
         <w:pStyle w:val="Heading3"/>
       </w:pPr>
-      <w:bookmarkStart w:id="12" w:name="_Toc229855163"/>
+      <w:bookmarkStart w:id="12" w:name="_Toc230285582"/>
       <w:r>
         <w:t>Create a New Branch</w:t>
       </w:r>
@@ -7695,7 +7695,7 @@
       <w:pPr>
         <w:pStyle w:val="Heading3"/>
       </w:pPr>
-      <w:bookmarkStart w:id="13" w:name="_Toc229855164"/>
+      <w:bookmarkStart w:id="13" w:name="_Toc230285583"/>
       <w:r>
         <w:t>Add</w:t>
       </w:r>
@@ -7932,7 +7932,7 @@
       <w:pPr>
         <w:pStyle w:val="Heading3"/>
       </w:pPr>
-      <w:bookmarkStart w:id="14" w:name="_Toc229855165"/>
+      <w:bookmarkStart w:id="14" w:name="_Toc230285584"/>
       <w:r>
         <w:t>Delete a file</w:t>
       </w:r>
@@ -8071,7 +8071,7 @@
       <w:pPr>
         <w:pStyle w:val="Heading3"/>
       </w:pPr>
-      <w:bookmarkStart w:id="15" w:name="_Toc229855166"/>
+      <w:bookmarkStart w:id="15" w:name="_Toc230285585"/>
       <w:r>
         <w:t>Change a File</w:t>
       </w:r>
@@ -8382,7 +8382,7 @@
       <w:pPr>
         <w:pStyle w:val="Heading3"/>
       </w:pPr>
-      <w:bookmarkStart w:id="16" w:name="_Toc229855167"/>
+      <w:bookmarkStart w:id="16" w:name="_Toc230285586"/>
       <w:r>
         <w:t>Stage a File</w:t>
       </w:r>
@@ -8769,7 +8769,7 @@
       <w:pPr>
         <w:pStyle w:val="Heading3"/>
       </w:pPr>
-      <w:bookmarkStart w:id="17" w:name="_Toc229855168"/>
+      <w:bookmarkStart w:id="17" w:name="_Toc230285587"/>
       <w:r>
         <w:t xml:space="preserve">Commit a </w:t>
       </w:r>
@@ -8900,7 +8900,7 @@
       <w:pPr>
         <w:pStyle w:val="Heading3"/>
       </w:pPr>
-      <w:bookmarkStart w:id="18" w:name="_Toc229855169"/>
+      <w:bookmarkStart w:id="18" w:name="_Toc230285588"/>
       <w:r>
         <w:t>Push Changes to the Remote Repository</w:t>
       </w:r>
@@ -9039,7 +9039,7 @@
       <w:pPr>
         <w:pStyle w:val="Heading3"/>
       </w:pPr>
-      <w:bookmarkStart w:id="19" w:name="_Toc229855170"/>
+      <w:bookmarkStart w:id="19" w:name="_Toc230285589"/>
       <w:r>
         <w:t>Make a Change</w:t>
       </w:r>
@@ -9546,7 +9546,7 @@
       <w:pPr>
         <w:pStyle w:val="Heading3"/>
       </w:pPr>
-      <w:bookmarkStart w:id="20" w:name="_Toc229855171"/>
+      <w:bookmarkStart w:id="20" w:name="_Toc230285590"/>
       <w:r>
         <w:t>Make Change to Main Branch</w:t>
       </w:r>
@@ -9857,7 +9857,7 @@
       <w:pPr>
         <w:pStyle w:val="Heading3"/>
       </w:pPr>
-      <w:bookmarkStart w:id="21" w:name="_Toc229855172"/>
+      <w:bookmarkStart w:id="21" w:name="_Toc230285591"/>
       <w:r>
         <w:t xml:space="preserve">Merge Development Branch into </w:t>
       </w:r>
@@ -9888,11 +9888,17 @@
         <w:pStyle w:val="Body-Text"/>
         <w:numPr>
           <w:ilvl w:val="0"/>
-          <w:numId w:val="6"/>
+          <w:numId w:val="19"/>
         </w:numPr>
       </w:pPr>
       <w:r>
-        <w:t>Make sure there are no edited files in local repository.</w:t>
+        <w:t xml:space="preserve">Make sure there are no edited files in </w:t>
+      </w:r>
+      <w:r>
+        <w:t>the working directory</w:t>
+      </w:r>
+      <w:r>
+        <w:t>.</w:t>
       </w:r>
       <w:r>
         <w:t xml:space="preserve"> The </w:t>
@@ -9907,9 +9913,15 @@
       <w:proofErr w:type="spellEnd"/>
       <w:r>
         <w:rPr>
+          <w:lang w:eastAsia="ar-SA"/>
+        </w:rPr>
+        <w:t xml:space="preserve"> </w:t>
+      </w:r>
+      <w:r>
+        <w:rPr>
           <w:rStyle w:val="SourceCodechar"/>
         </w:rPr>
-        <w:t xml:space="preserve"> status</w:t>
+        <w:t>status</w:t>
       </w:r>
       <w:r>
         <w:t xml:space="preserve"> command </w:t>
@@ -9930,7 +9942,10 @@
         <w:t xml:space="preserve"> </w:t>
       </w:r>
       <w:r>
-        <w:t>local repository.</w:t>
+        <w:t>working directory</w:t>
+      </w:r>
+      <w:r>
+        <w:t>.</w:t>
       </w:r>
     </w:p>
     <w:p>
@@ -9964,7 +9979,7 @@
         <w:pStyle w:val="Body-Text"/>
         <w:numPr>
           <w:ilvl w:val="0"/>
-          <w:numId w:val="6"/>
+          <w:numId w:val="19"/>
         </w:numPr>
       </w:pPr>
       <w:r>
@@ -10027,7 +10042,7 @@
         <w:pStyle w:val="Body-Text"/>
         <w:numPr>
           <w:ilvl w:val="0"/>
-          <w:numId w:val="6"/>
+          <w:numId w:val="19"/>
         </w:numPr>
       </w:pPr>
       <w:r>
@@ -10062,7 +10077,7 @@
         <w:pStyle w:val="Body-Text"/>
         <w:numPr>
           <w:ilvl w:val="0"/>
-          <w:numId w:val="6"/>
+          <w:numId w:val="19"/>
         </w:numPr>
       </w:pPr>
       <w:r>
@@ -10075,19 +10090,40 @@
         <w:pStyle w:val="SourceCode"/>
       </w:pPr>
       <w:r>
-        <w:t>$ edit version.js version.html</w:t>
-      </w:r>
-    </w:p>
-    <w:p>
-      <w:pPr>
-        <w:pStyle w:val="SourceCode"/>
-      </w:pPr>
-      <w:r>
         <w:t xml:space="preserve">$ </w:t>
       </w:r>
       <w:proofErr w:type="spellStart"/>
       <w:proofErr w:type="gramStart"/>
       <w:r>
+        <w:t>cd</w:t>
+      </w:r>
+      <w:proofErr w:type="spellEnd"/>
+      <w:proofErr w:type="gramEnd"/>
+      <w:r>
+        <w:t xml:space="preserve"> Version</w:t>
+      </w:r>
+    </w:p>
+    <w:p>
+      <w:pPr>
+        <w:pStyle w:val="SourceCode"/>
+      </w:pPr>
+      <w:r>
+        <w:t xml:space="preserve">$ </w:t>
+      </w:r>
+      <w:r>
+        <w:t>edit version.js version.html</w:t>
+      </w:r>
+    </w:p>
+    <w:p>
+      <w:pPr>
+        <w:pStyle w:val="SourceCode"/>
+      </w:pPr>
+      <w:r>
+        <w:t xml:space="preserve">$ </w:t>
+      </w:r>
+      <w:proofErr w:type="spellStart"/>
+      <w:proofErr w:type="gramStart"/>
+      <w:r>
         <w:t>git</w:t>
       </w:r>
       <w:proofErr w:type="spellEnd"/>
@@ -10114,10 +10150,13 @@
         <w:t xml:space="preserve"> </w:t>
       </w:r>
       <w:r>
-        <w:t>commit –a</w:t>
-      </w:r>
-      <w:r>
-        <w:t xml:space="preserve"> “</w:t>
+        <w:t>commit</w:t>
+      </w:r>
+      <w:r>
+        <w:t xml:space="preserve"> –m </w:t>
+      </w:r>
+      <w:r>
+        <w:t>“</w:t>
       </w:r>
       <w:r>
         <w:t>Update version information</w:t>
@@ -10128,6 +10167,24 @@
       <w:r>
         <w:t>”</w:t>
       </w:r>
+    </w:p>
+    <w:p>
+      <w:pPr>
+        <w:pStyle w:val="SourceCode"/>
+      </w:pPr>
+      <w:r>
+        <w:t xml:space="preserve">$ </w:t>
+      </w:r>
+      <w:proofErr w:type="spellStart"/>
+      <w:proofErr w:type="gramStart"/>
+      <w:r>
+        <w:t>cd</w:t>
+      </w:r>
+      <w:proofErr w:type="spellEnd"/>
+      <w:r>
+        <w:t xml:space="preserve"> ..</w:t>
+      </w:r>
+      <w:proofErr w:type="gramEnd"/>
     </w:p>
     <w:p>
       <w:pPr>
@@ -10139,7 +10196,7 @@
         <w:pStyle w:val="Body-Text"/>
         <w:numPr>
           <w:ilvl w:val="0"/>
-          <w:numId w:val="6"/>
+          <w:numId w:val="19"/>
         </w:numPr>
       </w:pPr>
       <w:r>
@@ -10234,42 +10291,55 @@
       <w:proofErr w:type="spellEnd"/>
       <w:proofErr w:type="gramEnd"/>
       <w:r>
-        <w:t xml:space="preserve"> push origin</w:t>
-      </w:r>
-      <w:r>
-        <w:rPr>
-          <w:rStyle w:val="SourceCodenon-literal"/>
-          <w:rFonts w:ascii="Courier New" w:hAnsi="Courier New"/>
-          <w:i w:val="0"/>
-        </w:rPr>
-        <w:t xml:space="preserve"> </w:t>
-      </w:r>
-      <w:proofErr w:type="spellStart"/>
-      <w:r>
-        <w:rPr>
-          <w:rStyle w:val="SourceCodenon-literal"/>
-        </w:rPr>
-        <w:t>V</w:t>
-      </w:r>
-      <w:r>
-        <w:rPr>
-          <w:rStyle w:val="SourceCodenon-literal"/>
-        </w:rPr>
-        <w:t>ersion</w:t>
-      </w:r>
-      <w:r>
-        <w:rPr>
-          <w:rStyle w:val="SourceCodenon-literal"/>
-        </w:rPr>
-        <w:t>N</w:t>
-      </w:r>
-      <w:r>
-        <w:rPr>
-          <w:rStyle w:val="SourceCodenon-literal"/>
-        </w:rPr>
-        <w:t>umber</w:t>
-      </w:r>
-      <w:proofErr w:type="spellEnd"/>
+        <w:t xml:space="preserve"> push</w:t>
+      </w:r>
+      <w:r>
+        <w:tab/>
+      </w:r>
+      <w:r>
+        <w:tab/>
+      </w:r>
+      <w:r>
+        <w:tab/>
+      </w:r>
+      <w:r>
+        <w:tab/>
+        <w:t># Push the commits</w:t>
+      </w:r>
+    </w:p>
+    <w:p>
+      <w:pPr>
+        <w:pStyle w:val="SourceCode"/>
+      </w:pPr>
+      <w:r>
+        <w:t xml:space="preserve">$ </w:t>
+      </w:r>
+      <w:proofErr w:type="spellStart"/>
+      <w:proofErr w:type="gramStart"/>
+      <w:r>
+        <w:t>git</w:t>
+      </w:r>
+      <w:proofErr w:type="spellEnd"/>
+      <w:proofErr w:type="gramEnd"/>
+      <w:r>
+        <w:t xml:space="preserve"> push –-tags</w:t>
+      </w:r>
+      <w:r>
+        <w:tab/>
+      </w:r>
+      <w:r>
+        <w:tab/>
+      </w:r>
+      <w:r>
+        <w:tab/>
+        <w:t># Push the tags</w:t>
+      </w:r>
+      <w:r>
+        <w:tab/>
+      </w:r>
+      <w:r>
+        <w:tab/>
+      </w:r>
     </w:p>
     <w:p>
       <w:pPr>
@@ -10281,11 +10351,20 @@
         <w:pStyle w:val="Body-Text"/>
         <w:numPr>
           <w:ilvl w:val="0"/>
-          <w:numId w:val="6"/>
+          <w:numId w:val="19"/>
         </w:numPr>
       </w:pPr>
       <w:r>
-        <w:t>Rename local repository to name of release directory on the web.</w:t>
+        <w:t xml:space="preserve">Copy the release files to the release directory for pushing to the web page. The TaxTools working directory should still be in the </w:t>
+      </w:r>
+      <w:r>
+        <w:t>release</w:t>
+      </w:r>
+      <w:r>
+        <w:t xml:space="preserve"> branch</w:t>
+      </w:r>
+      <w:r>
+        <w:t xml:space="preserve"> (main).</w:t>
       </w:r>
     </w:p>
     <w:p>
@@ -10305,6 +10384,9 @@
       <w:r>
         <w:t xml:space="preserve"> $TAXTOOLS</w:t>
       </w:r>
+      <w:r>
+        <w:t>/..</w:t>
+      </w:r>
     </w:p>
     <w:p>
       <w:pPr>
@@ -10316,83 +10398,95 @@
       <w:proofErr w:type="spellStart"/>
       <w:proofErr w:type="gramStart"/>
       <w:r>
-        <w:t>mv</w:t>
+        <w:t>rm</w:t>
       </w:r>
       <w:proofErr w:type="spellEnd"/>
       <w:proofErr w:type="gramEnd"/>
       <w:r>
+        <w:t xml:space="preserve"> –</w:t>
+      </w:r>
+      <w:proofErr w:type="spellStart"/>
+      <w:r>
+        <w:t>rf</w:t>
+      </w:r>
+      <w:proofErr w:type="spellEnd"/>
+      <w:r>
         <w:t xml:space="preserve"> </w:t>
       </w:r>
       <w:proofErr w:type="spellStart"/>
       <w:r>
-        <w:t>oldDir</w:t>
-      </w:r>
-      <w:proofErr w:type="spellEnd"/>
-      <w:r>
-        <w:t xml:space="preserve"> </w:t>
-      </w:r>
-      <w:proofErr w:type="spellStart"/>
-      <w:r>
-        <w:t>newDir</w:t>
-      </w:r>
-      <w:proofErr w:type="spellEnd"/>
-    </w:p>
-    <w:p>
-      <w:pPr>
-        <w:pStyle w:val="SourceCode"/>
-      </w:pPr>
-      <w:r>
-        <w:t>$ Update TAXTOOLS environment variable.</w:t>
-      </w:r>
-    </w:p>
-    <w:p>
-      <w:pPr>
-        <w:pStyle w:val="SourceCode"/>
-      </w:pPr>
-      <w:r>
-        <w:t>$ Update desktop link to TaxTools</w:t>
-      </w:r>
-    </w:p>
-    <w:p>
-      <w:pPr>
-        <w:pStyle w:val="SourceCode"/>
-      </w:pPr>
-      <w:r>
-        <w:t xml:space="preserve">Open </w:t>
-      </w:r>
-      <w:proofErr w:type="spellStart"/>
-      <w:r>
-        <w:t>DreamWeaver</w:t>
-      </w:r>
-      <w:proofErr w:type="spellEnd"/>
-    </w:p>
-    <w:p>
-      <w:pPr>
-        <w:pStyle w:val="SourceCode"/>
-      </w:pPr>
-      <w:r>
-        <w:t>Push new TaxTools to web</w:t>
-      </w:r>
-    </w:p>
-    <w:p>
-      <w:pPr>
-        <w:pStyle w:val="SourceCode"/>
-      </w:pPr>
-      <w:r>
-        <w:t>Create TAR file of released files</w:t>
-      </w:r>
-    </w:p>
-    <w:p>
-      <w:pPr>
-        <w:pStyle w:val="SourceCode"/>
-      </w:pPr>
-      <w:r>
-        <w:t>Update Taxes/TaxTools/index.html to refer to new folder</w:t>
-      </w:r>
-    </w:p>
-    <w:p>
-      <w:pPr>
-        <w:pStyle w:val="SourceCode"/>
+        <w:t>TaxToolsNew</w:t>
+      </w:r>
+      <w:proofErr w:type="spellEnd"/>
+    </w:p>
+    <w:p>
+      <w:pPr>
+        <w:pStyle w:val="SourceCode"/>
+      </w:pPr>
+      <w:r>
+        <w:t xml:space="preserve">$ </w:t>
+      </w:r>
+      <w:proofErr w:type="spellStart"/>
+      <w:r>
+        <w:t>TaxToolsDev</w:t>
+      </w:r>
+      <w:proofErr w:type="spellEnd"/>
+      <w:r>
+        <w:t>/tools/</w:t>
+      </w:r>
+      <w:proofErr w:type="spellStart"/>
+      <w:r>
+        <w:t>UpdateRelease</w:t>
+      </w:r>
+      <w:proofErr w:type="spellEnd"/>
+      <w:r>
+        <w:tab/>
+      </w:r>
+      <w:r>
+        <w:tab/>
+        <w:t xml:space="preserve"># Copy </w:t>
+      </w:r>
+      <w:proofErr w:type="spellStart"/>
+      <w:r>
+        <w:t>TaxToolsDev</w:t>
+      </w:r>
+      <w:proofErr w:type="spellEnd"/>
+      <w:r>
+        <w:t xml:space="preserve"> to </w:t>
+      </w:r>
+      <w:proofErr w:type="spellStart"/>
+      <w:r>
+        <w:t>TaxToolsNew</w:t>
+      </w:r>
+      <w:proofErr w:type="spellEnd"/>
+    </w:p>
+    <w:p>
+      <w:pPr>
+        <w:pStyle w:val="SourceCode"/>
+      </w:pPr>
+      <w:r>
+        <w:t xml:space="preserve">$ </w:t>
+      </w:r>
+      <w:proofErr w:type="spellStart"/>
+      <w:proofErr w:type="gramStart"/>
+      <w:r>
+        <w:t>dircmp</w:t>
+      </w:r>
+      <w:proofErr w:type="spellEnd"/>
+      <w:proofErr w:type="gramEnd"/>
+      <w:r>
+        <w:t xml:space="preserve"> TaxTools </w:t>
+      </w:r>
+      <w:proofErr w:type="spellStart"/>
+      <w:r>
+        <w:t>TaxToolsNew</w:t>
+      </w:r>
+      <w:proofErr w:type="spellEnd"/>
+    </w:p>
+    <w:p>
+      <w:pPr>
+        <w:pStyle w:val="SourceCode"/>
+        <w:ind w:left="0"/>
       </w:pPr>
     </w:p>
     <w:p>
@@ -10400,34 +10494,201 @@
         <w:pStyle w:val="Body-Text"/>
         <w:numPr>
           <w:ilvl w:val="0"/>
-          <w:numId w:val="6"/>
+          <w:numId w:val="19"/>
         </w:numPr>
       </w:pPr>
       <w:r>
-        <w:t xml:space="preserve">Update the Web page with the new prototype version. Open </w:t>
-      </w:r>
-      <w:proofErr w:type="spellStart"/>
-      <w:r>
-        <w:t>DreamWeaver</w:t>
-      </w:r>
-      <w:proofErr w:type="spellEnd"/>
-      <w:r>
-        <w:t xml:space="preserve"> and push the TaxTools folder to the web.</w:t>
-      </w:r>
+        <w:t xml:space="preserve">If everything looks good, </w:t>
+      </w:r>
+      <w:r>
+        <w:t xml:space="preserve">make a backup copy and </w:t>
+      </w:r>
+      <w:r>
+        <w:t xml:space="preserve">replace the TaxTools directory with </w:t>
+      </w:r>
+      <w:proofErr w:type="spellStart"/>
+      <w:r>
+        <w:t>TaxToolsNew</w:t>
+      </w:r>
+      <w:proofErr w:type="spellEnd"/>
+      <w:r>
+        <w:t>.</w:t>
+      </w:r>
+    </w:p>
+    <w:p>
+      <w:pPr>
+        <w:pStyle w:val="SourceCode"/>
+      </w:pPr>
+      <w:r>
+        <w:t xml:space="preserve">$ $ </w:t>
+      </w:r>
+      <w:proofErr w:type="spellStart"/>
+      <w:r>
+        <w:t>mv</w:t>
+      </w:r>
+      <w:proofErr w:type="spellEnd"/>
+      <w:r>
+        <w:t xml:space="preserve"> </w:t>
+      </w:r>
+      <w:proofErr w:type="spellStart"/>
+      <w:r>
+        <w:t>TaxToolsNew</w:t>
+      </w:r>
+      <w:proofErr w:type="spellEnd"/>
+      <w:r>
+        <w:t xml:space="preserve"> TaxTools-</w:t>
+      </w:r>
+      <w:proofErr w:type="spellStart"/>
+      <w:r>
+        <w:rPr>
+          <w:rStyle w:val="SourceCodenon-literal"/>
+        </w:rPr>
+        <w:t>VersionNumber</w:t>
+      </w:r>
+      <w:proofErr w:type="spellEnd"/>
+    </w:p>
+    <w:p>
+      <w:pPr>
+        <w:pStyle w:val="SourceCode"/>
+        <w:rPr>
+          <w:rStyle w:val="SourceCodenon-literal"/>
+        </w:rPr>
+      </w:pPr>
+      <w:r>
+        <w:t xml:space="preserve">$ </w:t>
+      </w:r>
+      <w:proofErr w:type="gramStart"/>
+      <w:r>
+        <w:t>tar</w:t>
+      </w:r>
+      <w:proofErr w:type="gramEnd"/>
+      <w:r>
+        <w:t xml:space="preserve"> –</w:t>
+      </w:r>
+      <w:proofErr w:type="spellStart"/>
+      <w:r>
+        <w:t>cvf</w:t>
+      </w:r>
+      <w:proofErr w:type="spellEnd"/>
+      <w:r>
+        <w:t xml:space="preserve"> TaxTools-</w:t>
+      </w:r>
+      <w:r>
+        <w:rPr>
+          <w:rStyle w:val="SourceCodenon-literal"/>
+        </w:rPr>
+        <w:t>VersionNumber</w:t>
+      </w:r>
+      <w:r>
+        <w:t>.tgz TaxTools-</w:t>
+      </w:r>
+      <w:proofErr w:type="spellStart"/>
+      <w:r>
+        <w:rPr>
+          <w:rStyle w:val="SourceCodenon-literal"/>
+        </w:rPr>
+        <w:t>VersionNumber</w:t>
+      </w:r>
+      <w:proofErr w:type="spellEnd"/>
+    </w:p>
+    <w:p>
+      <w:pPr>
+        <w:pStyle w:val="SourceCode"/>
+      </w:pPr>
+      <w:r>
+        <w:t xml:space="preserve">$ </w:t>
+      </w:r>
+      <w:proofErr w:type="gramStart"/>
+      <w:r>
+        <w:t>cp</w:t>
+      </w:r>
+      <w:proofErr w:type="gramEnd"/>
+      <w:r>
+        <w:t xml:space="preserve"> TaxTools-</w:t>
+      </w:r>
+      <w:r>
+        <w:rPr>
+          <w:rStyle w:val="SourceCodenon-literal"/>
+        </w:rPr>
+        <w:t>VersionNumber</w:t>
+      </w:r>
+      <w:r>
+        <w:t>.tgz $ARCHIVE/TaxTools</w:t>
+      </w:r>
+    </w:p>
+    <w:p>
+      <w:pPr>
+        <w:pStyle w:val="SourceCode"/>
+      </w:pPr>
+      <w:r>
+        <w:t xml:space="preserve">$ </w:t>
+      </w:r>
+      <w:proofErr w:type="spellStart"/>
+      <w:proofErr w:type="gramStart"/>
+      <w:r>
+        <w:t>rm</w:t>
+      </w:r>
+      <w:proofErr w:type="spellEnd"/>
+      <w:proofErr w:type="gramEnd"/>
+      <w:r>
+        <w:t xml:space="preserve"> –</w:t>
+      </w:r>
+      <w:proofErr w:type="spellStart"/>
+      <w:r>
+        <w:t>rf</w:t>
+      </w:r>
+      <w:proofErr w:type="spellEnd"/>
+      <w:r>
+        <w:t xml:space="preserve"> TaxTools</w:t>
+      </w:r>
+    </w:p>
+    <w:p>
+      <w:pPr>
+        <w:pStyle w:val="SourceCode"/>
+      </w:pPr>
+      <w:r>
+        <w:t xml:space="preserve">$ </w:t>
+      </w:r>
+      <w:proofErr w:type="spellStart"/>
+      <w:proofErr w:type="gramStart"/>
+      <w:r>
+        <w:t>mv</w:t>
+      </w:r>
+      <w:proofErr w:type="spellEnd"/>
+      <w:proofErr w:type="gramEnd"/>
+      <w:r>
+        <w:t xml:space="preserve"> </w:t>
+      </w:r>
+      <w:r>
+        <w:t>TaxTools-</w:t>
+      </w:r>
+      <w:proofErr w:type="spellStart"/>
+      <w:r>
+        <w:rPr>
+          <w:rStyle w:val="SourceCodenon-literal"/>
+        </w:rPr>
+        <w:t>VersionNumber</w:t>
+      </w:r>
+      <w:proofErr w:type="spellEnd"/>
+      <w:r>
+        <w:t xml:space="preserve"> TaxTools</w:t>
+      </w:r>
+    </w:p>
+    <w:p>
+      <w:pPr>
+        <w:pStyle w:val="SourceCode"/>
+      </w:pPr>
     </w:p>
     <w:p>
       <w:pPr>
         <w:pStyle w:val="Body-Text"/>
         <w:numPr>
           <w:ilvl w:val="0"/>
-          <w:numId w:val="6"/>
+          <w:numId w:val="19"/>
         </w:numPr>
       </w:pPr>
       <w:r>
-        <w:t>Change the local repository back to the development branch</w:t>
-      </w:r>
-      <w:r>
-        <w:t>. Rename the local repository back to the name of the prototype version on the web.</w:t>
+        <w:t>Update the web with the new version of TaxTools.</w:t>
       </w:r>
     </w:p>
     <w:p>
@@ -10437,33 +10698,31 @@
       <w:r>
         <w:t xml:space="preserve">$ </w:t>
       </w:r>
-      <w:proofErr w:type="spellStart"/>
-      <w:proofErr w:type="gramStart"/>
-      <w:r>
-        <w:t>git</w:t>
-      </w:r>
-      <w:proofErr w:type="spellEnd"/>
-      <w:proofErr w:type="gramEnd"/>
-      <w:r>
-        <w:t xml:space="preserve"> checkout develop</w:t>
-      </w:r>
-    </w:p>
-    <w:p>
-      <w:pPr>
-        <w:pStyle w:val="SourceCode"/>
-      </w:pPr>
-      <w:r>
-        <w:t xml:space="preserve">$ </w:t>
-      </w:r>
-      <w:proofErr w:type="spellStart"/>
-      <w:proofErr w:type="gramStart"/>
-      <w:r>
-        <w:t>git</w:t>
-      </w:r>
-      <w:proofErr w:type="spellEnd"/>
-      <w:proofErr w:type="gramEnd"/>
-      <w:r>
-        <w:t xml:space="preserve"> pull</w:t>
+      <w:r>
+        <w:t xml:space="preserve">Open </w:t>
+      </w:r>
+      <w:proofErr w:type="spellStart"/>
+      <w:r>
+        <w:t>DreamWeaver</w:t>
+      </w:r>
+      <w:proofErr w:type="spellEnd"/>
+    </w:p>
+    <w:p>
+      <w:pPr>
+        <w:pStyle w:val="SourceCode"/>
+        <w:ind w:firstLine="720"/>
+      </w:pPr>
+      <w:r>
+        <w:t xml:space="preserve"># </w:t>
+      </w:r>
+      <w:r>
+        <w:t xml:space="preserve">Push </w:t>
+      </w:r>
+      <w:r>
+        <w:t xml:space="preserve">the </w:t>
+      </w:r>
+      <w:r>
+        <w:t>new TaxTools to web</w:t>
       </w:r>
     </w:p>
     <w:p>
@@ -10476,11 +10735,101 @@
         <w:pStyle w:val="Body-Text"/>
         <w:numPr>
           <w:ilvl w:val="0"/>
-          <w:numId w:val="6"/>
+          <w:numId w:val="19"/>
         </w:numPr>
       </w:pPr>
       <w:r>
-        <w:t>Update Version Information. Edit the version files directly in the main branch. Increment version number (second number) and update version log.</w:t>
+        <w:t>Change the local repository back to the development branch</w:t>
+      </w:r>
+      <w:r>
+        <w:t>.</w:t>
+      </w:r>
+    </w:p>
+    <w:p>
+      <w:pPr>
+        <w:pStyle w:val="SourceCode"/>
+      </w:pPr>
+      <w:r>
+        <w:t xml:space="preserve">$ </w:t>
+      </w:r>
+      <w:proofErr w:type="spellStart"/>
+      <w:proofErr w:type="gramStart"/>
+      <w:r>
+        <w:t>cd</w:t>
+      </w:r>
+      <w:proofErr w:type="spellEnd"/>
+      <w:proofErr w:type="gramEnd"/>
+      <w:r>
+        <w:t xml:space="preserve"> $TAXTOOLS</w:t>
+      </w:r>
+    </w:p>
+    <w:p>
+      <w:pPr>
+        <w:pStyle w:val="SourceCode"/>
+      </w:pPr>
+      <w:r>
+        <w:t xml:space="preserve">$ </w:t>
+      </w:r>
+      <w:proofErr w:type="spellStart"/>
+      <w:proofErr w:type="gramStart"/>
+      <w:r>
+        <w:t>git</w:t>
+      </w:r>
+      <w:proofErr w:type="spellEnd"/>
+      <w:proofErr w:type="gramEnd"/>
+      <w:r>
+        <w:t xml:space="preserve"> checkout develop</w:t>
+      </w:r>
+    </w:p>
+    <w:p>
+      <w:pPr>
+        <w:pStyle w:val="SourceCode"/>
+      </w:pPr>
+      <w:r>
+        <w:t xml:space="preserve">$ </w:t>
+      </w:r>
+      <w:proofErr w:type="spellStart"/>
+      <w:proofErr w:type="gramStart"/>
+      <w:r>
+        <w:t>git</w:t>
+      </w:r>
+      <w:proofErr w:type="spellEnd"/>
+      <w:proofErr w:type="gramEnd"/>
+      <w:r>
+        <w:t xml:space="preserve"> pull</w:t>
+      </w:r>
+      <w:r>
+        <w:tab/>
+        <w:t># Make sure it is up to date.</w:t>
+      </w:r>
+    </w:p>
+    <w:p>
+      <w:pPr>
+        <w:pStyle w:val="SourceCode"/>
+      </w:pPr>
+    </w:p>
+    <w:p>
+      <w:pPr>
+        <w:pStyle w:val="Body-Text"/>
+        <w:numPr>
+          <w:ilvl w:val="0"/>
+          <w:numId w:val="19"/>
+        </w:numPr>
+      </w:pPr>
+      <w:r>
+        <w:t xml:space="preserve">Update Version </w:t>
+      </w:r>
+      <w:r>
+        <w:t>i</w:t>
+      </w:r>
+      <w:r>
+        <w:t>nformation</w:t>
+      </w:r>
+      <w:r>
+        <w:t xml:space="preserve"> for the current development release</w:t>
+      </w:r>
+      <w:r>
+        <w:t>.</w:t>
       </w:r>
     </w:p>
     <w:p>
@@ -10506,7 +10855,16 @@
       <w:proofErr w:type="spellEnd"/>
       <w:proofErr w:type="gramEnd"/>
       <w:r>
-        <w:t xml:space="preserve"> add version.js version.html</w:t>
+        <w:t xml:space="preserve"> commit –a</w:t>
+      </w:r>
+      <w:r>
+        <w:t xml:space="preserve"> “</w:t>
+      </w:r>
+      <w:r>
+        <w:t>Start new development version.</w:t>
+      </w:r>
+      <w:r>
+        <w:t>”</w:t>
       </w:r>
     </w:p>
     <w:p>
@@ -10524,23 +10882,14 @@
       <w:proofErr w:type="spellEnd"/>
       <w:proofErr w:type="gramEnd"/>
       <w:r>
-        <w:t xml:space="preserve"> commit –a</w:t>
-      </w:r>
-      <w:r>
-        <w:t xml:space="preserve"> “</w:t>
-      </w:r>
-      <w:r>
-        <w:t>Start new development version.</w:t>
-      </w:r>
-      <w:r>
-        <w:t>”</w:t>
+        <w:t xml:space="preserve"> push</w:t>
       </w:r>
     </w:p>
     <w:p>
       <w:pPr>
         <w:pStyle w:val="Heading3"/>
       </w:pPr>
-      <w:bookmarkStart w:id="22" w:name="_Toc229855173"/>
+      <w:bookmarkStart w:id="22" w:name="_Toc230285592"/>
       <w:r>
         <w:t>Get</w:t>
       </w:r>
@@ -10559,7 +10908,7 @@
       <w:pPr>
         <w:pStyle w:val="Heading2"/>
       </w:pPr>
-      <w:bookmarkStart w:id="23" w:name="_Toc229855174"/>
+      <w:bookmarkStart w:id="23" w:name="_Toc230285593"/>
       <w:r>
         <w:rPr>
           <w:lang w:eastAsia="ar-SA"/>
@@ -10655,6 +11004,7 @@
         <w:pStyle w:val="SourceCode"/>
       </w:pPr>
       <w:r>
+        <w:lastRenderedPageBreak/>
         <w:t xml:space="preserve">$ </w:t>
       </w:r>
       <w:proofErr w:type="spellStart"/>
@@ -10867,7 +11217,7 @@
       <w:pPr>
         <w:pStyle w:val="Heading2"/>
       </w:pPr>
-      <w:bookmarkStart w:id="24" w:name="_Toc229855175"/>
+      <w:bookmarkStart w:id="24" w:name="_Toc230285594"/>
       <w:r>
         <w:t>Git Terminology</w:t>
       </w:r>
@@ -11165,7 +11515,7 @@
       <w:pPr>
         <w:pStyle w:val="Heading1"/>
       </w:pPr>
-      <w:bookmarkStart w:id="25" w:name="_Toc229855176"/>
+      <w:bookmarkStart w:id="25" w:name="_Toc230285595"/>
       <w:r>
         <w:t>Editing Tools</w:t>
       </w:r>
@@ -11176,7 +11526,7 @@
         <w:pStyle w:val="Heading2"/>
       </w:pPr>
       <w:bookmarkStart w:id="26" w:name="_Toc227669204"/>
-      <w:bookmarkStart w:id="27" w:name="_Toc229855177"/>
+      <w:bookmarkStart w:id="27" w:name="_Toc230285596"/>
       <w:r>
         <w:t>VS Code</w:t>
       </w:r>
@@ -11206,7 +11556,7 @@
       <w:pPr>
         <w:pStyle w:val="Heading3"/>
       </w:pPr>
-      <w:bookmarkStart w:id="28" w:name="_Toc229855178"/>
+      <w:bookmarkStart w:id="28" w:name="_Toc230285597"/>
       <w:r>
         <w:t>Installation</w:t>
       </w:r>
@@ -11277,6 +11627,7 @@
         </w:numPr>
       </w:pPr>
       <w:r>
+        <w:lastRenderedPageBreak/>
         <w:t xml:space="preserve">Check </w:t>
       </w:r>
       <w:r>
@@ -11328,7 +11679,6 @@
         </w:numPr>
       </w:pPr>
       <w:r>
-        <w:lastRenderedPageBreak/>
         <w:t xml:space="preserve">Check </w:t>
       </w:r>
       <w:r>
@@ -11378,7 +11728,7 @@
       <w:pPr>
         <w:pStyle w:val="Heading3"/>
       </w:pPr>
-      <w:bookmarkStart w:id="29" w:name="_Toc229855179"/>
+      <w:bookmarkStart w:id="29" w:name="_Toc230285598"/>
       <w:r>
         <w:t>Configuration Settings</w:t>
       </w:r>
@@ -11811,7 +12161,7 @@
       <w:pPr>
         <w:pStyle w:val="Heading3"/>
       </w:pPr>
-      <w:bookmarkStart w:id="30" w:name="_Toc229855180"/>
+      <w:bookmarkStart w:id="30" w:name="_Toc230285599"/>
       <w:r>
         <w:t>Extensions</w:t>
       </w:r>
@@ -11942,6 +12292,7 @@
         <w:spacing w:after="0"/>
       </w:pPr>
       <w:r>
+        <w:lastRenderedPageBreak/>
         <w:t xml:space="preserve">Open in Browser (by </w:t>
       </w:r>
       <w:proofErr w:type="spellStart"/>
@@ -11957,7 +12308,7 @@
       <w:pPr>
         <w:pStyle w:val="Heading3"/>
       </w:pPr>
-      <w:bookmarkStart w:id="31" w:name="_Toc229855181"/>
+      <w:bookmarkStart w:id="31" w:name="_Toc230285600"/>
       <w:r>
         <w:t>Command Summary</w:t>
       </w:r>
@@ -12000,7 +12351,6 @@
         <w:spacing w:after="0"/>
       </w:pPr>
       <w:r>
-        <w:lastRenderedPageBreak/>
         <w:t>Ctrl + S</w:t>
       </w:r>
       <w:r>
@@ -12128,7 +12478,7 @@
         <w:pStyle w:val="Heading2"/>
       </w:pPr>
       <w:bookmarkStart w:id="32" w:name="_Toc227669205"/>
-      <w:bookmarkStart w:id="33" w:name="_Toc229855182"/>
+      <w:bookmarkStart w:id="33" w:name="_Toc230285601"/>
       <w:r>
         <w:t>Node and NPM</w:t>
       </w:r>
@@ -12168,7 +12518,7 @@
       <w:pPr>
         <w:pStyle w:val="Heading3"/>
       </w:pPr>
-      <w:bookmarkStart w:id="34" w:name="_Toc229855183"/>
+      <w:bookmarkStart w:id="34" w:name="_Toc230285602"/>
       <w:r>
         <w:t>Installation</w:t>
       </w:r>
@@ -12427,7 +12777,7 @@
       <w:pPr>
         <w:pStyle w:val="Heading3"/>
       </w:pPr>
-      <w:bookmarkStart w:id="35" w:name="_Toc229855184"/>
+      <w:bookmarkStart w:id="35" w:name="_Toc230285603"/>
       <w:r>
         <w:t>Prettier</w:t>
       </w:r>
@@ -12573,6 +12923,7 @@
         <w:rPr>
           <w:lang w:eastAsia="ar-SA"/>
         </w:rPr>
+        <w:lastRenderedPageBreak/>
         <w:t>Run Prettier on a file.</w:t>
       </w:r>
     </w:p>
@@ -12623,7 +12974,6 @@
         <w:rPr>
           <w:lang w:eastAsia="ar-SA"/>
         </w:rPr>
-        <w:lastRenderedPageBreak/>
         <w:t>In VS Code, install the extension Prettier – Code Formatter and change the following configuration settings. Restart VS Code. Use the keyboard shortcut Shift + Alt + F to format the current document and use Ctrl + Z to undo the change.</w:t>
       </w:r>
     </w:p>
@@ -12736,7 +13086,7 @@
       <w:pPr>
         <w:pStyle w:val="Heading3"/>
       </w:pPr>
-      <w:bookmarkStart w:id="36" w:name="_Toc229855185"/>
+      <w:bookmarkStart w:id="36" w:name="_Toc230285604"/>
       <w:proofErr w:type="spellStart"/>
       <w:r>
         <w:t>ESLint</w:t>
@@ -13107,7 +13457,7 @@
       <w:pPr>
         <w:pStyle w:val="Heading2"/>
       </w:pPr>
-      <w:bookmarkStart w:id="37" w:name="_Toc229855186"/>
+      <w:bookmarkStart w:id="37" w:name="_Toc230285605"/>
       <w:r>
         <w:t>Git</w:t>
       </w:r>
@@ -13125,7 +13475,7 @@
       <w:pPr>
         <w:pStyle w:val="Heading3"/>
       </w:pPr>
-      <w:bookmarkStart w:id="38" w:name="_Toc229855187"/>
+      <w:bookmarkStart w:id="38" w:name="_Toc230285606"/>
       <w:r>
         <w:t>Inst</w:t>
       </w:r>
@@ -13251,7 +13601,7 @@
       <w:pPr>
         <w:pStyle w:val="Heading1"/>
       </w:pPr>
-      <w:bookmarkStart w:id="39" w:name="_Toc229855188"/>
+      <w:bookmarkStart w:id="39" w:name="_Toc230285607"/>
       <w:r>
         <w:t>Notes</w:t>
       </w:r>
@@ -13261,7 +13611,7 @@
       <w:pPr>
         <w:pStyle w:val="Heading2"/>
       </w:pPr>
-      <w:bookmarkStart w:id="40" w:name="_Toc229855189"/>
+      <w:bookmarkStart w:id="40" w:name="_Toc230285608"/>
       <w:r>
         <w:t>Coding Conventions</w:t>
       </w:r>
@@ -13312,6 +13662,7 @@
         </w:numPr>
       </w:pPr>
       <w:r>
+        <w:lastRenderedPageBreak/>
         <w:t>Class</w:t>
       </w:r>
       <w:r>
@@ -13342,7 +13693,6 @@
         </w:numPr>
       </w:pPr>
       <w:r>
-        <w:lastRenderedPageBreak/>
         <w:t>Do not use var.</w:t>
       </w:r>
     </w:p>
@@ -13553,6 +13903,92 @@
 <file path=word/numbering.xml><?xml version="1.0" encoding="utf-8"?>
 <w:numbering xmlns:ve="http://schemas.openxmlformats.org/markup-compatibility/2006" xmlns:o="urn:schemas-microsoft-com:office:office" xmlns:r="http://schemas.openxmlformats.org/officeDocument/2006/relationships" xmlns:m="http://schemas.openxmlformats.org/officeDocument/2006/math" xmlns:v="urn:schemas-microsoft-com:vml" xmlns:wp="http://schemas.openxmlformats.org/drawingml/2006/wordprocessingDrawing" xmlns:w10="urn:schemas-microsoft-com:office:word" xmlns:w="http://schemas.openxmlformats.org/wordprocessingml/2006/main" xmlns:wne="http://schemas.microsoft.com/office/word/2006/wordml">
   <w:abstractNum w:abstractNumId="0">
+    <w:nsid w:val="054713D1"/>
+    <w:multiLevelType w:val="hybridMultilevel"/>
+    <w:tmpl w:val="E7D210CA"/>
+    <w:lvl w:ilvl="0" w:tplc="0409000F">
+      <w:start w:val="1"/>
+      <w:numFmt w:val="decimal"/>
+      <w:lvlText w:val="%1."/>
+      <w:lvlJc w:val="left"/>
+      <w:pPr>
+        <w:ind w:left="1440" w:hanging="360"/>
+      </w:pPr>
+    </w:lvl>
+    <w:lvl w:ilvl="1" w:tplc="04090019" w:tentative="1">
+      <w:start w:val="1"/>
+      <w:numFmt w:val="lowerLetter"/>
+      <w:lvlText w:val="%2."/>
+      <w:lvlJc w:val="left"/>
+      <w:pPr>
+        <w:ind w:left="2160" w:hanging="360"/>
+      </w:pPr>
+    </w:lvl>
+    <w:lvl w:ilvl="2" w:tplc="0409001B" w:tentative="1">
+      <w:start w:val="1"/>
+      <w:numFmt w:val="lowerRoman"/>
+      <w:lvlText w:val="%3."/>
+      <w:lvlJc w:val="right"/>
+      <w:pPr>
+        <w:ind w:left="2880" w:hanging="180"/>
+      </w:pPr>
+    </w:lvl>
+    <w:lvl w:ilvl="3" w:tplc="0409000F" w:tentative="1">
+      <w:start w:val="1"/>
+      <w:numFmt w:val="decimal"/>
+      <w:lvlText w:val="%4."/>
+      <w:lvlJc w:val="left"/>
+      <w:pPr>
+        <w:ind w:left="3600" w:hanging="360"/>
+      </w:pPr>
+    </w:lvl>
+    <w:lvl w:ilvl="4" w:tplc="04090019" w:tentative="1">
+      <w:start w:val="1"/>
+      <w:numFmt w:val="lowerLetter"/>
+      <w:lvlText w:val="%5."/>
+      <w:lvlJc w:val="left"/>
+      <w:pPr>
+        <w:ind w:left="4320" w:hanging="360"/>
+      </w:pPr>
+    </w:lvl>
+    <w:lvl w:ilvl="5" w:tplc="0409001B" w:tentative="1">
+      <w:start w:val="1"/>
+      <w:numFmt w:val="lowerRoman"/>
+      <w:lvlText w:val="%6."/>
+      <w:lvlJc w:val="right"/>
+      <w:pPr>
+        <w:ind w:left="5040" w:hanging="180"/>
+      </w:pPr>
+    </w:lvl>
+    <w:lvl w:ilvl="6" w:tplc="0409000F" w:tentative="1">
+      <w:start w:val="1"/>
+      <w:numFmt w:val="decimal"/>
+      <w:lvlText w:val="%7."/>
+      <w:lvlJc w:val="left"/>
+      <w:pPr>
+        <w:ind w:left="5760" w:hanging="360"/>
+      </w:pPr>
+    </w:lvl>
+    <w:lvl w:ilvl="7" w:tplc="04090019" w:tentative="1">
+      <w:start w:val="1"/>
+      <w:numFmt w:val="lowerLetter"/>
+      <w:lvlText w:val="%8."/>
+      <w:lvlJc w:val="left"/>
+      <w:pPr>
+        <w:ind w:left="6480" w:hanging="360"/>
+      </w:pPr>
+    </w:lvl>
+    <w:lvl w:ilvl="8" w:tplc="0409001B" w:tentative="1">
+      <w:start w:val="1"/>
+      <w:numFmt w:val="lowerRoman"/>
+      <w:lvlText w:val="%9."/>
+      <w:lvlJc w:val="right"/>
+      <w:pPr>
+        <w:ind w:left="7200" w:hanging="180"/>
+      </w:pPr>
+    </w:lvl>
+  </w:abstractNum>
+  <w:abstractNum w:abstractNumId="1">
     <w:nsid w:val="1405286F"/>
     <w:multiLevelType w:val="hybridMultilevel"/>
     <w:tmpl w:val="7E2E17D6"/>
@@ -13641,7 +14077,7 @@
       </w:pPr>
     </w:lvl>
   </w:abstractNum>
-  <w:abstractNum w:abstractNumId="1">
+  <w:abstractNum w:abstractNumId="2">
     <w:nsid w:val="163115D9"/>
     <w:multiLevelType w:val="hybridMultilevel"/>
     <w:tmpl w:val="97DAFCAE"/>
@@ -13755,7 +14191,7 @@
       </w:rPr>
     </w:lvl>
   </w:abstractNum>
-  <w:abstractNum w:abstractNumId="2">
+  <w:abstractNum w:abstractNumId="3">
     <w:nsid w:val="18E53416"/>
     <w:multiLevelType w:val="hybridMultilevel"/>
     <w:tmpl w:val="609492D8"/>
@@ -13844,7 +14280,7 @@
       </w:pPr>
     </w:lvl>
   </w:abstractNum>
-  <w:abstractNum w:abstractNumId="3">
+  <w:abstractNum w:abstractNumId="4">
     <w:nsid w:val="1D980FED"/>
     <w:multiLevelType w:val="hybridMultilevel"/>
     <w:tmpl w:val="7AA22E22"/>
@@ -13930,7 +14366,7 @@
       </w:pPr>
     </w:lvl>
   </w:abstractNum>
-  <w:abstractNum w:abstractNumId="4">
+  <w:abstractNum w:abstractNumId="5">
     <w:nsid w:val="1DD236C9"/>
     <w:multiLevelType w:val="hybridMultilevel"/>
     <w:tmpl w:val="3F202548"/>
@@ -14019,7 +14455,7 @@
       </w:pPr>
     </w:lvl>
   </w:abstractNum>
-  <w:abstractNum w:abstractNumId="5">
+  <w:abstractNum w:abstractNumId="6">
     <w:nsid w:val="1E6A0613"/>
     <w:multiLevelType w:val="hybridMultilevel"/>
     <w:tmpl w:val="7A9041E8"/>
@@ -14105,7 +14541,7 @@
       </w:pPr>
     </w:lvl>
   </w:abstractNum>
-  <w:abstractNum w:abstractNumId="6">
+  <w:abstractNum w:abstractNumId="7">
     <w:nsid w:val="216A24BC"/>
     <w:multiLevelType w:val="hybridMultilevel"/>
     <w:tmpl w:val="AC1E665A"/>
@@ -14191,7 +14627,7 @@
       </w:pPr>
     </w:lvl>
   </w:abstractNum>
-  <w:abstractNum w:abstractNumId="7">
+  <w:abstractNum w:abstractNumId="8">
     <w:nsid w:val="2FF46446"/>
     <w:multiLevelType w:val="hybridMultilevel"/>
     <w:tmpl w:val="AC1E665A"/>
@@ -14277,7 +14713,7 @@
       </w:pPr>
     </w:lvl>
   </w:abstractNum>
-  <w:abstractNum w:abstractNumId="8">
+  <w:abstractNum w:abstractNumId="9">
     <w:nsid w:val="327C0ACA"/>
     <w:multiLevelType w:val="hybridMultilevel"/>
     <w:tmpl w:val="AC1E665A"/>
@@ -14363,7 +14799,7 @@
       </w:pPr>
     </w:lvl>
   </w:abstractNum>
-  <w:abstractNum w:abstractNumId="9">
+  <w:abstractNum w:abstractNumId="10">
     <w:nsid w:val="345028FA"/>
     <w:multiLevelType w:val="hybridMultilevel"/>
     <w:tmpl w:val="38C67E34"/>
@@ -14452,7 +14888,7 @@
       </w:pPr>
     </w:lvl>
   </w:abstractNum>
-  <w:abstractNum w:abstractNumId="10">
+  <w:abstractNum w:abstractNumId="11">
     <w:nsid w:val="3D3B424D"/>
     <w:multiLevelType w:val="hybridMultilevel"/>
     <w:tmpl w:val="58C8616C"/>
@@ -14566,7 +15002,7 @@
       </w:rPr>
     </w:lvl>
   </w:abstractNum>
-  <w:abstractNum w:abstractNumId="11">
+  <w:abstractNum w:abstractNumId="12">
     <w:nsid w:val="41936094"/>
     <w:multiLevelType w:val="hybridMultilevel"/>
     <w:tmpl w:val="D0107CD2"/>
@@ -14680,7 +15116,7 @@
       </w:rPr>
     </w:lvl>
   </w:abstractNum>
-  <w:abstractNum w:abstractNumId="12">
+  <w:abstractNum w:abstractNumId="13">
     <w:nsid w:val="42E80F5A"/>
     <w:multiLevelType w:val="hybridMultilevel"/>
     <w:tmpl w:val="84B6DDA2"/>
@@ -14766,7 +15202,7 @@
       </w:pPr>
     </w:lvl>
   </w:abstractNum>
-  <w:abstractNum w:abstractNumId="13">
+  <w:abstractNum w:abstractNumId="14">
     <w:nsid w:val="42FF05A0"/>
     <w:multiLevelType w:val="hybridMultilevel"/>
     <w:tmpl w:val="FB98B948"/>
@@ -14852,7 +15288,7 @@
       </w:pPr>
     </w:lvl>
   </w:abstractNum>
-  <w:abstractNum w:abstractNumId="14">
+  <w:abstractNum w:abstractNumId="15">
     <w:nsid w:val="4D6431E7"/>
     <w:multiLevelType w:val="hybridMultilevel"/>
     <w:tmpl w:val="066E09E4"/>
@@ -14938,7 +15374,7 @@
       </w:pPr>
     </w:lvl>
   </w:abstractNum>
-  <w:abstractNum w:abstractNumId="15">
+  <w:abstractNum w:abstractNumId="16">
     <w:nsid w:val="4F012578"/>
     <w:multiLevelType w:val="hybridMultilevel"/>
     <w:tmpl w:val="E7D210CA"/>
@@ -15024,7 +15460,7 @@
       </w:pPr>
     </w:lvl>
   </w:abstractNum>
-  <w:abstractNum w:abstractNumId="16">
+  <w:abstractNum w:abstractNumId="17">
     <w:nsid w:val="604620B9"/>
     <w:multiLevelType w:val="hybridMultilevel"/>
     <w:tmpl w:val="7E2E17D6"/>
@@ -15113,7 +15549,7 @@
       </w:pPr>
     </w:lvl>
   </w:abstractNum>
-  <w:abstractNum w:abstractNumId="17">
+  <w:abstractNum w:abstractNumId="18">
     <w:nsid w:val="62193609"/>
     <w:multiLevelType w:val="hybridMultilevel"/>
     <w:tmpl w:val="07A45704"/>
@@ -15203,58 +15639,61 @@
     </w:lvl>
   </w:abstractNum>
   <w:num w:numId="1">
+    <w:abstractNumId w:val="11"/>
+  </w:num>
+  <w:num w:numId="2">
+    <w:abstractNumId w:val="12"/>
+  </w:num>
+  <w:num w:numId="3">
+    <w:abstractNumId w:val="2"/>
+  </w:num>
+  <w:num w:numId="4">
+    <w:abstractNumId w:val="15"/>
+  </w:num>
+  <w:num w:numId="5">
+    <w:abstractNumId w:val="4"/>
+  </w:num>
+  <w:num w:numId="6">
+    <w:abstractNumId w:val="16"/>
+  </w:num>
+  <w:num w:numId="7">
+    <w:abstractNumId w:val="6"/>
+  </w:num>
+  <w:num w:numId="8">
+    <w:abstractNumId w:val="7"/>
+  </w:num>
+  <w:num w:numId="9">
+    <w:abstractNumId w:val="8"/>
+  </w:num>
+  <w:num w:numId="10">
+    <w:abstractNumId w:val="9"/>
+  </w:num>
+  <w:num w:numId="11">
+    <w:abstractNumId w:val="13"/>
+  </w:num>
+  <w:num w:numId="12">
+    <w:abstractNumId w:val="3"/>
+  </w:num>
+  <w:num w:numId="13">
     <w:abstractNumId w:val="10"/>
   </w:num>
-  <w:num w:numId="2">
-    <w:abstractNumId w:val="11"/>
+  <w:num w:numId="14">
+    <w:abstractNumId w:val="14"/>
   </w:num>
-  <w:num w:numId="3">
+  <w:num w:numId="15">
     <w:abstractNumId w:val="1"/>
   </w:num>
-  <w:num w:numId="4">
-    <w:abstractNumId w:val="14"/>
+  <w:num w:numId="16">
+    <w:abstractNumId w:val="17"/>
   </w:num>
-  <w:num w:numId="5">
-    <w:abstractNumId w:val="3"/>
-  </w:num>
-  <w:num w:numId="6">
-    <w:abstractNumId w:val="15"/>
-  </w:num>
-  <w:num w:numId="7">
+  <w:num w:numId="17">
     <w:abstractNumId w:val="5"/>
   </w:num>
-  <w:num w:numId="8">
-    <w:abstractNumId w:val="6"/>
+  <w:num w:numId="18">
+    <w:abstractNumId w:val="18"/>
   </w:num>
-  <w:num w:numId="9">
-    <w:abstractNumId w:val="7"/>
-  </w:num>
-  <w:num w:numId="10">
-    <w:abstractNumId w:val="8"/>
-  </w:num>
-  <w:num w:numId="11">
-    <w:abstractNumId w:val="12"/>
-  </w:num>
-  <w:num w:numId="12">
-    <w:abstractNumId w:val="2"/>
-  </w:num>
-  <w:num w:numId="13">
-    <w:abstractNumId w:val="9"/>
-  </w:num>
-  <w:num w:numId="14">
-    <w:abstractNumId w:val="13"/>
-  </w:num>
-  <w:num w:numId="15">
+  <w:num w:numId="19">
     <w:abstractNumId w:val="0"/>
-  </w:num>
-  <w:num w:numId="16">
-    <w:abstractNumId w:val="16"/>
-  </w:num>
-  <w:num w:numId="17">
-    <w:abstractNumId w:val="4"/>
-  </w:num>
-  <w:num w:numId="18">
-    <w:abstractNumId w:val="17"/>
   </w:num>
   <w:numIdMacAtCleanup w:val="11"/>
 </w:numbering>
@@ -16656,7 +17095,7 @@
 </file>
 
 <file path=customXml/itemProps1.xml><?xml version="1.0" encoding="utf-8"?>
-<ds:datastoreItem xmlns:ds="http://schemas.openxmlformats.org/officeDocument/2006/customXml" ds:itemID="{DF1BE714-233E-4507-9438-46295FBB40C7}">
+<ds:datastoreItem xmlns:ds="http://schemas.openxmlformats.org/officeDocument/2006/customXml" ds:itemID="{C63D077E-958D-42D0-9227-D5133C7CACE3}">
   <ds:schemaRefs>
     <ds:schemaRef ds:uri="http://schemas.openxmlformats.org/officeDocument/2006/bibliography"/>
   </ds:schemaRefs>

</xml_diff>

<commit_message>
Move the original math calculator out of repository.
</commit_message>
<xml_diff>
--- a/Documentation/DevelopmentEnvironment.docx
+++ b/Documentation/DevelopmentEnvironment.docx
@@ -10322,7 +10322,13 @@
       <w:proofErr w:type="spellEnd"/>
       <w:proofErr w:type="gramEnd"/>
       <w:r>
-        <w:t xml:space="preserve"> push –-tags</w:t>
+        <w:t xml:space="preserve"> push </w:t>
+      </w:r>
+      <w:r>
+        <w:t>-</w:t>
+      </w:r>
+      <w:r>
+        <w:t>-tags</w:t>
       </w:r>
       <w:r>
         <w:tab/>
@@ -12477,12 +12483,12 @@
       <w:pPr>
         <w:pStyle w:val="Heading2"/>
       </w:pPr>
-      <w:bookmarkStart w:id="32" w:name="_Toc227669205"/>
-      <w:bookmarkStart w:id="33" w:name="_Toc230285601"/>
+      <w:bookmarkStart w:id="32" w:name="_Toc230285601"/>
+      <w:bookmarkStart w:id="33" w:name="_Toc227669205"/>
       <w:r>
         <w:t>Node and NPM</w:t>
       </w:r>
-      <w:bookmarkEnd w:id="33"/>
+      <w:bookmarkEnd w:id="32"/>
     </w:p>
     <w:p>
       <w:pPr>
@@ -13432,7 +13438,7 @@
         <w:pStyle w:val="SourceCode"/>
       </w:pPr>
     </w:p>
-    <w:bookmarkEnd w:id="32"/>
+    <w:bookmarkEnd w:id="33"/>
     <w:p>
       <w:pPr>
         <w:pStyle w:val="Body-Text"/>
@@ -13861,7 +13867,7 @@
         <w:szCs w:val="24"/>
         <w:lang w:eastAsia="en-US"/>
       </w:rPr>
-      <w:t>15</w:t>
+      <w:t>11</w:t>
     </w:r>
     <w:r>
       <w:rPr>
@@ -17095,7 +17101,7 @@
 </file>
 
 <file path=customXml/itemProps1.xml><?xml version="1.0" encoding="utf-8"?>
-<ds:datastoreItem xmlns:ds="http://schemas.openxmlformats.org/officeDocument/2006/customXml" ds:itemID="{C63D077E-958D-42D0-9227-D5133C7CACE3}">
+<ds:datastoreItem xmlns:ds="http://schemas.openxmlformats.org/officeDocument/2006/customXml" ds:itemID="{5A1AE78D-AA9B-4AF1-B8BF-DC47FB46A9F4}">
   <ds:schemaRefs>
     <ds:schemaRef ds:uri="http://schemas.openxmlformats.org/officeDocument/2006/bibliography"/>
   </ds:schemaRefs>

</xml_diff>

<commit_message>
Fix included library files.
</commit_message>
<xml_diff>
--- a/Documentation/DevelopmentEnvironment.docx
+++ b/Documentation/DevelopmentEnvironment.docx
@@ -47,7 +47,7 @@
         <w:rPr>
           <w:noProof/>
         </w:rPr>
-        <w:t>May 21, 2026</w:t>
+        <w:t>May 22, 2026</w:t>
       </w:r>
       <w:r>
         <w:rPr>
@@ -132,7 +132,7 @@
         </w:rPr>
         <w:fldChar w:fldCharType="separate"/>
       </w:r>
-      <w:hyperlink w:anchor="_Toc230285570" w:history="1">
+      <w:hyperlink w:anchor="_Toc230347862" w:history="1">
         <w:r>
           <w:rPr>
             <w:rStyle w:val="Hyperlink"/>
@@ -155,7 +155,7 @@
           <w:rPr>
             <w:webHidden/>
           </w:rPr>
-          <w:instrText xml:space="preserve"> PAGEREF _Toc230285570 \h </w:instrText>
+          <w:instrText xml:space="preserve"> PAGEREF _Toc230347862 \h </w:instrText>
         </w:r>
         <w:r>
           <w:rPr>
@@ -193,7 +193,7 @@
           <w:lang w:eastAsia="en-US"/>
         </w:rPr>
       </w:pPr>
-      <w:hyperlink w:anchor="_Toc230285571" w:history="1">
+      <w:hyperlink w:anchor="_Toc230347863" w:history="1">
         <w:r>
           <w:rPr>
             <w:rStyle w:val="Hyperlink"/>
@@ -220,7 +220,7 @@
             <w:noProof/>
             <w:webHidden/>
           </w:rPr>
-          <w:instrText xml:space="preserve"> PAGEREF _Toc230285571 \h </w:instrText>
+          <w:instrText xml:space="preserve"> PAGEREF _Toc230347863 \h </w:instrText>
         </w:r>
         <w:r>
           <w:rPr>
@@ -262,7 +262,7 @@
           <w:lang w:eastAsia="en-US"/>
         </w:rPr>
       </w:pPr>
-      <w:hyperlink w:anchor="_Toc230285572" w:history="1">
+      <w:hyperlink w:anchor="_Toc230347864" w:history="1">
         <w:r>
           <w:rPr>
             <w:rStyle w:val="Hyperlink"/>
@@ -289,7 +289,7 @@
             <w:noProof/>
             <w:webHidden/>
           </w:rPr>
-          <w:instrText xml:space="preserve"> PAGEREF _Toc230285572 \h </w:instrText>
+          <w:instrText xml:space="preserve"> PAGEREF _Toc230347864 \h </w:instrText>
         </w:r>
         <w:r>
           <w:rPr>
@@ -331,7 +331,7 @@
           <w:lang w:eastAsia="en-US"/>
         </w:rPr>
       </w:pPr>
-      <w:hyperlink w:anchor="_Toc230285573" w:history="1">
+      <w:hyperlink w:anchor="_Toc230347865" w:history="1">
         <w:r>
           <w:rPr>
             <w:rStyle w:val="Hyperlink"/>
@@ -358,7 +358,7 @@
             <w:noProof/>
             <w:webHidden/>
           </w:rPr>
-          <w:instrText xml:space="preserve"> PAGEREF _Toc230285573 \h </w:instrText>
+          <w:instrText xml:space="preserve"> PAGEREF _Toc230347865 \h </w:instrText>
         </w:r>
         <w:r>
           <w:rPr>
@@ -400,7 +400,7 @@
           <w:lang w:eastAsia="en-US"/>
         </w:rPr>
       </w:pPr>
-      <w:hyperlink w:anchor="_Toc230285574" w:history="1">
+      <w:hyperlink w:anchor="_Toc230347866" w:history="1">
         <w:r>
           <w:rPr>
             <w:rStyle w:val="Hyperlink"/>
@@ -427,7 +427,7 @@
             <w:noProof/>
             <w:webHidden/>
           </w:rPr>
-          <w:instrText xml:space="preserve"> PAGEREF _Toc230285574 \h </w:instrText>
+          <w:instrText xml:space="preserve"> PAGEREF _Toc230347866 \h </w:instrText>
         </w:r>
         <w:r>
           <w:rPr>
@@ -469,7 +469,7 @@
           <w:lang w:eastAsia="en-US"/>
         </w:rPr>
       </w:pPr>
-      <w:hyperlink w:anchor="_Toc230285575" w:history="1">
+      <w:hyperlink w:anchor="_Toc230347867" w:history="1">
         <w:r>
           <w:rPr>
             <w:rStyle w:val="Hyperlink"/>
@@ -496,7 +496,7 @@
             <w:noProof/>
             <w:webHidden/>
           </w:rPr>
-          <w:instrText xml:space="preserve"> PAGEREF _Toc230285575 \h </w:instrText>
+          <w:instrText xml:space="preserve"> PAGEREF _Toc230347867 \h </w:instrText>
         </w:r>
         <w:r>
           <w:rPr>
@@ -538,7 +538,7 @@
           <w:lang w:eastAsia="en-US"/>
         </w:rPr>
       </w:pPr>
-      <w:hyperlink w:anchor="_Toc230285576" w:history="1">
+      <w:hyperlink w:anchor="_Toc230347868" w:history="1">
         <w:r>
           <w:rPr>
             <w:rStyle w:val="Hyperlink"/>
@@ -565,7 +565,7 @@
             <w:noProof/>
             <w:webHidden/>
           </w:rPr>
-          <w:instrText xml:space="preserve"> PAGEREF _Toc230285576 \h </w:instrText>
+          <w:instrText xml:space="preserve"> PAGEREF _Toc230347868 \h </w:instrText>
         </w:r>
         <w:r>
           <w:rPr>
@@ -607,7 +607,7 @@
           <w:lang w:eastAsia="en-US"/>
         </w:rPr>
       </w:pPr>
-      <w:hyperlink w:anchor="_Toc230285577" w:history="1">
+      <w:hyperlink w:anchor="_Toc230347869" w:history="1">
         <w:r>
           <w:rPr>
             <w:rStyle w:val="Hyperlink"/>
@@ -634,7 +634,7 @@
             <w:noProof/>
             <w:webHidden/>
           </w:rPr>
-          <w:instrText xml:space="preserve"> PAGEREF _Toc230285577 \h </w:instrText>
+          <w:instrText xml:space="preserve"> PAGEREF _Toc230347869 \h </w:instrText>
         </w:r>
         <w:r>
           <w:rPr>
@@ -676,7 +676,7 @@
           <w:lang w:eastAsia="en-US"/>
         </w:rPr>
       </w:pPr>
-      <w:hyperlink w:anchor="_Toc230285578" w:history="1">
+      <w:hyperlink w:anchor="_Toc230347870" w:history="1">
         <w:r>
           <w:rPr>
             <w:rStyle w:val="Hyperlink"/>
@@ -703,7 +703,7 @@
             <w:noProof/>
             <w:webHidden/>
           </w:rPr>
-          <w:instrText xml:space="preserve"> PAGEREF _Toc230285578 \h </w:instrText>
+          <w:instrText xml:space="preserve"> PAGEREF _Toc230347870 \h </w:instrText>
         </w:r>
         <w:r>
           <w:rPr>
@@ -745,7 +745,7 @@
           <w:lang w:eastAsia="en-US"/>
         </w:rPr>
       </w:pPr>
-      <w:hyperlink w:anchor="_Toc230285579" w:history="1">
+      <w:hyperlink w:anchor="_Toc230347871" w:history="1">
         <w:r>
           <w:rPr>
             <w:rStyle w:val="Hyperlink"/>
@@ -772,7 +772,7 @@
             <w:noProof/>
             <w:webHidden/>
           </w:rPr>
-          <w:instrText xml:space="preserve"> PAGEREF _Toc230285579 \h </w:instrText>
+          <w:instrText xml:space="preserve"> PAGEREF _Toc230347871 \h </w:instrText>
         </w:r>
         <w:r>
           <w:rPr>
@@ -814,7 +814,7 @@
           <w:lang w:eastAsia="en-US"/>
         </w:rPr>
       </w:pPr>
-      <w:hyperlink w:anchor="_Toc230285580" w:history="1">
+      <w:hyperlink w:anchor="_Toc230347872" w:history="1">
         <w:r>
           <w:rPr>
             <w:rStyle w:val="Hyperlink"/>
@@ -841,7 +841,7 @@
             <w:noProof/>
             <w:webHidden/>
           </w:rPr>
-          <w:instrText xml:space="preserve"> PAGEREF _Toc230285580 \h </w:instrText>
+          <w:instrText xml:space="preserve"> PAGEREF _Toc230347872 \h </w:instrText>
         </w:r>
         <w:r>
           <w:rPr>
@@ -883,7 +883,7 @@
           <w:lang w:eastAsia="en-US"/>
         </w:rPr>
       </w:pPr>
-      <w:hyperlink w:anchor="_Toc230285581" w:history="1">
+      <w:hyperlink w:anchor="_Toc230347873" w:history="1">
         <w:r>
           <w:rPr>
             <w:rStyle w:val="Hyperlink"/>
@@ -910,7 +910,7 @@
             <w:noProof/>
             <w:webHidden/>
           </w:rPr>
-          <w:instrText xml:space="preserve"> PAGEREF _Toc230285581 \h </w:instrText>
+          <w:instrText xml:space="preserve"> PAGEREF _Toc230347873 \h </w:instrText>
         </w:r>
         <w:r>
           <w:rPr>
@@ -952,7 +952,7 @@
           <w:lang w:eastAsia="en-US"/>
         </w:rPr>
       </w:pPr>
-      <w:hyperlink w:anchor="_Toc230285582" w:history="1">
+      <w:hyperlink w:anchor="_Toc230347874" w:history="1">
         <w:r>
           <w:rPr>
             <w:rStyle w:val="Hyperlink"/>
@@ -979,7 +979,7 @@
             <w:noProof/>
             <w:webHidden/>
           </w:rPr>
-          <w:instrText xml:space="preserve"> PAGEREF _Toc230285582 \h </w:instrText>
+          <w:instrText xml:space="preserve"> PAGEREF _Toc230347874 \h </w:instrText>
         </w:r>
         <w:r>
           <w:rPr>
@@ -1021,7 +1021,7 @@
           <w:lang w:eastAsia="en-US"/>
         </w:rPr>
       </w:pPr>
-      <w:hyperlink w:anchor="_Toc230285583" w:history="1">
+      <w:hyperlink w:anchor="_Toc230347875" w:history="1">
         <w:r>
           <w:rPr>
             <w:rStyle w:val="Hyperlink"/>
@@ -1048,7 +1048,7 @@
             <w:noProof/>
             <w:webHidden/>
           </w:rPr>
-          <w:instrText xml:space="preserve"> PAGEREF _Toc230285583 \h </w:instrText>
+          <w:instrText xml:space="preserve"> PAGEREF _Toc230347875 \h </w:instrText>
         </w:r>
         <w:r>
           <w:rPr>
@@ -1090,7 +1090,7 @@
           <w:lang w:eastAsia="en-US"/>
         </w:rPr>
       </w:pPr>
-      <w:hyperlink w:anchor="_Toc230285584" w:history="1">
+      <w:hyperlink w:anchor="_Toc230347876" w:history="1">
         <w:r>
           <w:rPr>
             <w:rStyle w:val="Hyperlink"/>
@@ -1117,7 +1117,7 @@
             <w:noProof/>
             <w:webHidden/>
           </w:rPr>
-          <w:instrText xml:space="preserve"> PAGEREF _Toc230285584 \h </w:instrText>
+          <w:instrText xml:space="preserve"> PAGEREF _Toc230347876 \h </w:instrText>
         </w:r>
         <w:r>
           <w:rPr>
@@ -1159,7 +1159,7 @@
           <w:lang w:eastAsia="en-US"/>
         </w:rPr>
       </w:pPr>
-      <w:hyperlink w:anchor="_Toc230285585" w:history="1">
+      <w:hyperlink w:anchor="_Toc230347877" w:history="1">
         <w:r>
           <w:rPr>
             <w:rStyle w:val="Hyperlink"/>
@@ -1186,7 +1186,7 @@
             <w:noProof/>
             <w:webHidden/>
           </w:rPr>
-          <w:instrText xml:space="preserve"> PAGEREF _Toc230285585 \h </w:instrText>
+          <w:instrText xml:space="preserve"> PAGEREF _Toc230347877 \h </w:instrText>
         </w:r>
         <w:r>
           <w:rPr>
@@ -1228,7 +1228,7 @@
           <w:lang w:eastAsia="en-US"/>
         </w:rPr>
       </w:pPr>
-      <w:hyperlink w:anchor="_Toc230285586" w:history="1">
+      <w:hyperlink w:anchor="_Toc230347878" w:history="1">
         <w:r>
           <w:rPr>
             <w:rStyle w:val="Hyperlink"/>
@@ -1255,7 +1255,7 @@
             <w:noProof/>
             <w:webHidden/>
           </w:rPr>
-          <w:instrText xml:space="preserve"> PAGEREF _Toc230285586 \h </w:instrText>
+          <w:instrText xml:space="preserve"> PAGEREF _Toc230347878 \h </w:instrText>
         </w:r>
         <w:r>
           <w:rPr>
@@ -1297,7 +1297,7 @@
           <w:lang w:eastAsia="en-US"/>
         </w:rPr>
       </w:pPr>
-      <w:hyperlink w:anchor="_Toc230285587" w:history="1">
+      <w:hyperlink w:anchor="_Toc230347879" w:history="1">
         <w:r>
           <w:rPr>
             <w:rStyle w:val="Hyperlink"/>
@@ -1324,7 +1324,7 @@
             <w:noProof/>
             <w:webHidden/>
           </w:rPr>
-          <w:instrText xml:space="preserve"> PAGEREF _Toc230285587 \h </w:instrText>
+          <w:instrText xml:space="preserve"> PAGEREF _Toc230347879 \h </w:instrText>
         </w:r>
         <w:r>
           <w:rPr>
@@ -1366,7 +1366,7 @@
           <w:lang w:eastAsia="en-US"/>
         </w:rPr>
       </w:pPr>
-      <w:hyperlink w:anchor="_Toc230285588" w:history="1">
+      <w:hyperlink w:anchor="_Toc230347880" w:history="1">
         <w:r>
           <w:rPr>
             <w:rStyle w:val="Hyperlink"/>
@@ -1393,7 +1393,7 @@
             <w:noProof/>
             <w:webHidden/>
           </w:rPr>
-          <w:instrText xml:space="preserve"> PAGEREF _Toc230285588 \h </w:instrText>
+          <w:instrText xml:space="preserve"> PAGEREF _Toc230347880 \h </w:instrText>
         </w:r>
         <w:r>
           <w:rPr>
@@ -1435,7 +1435,7 @@
           <w:lang w:eastAsia="en-US"/>
         </w:rPr>
       </w:pPr>
-      <w:hyperlink w:anchor="_Toc230285589" w:history="1">
+      <w:hyperlink w:anchor="_Toc230347881" w:history="1">
         <w:r>
           <w:rPr>
             <w:rStyle w:val="Hyperlink"/>
@@ -1462,7 +1462,7 @@
             <w:noProof/>
             <w:webHidden/>
           </w:rPr>
-          <w:instrText xml:space="preserve"> PAGEREF _Toc230285589 \h </w:instrText>
+          <w:instrText xml:space="preserve"> PAGEREF _Toc230347881 \h </w:instrText>
         </w:r>
         <w:r>
           <w:rPr>
@@ -1504,7 +1504,7 @@
           <w:lang w:eastAsia="en-US"/>
         </w:rPr>
       </w:pPr>
-      <w:hyperlink w:anchor="_Toc230285590" w:history="1">
+      <w:hyperlink w:anchor="_Toc230347882" w:history="1">
         <w:r>
           <w:rPr>
             <w:rStyle w:val="Hyperlink"/>
@@ -1531,7 +1531,7 @@
             <w:noProof/>
             <w:webHidden/>
           </w:rPr>
-          <w:instrText xml:space="preserve"> PAGEREF _Toc230285590 \h </w:instrText>
+          <w:instrText xml:space="preserve"> PAGEREF _Toc230347882 \h </w:instrText>
         </w:r>
         <w:r>
           <w:rPr>
@@ -1573,7 +1573,7 @@
           <w:lang w:eastAsia="en-US"/>
         </w:rPr>
       </w:pPr>
-      <w:hyperlink w:anchor="_Toc230285591" w:history="1">
+      <w:hyperlink w:anchor="_Toc230347883" w:history="1">
         <w:r>
           <w:rPr>
             <w:rStyle w:val="Hyperlink"/>
@@ -1600,7 +1600,7 @@
             <w:noProof/>
             <w:webHidden/>
           </w:rPr>
-          <w:instrText xml:space="preserve"> PAGEREF _Toc230285591 \h </w:instrText>
+          <w:instrText xml:space="preserve"> PAGEREF _Toc230347883 \h </w:instrText>
         </w:r>
         <w:r>
           <w:rPr>
@@ -1642,7 +1642,7 @@
           <w:lang w:eastAsia="en-US"/>
         </w:rPr>
       </w:pPr>
-      <w:hyperlink w:anchor="_Toc230285592" w:history="1">
+      <w:hyperlink w:anchor="_Toc230347884" w:history="1">
         <w:r>
           <w:rPr>
             <w:rStyle w:val="Hyperlink"/>
@@ -1669,7 +1669,7 @@
             <w:noProof/>
             <w:webHidden/>
           </w:rPr>
-          <w:instrText xml:space="preserve"> PAGEREF _Toc230285592 \h </w:instrText>
+          <w:instrText xml:space="preserve"> PAGEREF _Toc230347884 \h </w:instrText>
         </w:r>
         <w:r>
           <w:rPr>
@@ -1711,7 +1711,7 @@
           <w:lang w:eastAsia="en-US"/>
         </w:rPr>
       </w:pPr>
-      <w:hyperlink w:anchor="_Toc230285593" w:history="1">
+      <w:hyperlink w:anchor="_Toc230347885" w:history="1">
         <w:r>
           <w:rPr>
             <w:rStyle w:val="Hyperlink"/>
@@ -1738,7 +1738,7 @@
             <w:noProof/>
             <w:webHidden/>
           </w:rPr>
-          <w:instrText xml:space="preserve"> PAGEREF _Toc230285593 \h </w:instrText>
+          <w:instrText xml:space="preserve"> PAGEREF _Toc230347885 \h </w:instrText>
         </w:r>
         <w:r>
           <w:rPr>
@@ -1780,7 +1780,7 @@
           <w:lang w:eastAsia="en-US"/>
         </w:rPr>
       </w:pPr>
-      <w:hyperlink w:anchor="_Toc230285594" w:history="1">
+      <w:hyperlink w:anchor="_Toc230347886" w:history="1">
         <w:r>
           <w:rPr>
             <w:rStyle w:val="Hyperlink"/>
@@ -1807,7 +1807,7 @@
             <w:noProof/>
             <w:webHidden/>
           </w:rPr>
-          <w:instrText xml:space="preserve"> PAGEREF _Toc230285594 \h </w:instrText>
+          <w:instrText xml:space="preserve"> PAGEREF _Toc230347886 \h </w:instrText>
         </w:r>
         <w:r>
           <w:rPr>
@@ -1849,7 +1849,7 @@
           <w:lang w:eastAsia="en-US"/>
         </w:rPr>
       </w:pPr>
-      <w:hyperlink w:anchor="_Toc230285595" w:history="1">
+      <w:hyperlink w:anchor="_Toc230347887" w:history="1">
         <w:r>
           <w:rPr>
             <w:rStyle w:val="Hyperlink"/>
@@ -1872,7 +1872,7 @@
           <w:rPr>
             <w:webHidden/>
           </w:rPr>
-          <w:instrText xml:space="preserve"> PAGEREF _Toc230285595 \h </w:instrText>
+          <w:instrText xml:space="preserve"> PAGEREF _Toc230347887 \h </w:instrText>
         </w:r>
         <w:r>
           <w:rPr>
@@ -1910,7 +1910,7 @@
           <w:lang w:eastAsia="en-US"/>
         </w:rPr>
       </w:pPr>
-      <w:hyperlink w:anchor="_Toc230285596" w:history="1">
+      <w:hyperlink w:anchor="_Toc230347888" w:history="1">
         <w:r>
           <w:rPr>
             <w:rStyle w:val="Hyperlink"/>
@@ -1937,7 +1937,7 @@
             <w:noProof/>
             <w:webHidden/>
           </w:rPr>
-          <w:instrText xml:space="preserve"> PAGEREF _Toc230285596 \h </w:instrText>
+          <w:instrText xml:space="preserve"> PAGEREF _Toc230347888 \h </w:instrText>
         </w:r>
         <w:r>
           <w:rPr>
@@ -1979,7 +1979,7 @@
           <w:lang w:eastAsia="en-US"/>
         </w:rPr>
       </w:pPr>
-      <w:hyperlink w:anchor="_Toc230285597" w:history="1">
+      <w:hyperlink w:anchor="_Toc230347889" w:history="1">
         <w:r>
           <w:rPr>
             <w:rStyle w:val="Hyperlink"/>
@@ -2006,7 +2006,7 @@
             <w:noProof/>
             <w:webHidden/>
           </w:rPr>
-          <w:instrText xml:space="preserve"> PAGEREF _Toc230285597 \h </w:instrText>
+          <w:instrText xml:space="preserve"> PAGEREF _Toc230347889 \h </w:instrText>
         </w:r>
         <w:r>
           <w:rPr>
@@ -2048,7 +2048,7 @@
           <w:lang w:eastAsia="en-US"/>
         </w:rPr>
       </w:pPr>
-      <w:hyperlink w:anchor="_Toc230285598" w:history="1">
+      <w:hyperlink w:anchor="_Toc230347890" w:history="1">
         <w:r>
           <w:rPr>
             <w:rStyle w:val="Hyperlink"/>
@@ -2075,7 +2075,7 @@
             <w:noProof/>
             <w:webHidden/>
           </w:rPr>
-          <w:instrText xml:space="preserve"> PAGEREF _Toc230285598 \h </w:instrText>
+          <w:instrText xml:space="preserve"> PAGEREF _Toc230347890 \h </w:instrText>
         </w:r>
         <w:r>
           <w:rPr>
@@ -2117,7 +2117,7 @@
           <w:lang w:eastAsia="en-US"/>
         </w:rPr>
       </w:pPr>
-      <w:hyperlink w:anchor="_Toc230285599" w:history="1">
+      <w:hyperlink w:anchor="_Toc230347891" w:history="1">
         <w:r>
           <w:rPr>
             <w:rStyle w:val="Hyperlink"/>
@@ -2144,7 +2144,7 @@
             <w:noProof/>
             <w:webHidden/>
           </w:rPr>
-          <w:instrText xml:space="preserve"> PAGEREF _Toc230285599 \h </w:instrText>
+          <w:instrText xml:space="preserve"> PAGEREF _Toc230347891 \h </w:instrText>
         </w:r>
         <w:r>
           <w:rPr>
@@ -2186,7 +2186,7 @@
           <w:lang w:eastAsia="en-US"/>
         </w:rPr>
       </w:pPr>
-      <w:hyperlink w:anchor="_Toc230285600" w:history="1">
+      <w:hyperlink w:anchor="_Toc230347892" w:history="1">
         <w:r>
           <w:rPr>
             <w:rStyle w:val="Hyperlink"/>
@@ -2213,7 +2213,7 @@
             <w:noProof/>
             <w:webHidden/>
           </w:rPr>
-          <w:instrText xml:space="preserve"> PAGEREF _Toc230285600 \h </w:instrText>
+          <w:instrText xml:space="preserve"> PAGEREF _Toc230347892 \h </w:instrText>
         </w:r>
         <w:r>
           <w:rPr>
@@ -2255,7 +2255,7 @@
           <w:lang w:eastAsia="en-US"/>
         </w:rPr>
       </w:pPr>
-      <w:hyperlink w:anchor="_Toc230285601" w:history="1">
+      <w:hyperlink w:anchor="_Toc230347893" w:history="1">
         <w:r>
           <w:rPr>
             <w:rStyle w:val="Hyperlink"/>
@@ -2282,7 +2282,7 @@
             <w:noProof/>
             <w:webHidden/>
           </w:rPr>
-          <w:instrText xml:space="preserve"> PAGEREF _Toc230285601 \h </w:instrText>
+          <w:instrText xml:space="preserve"> PAGEREF _Toc230347893 \h </w:instrText>
         </w:r>
         <w:r>
           <w:rPr>
@@ -2324,7 +2324,7 @@
           <w:lang w:eastAsia="en-US"/>
         </w:rPr>
       </w:pPr>
-      <w:hyperlink w:anchor="_Toc230285602" w:history="1">
+      <w:hyperlink w:anchor="_Toc230347894" w:history="1">
         <w:r>
           <w:rPr>
             <w:rStyle w:val="Hyperlink"/>
@@ -2351,7 +2351,7 @@
             <w:noProof/>
             <w:webHidden/>
           </w:rPr>
-          <w:instrText xml:space="preserve"> PAGEREF _Toc230285602 \h </w:instrText>
+          <w:instrText xml:space="preserve"> PAGEREF _Toc230347894 \h </w:instrText>
         </w:r>
         <w:r>
           <w:rPr>
@@ -2393,7 +2393,7 @@
           <w:lang w:eastAsia="en-US"/>
         </w:rPr>
       </w:pPr>
-      <w:hyperlink w:anchor="_Toc230285603" w:history="1">
+      <w:hyperlink w:anchor="_Toc230347895" w:history="1">
         <w:r>
           <w:rPr>
             <w:rStyle w:val="Hyperlink"/>
@@ -2420,7 +2420,7 @@
             <w:noProof/>
             <w:webHidden/>
           </w:rPr>
-          <w:instrText xml:space="preserve"> PAGEREF _Toc230285603 \h </w:instrText>
+          <w:instrText xml:space="preserve"> PAGEREF _Toc230347895 \h </w:instrText>
         </w:r>
         <w:r>
           <w:rPr>
@@ -2462,7 +2462,7 @@
           <w:lang w:eastAsia="en-US"/>
         </w:rPr>
       </w:pPr>
-      <w:hyperlink w:anchor="_Toc230285604" w:history="1">
+      <w:hyperlink w:anchor="_Toc230347896" w:history="1">
         <w:r>
           <w:rPr>
             <w:rStyle w:val="Hyperlink"/>
@@ -2489,7 +2489,7 @@
             <w:noProof/>
             <w:webHidden/>
           </w:rPr>
-          <w:instrText xml:space="preserve"> PAGEREF _Toc230285604 \h </w:instrText>
+          <w:instrText xml:space="preserve"> PAGEREF _Toc230347896 \h </w:instrText>
         </w:r>
         <w:r>
           <w:rPr>
@@ -2531,7 +2531,7 @@
           <w:lang w:eastAsia="en-US"/>
         </w:rPr>
       </w:pPr>
-      <w:hyperlink w:anchor="_Toc230285605" w:history="1">
+      <w:hyperlink w:anchor="_Toc230347897" w:history="1">
         <w:r>
           <w:rPr>
             <w:rStyle w:val="Hyperlink"/>
@@ -2558,7 +2558,7 @@
             <w:noProof/>
             <w:webHidden/>
           </w:rPr>
-          <w:instrText xml:space="preserve"> PAGEREF _Toc230285605 \h </w:instrText>
+          <w:instrText xml:space="preserve"> PAGEREF _Toc230347897 \h </w:instrText>
         </w:r>
         <w:r>
           <w:rPr>
@@ -2600,7 +2600,7 @@
           <w:lang w:eastAsia="en-US"/>
         </w:rPr>
       </w:pPr>
-      <w:hyperlink w:anchor="_Toc230285606" w:history="1">
+      <w:hyperlink w:anchor="_Toc230347898" w:history="1">
         <w:r>
           <w:rPr>
             <w:rStyle w:val="Hyperlink"/>
@@ -2627,7 +2627,7 @@
             <w:noProof/>
             <w:webHidden/>
           </w:rPr>
-          <w:instrText xml:space="preserve"> PAGEREF _Toc230285606 \h </w:instrText>
+          <w:instrText xml:space="preserve"> PAGEREF _Toc230347898 \h </w:instrText>
         </w:r>
         <w:r>
           <w:rPr>
@@ -2669,7 +2669,7 @@
           <w:lang w:eastAsia="en-US"/>
         </w:rPr>
       </w:pPr>
-      <w:hyperlink w:anchor="_Toc230285607" w:history="1">
+      <w:hyperlink w:anchor="_Toc230347899" w:history="1">
         <w:r>
           <w:rPr>
             <w:rStyle w:val="Hyperlink"/>
@@ -2692,7 +2692,7 @@
           <w:rPr>
             <w:webHidden/>
           </w:rPr>
-          <w:instrText xml:space="preserve"> PAGEREF _Toc230285607 \h </w:instrText>
+          <w:instrText xml:space="preserve"> PAGEREF _Toc230347899 \h </w:instrText>
         </w:r>
         <w:r>
           <w:rPr>
@@ -2730,7 +2730,7 @@
           <w:lang w:eastAsia="en-US"/>
         </w:rPr>
       </w:pPr>
-      <w:hyperlink w:anchor="_Toc230285608" w:history="1">
+      <w:hyperlink w:anchor="_Toc230347900" w:history="1">
         <w:r>
           <w:rPr>
             <w:rStyle w:val="Hyperlink"/>
@@ -2757,7 +2757,7 @@
             <w:noProof/>
             <w:webHidden/>
           </w:rPr>
-          <w:instrText xml:space="preserve"> PAGEREF _Toc230285608 \h </w:instrText>
+          <w:instrText xml:space="preserve"> PAGEREF _Toc230347900 \h </w:instrText>
         </w:r>
         <w:r>
           <w:rPr>
@@ -2810,7 +2810,7 @@
       <w:pPr>
         <w:pStyle w:val="Heading1"/>
       </w:pPr>
-      <w:bookmarkStart w:id="0" w:name="_Toc230285570"/>
+      <w:bookmarkStart w:id="0" w:name="_Toc230347862"/>
       <w:r>
         <w:lastRenderedPageBreak/>
         <w:t>Source Control</w:t>
@@ -2897,7 +2897,7 @@
       <w:pPr>
         <w:pStyle w:val="Heading2"/>
       </w:pPr>
-      <w:bookmarkStart w:id="1" w:name="_Toc230285571"/>
+      <w:bookmarkStart w:id="1" w:name="_Toc230347863"/>
       <w:r>
         <w:t>Repositories</w:t>
       </w:r>
@@ -3107,7 +3107,7 @@
       <w:pPr>
         <w:pStyle w:val="Heading3"/>
       </w:pPr>
-      <w:bookmarkStart w:id="2" w:name="_Toc230285572"/>
+      <w:bookmarkStart w:id="2" w:name="_Toc230347864"/>
       <w:r>
         <w:t>Authentication</w:t>
       </w:r>
@@ -3472,7 +3472,7 @@
       <w:pPr>
         <w:pStyle w:val="Heading2"/>
       </w:pPr>
-      <w:bookmarkStart w:id="3" w:name="_Toc230285573"/>
+      <w:bookmarkStart w:id="3" w:name="_Toc230347865"/>
       <w:r>
         <w:t>Branches</w:t>
       </w:r>
@@ -3697,7 +3697,7 @@
       <w:pPr>
         <w:pStyle w:val="Heading2"/>
       </w:pPr>
-      <w:bookmarkStart w:id="4" w:name="_Toc230285574"/>
+      <w:bookmarkStart w:id="4" w:name="_Toc230347866"/>
       <w:r>
         <w:t>Creat</w:t>
       </w:r>
@@ -4848,7 +4848,80 @@
         <w:t xml:space="preserve"> </w:t>
       </w:r>
       <w:r>
-        <w:t>remote add origin https://github.com/bb3413/TaxTools.git</w:t>
+        <w:t xml:space="preserve">remote add origin </w:t>
+      </w:r>
+      <w:r>
+        <w:t>git@github.com:bb3413/TaxTools.git</w:t>
+      </w:r>
+    </w:p>
+    <w:p>
+      <w:pPr>
+        <w:pStyle w:val="SourceCode"/>
+      </w:pPr>
+      <w:r>
+        <w:t xml:space="preserve">$ </w:t>
+      </w:r>
+      <w:proofErr w:type="spellStart"/>
+      <w:proofErr w:type="gramStart"/>
+      <w:r>
+        <w:t>git</w:t>
+      </w:r>
+      <w:proofErr w:type="spellEnd"/>
+      <w:proofErr w:type="gramEnd"/>
+      <w:r>
+        <w:t xml:space="preserve"> </w:t>
+      </w:r>
+      <w:r>
+        <w:t xml:space="preserve">remote add </w:t>
+      </w:r>
+      <w:proofErr w:type="spellStart"/>
+      <w:r>
+        <w:t>origin</w:t>
+      </w:r>
+      <w:r>
+        <w:t>SSH</w:t>
+      </w:r>
+      <w:proofErr w:type="spellEnd"/>
+      <w:r>
+        <w:t xml:space="preserve"> </w:t>
+      </w:r>
+      <w:r>
+        <w:t>git@github.com:bb3413/TaxTools.git</w:t>
+      </w:r>
+    </w:p>
+    <w:p>
+      <w:pPr>
+        <w:pStyle w:val="SourceCode"/>
+      </w:pPr>
+      <w:r>
+        <w:t xml:space="preserve">$ </w:t>
+      </w:r>
+      <w:proofErr w:type="spellStart"/>
+      <w:proofErr w:type="gramStart"/>
+      <w:r>
+        <w:t>git</w:t>
+      </w:r>
+      <w:proofErr w:type="spellEnd"/>
+      <w:proofErr w:type="gramEnd"/>
+      <w:r>
+        <w:t xml:space="preserve"> </w:t>
+      </w:r>
+      <w:r>
+        <w:t xml:space="preserve">remote add </w:t>
+      </w:r>
+      <w:proofErr w:type="spellStart"/>
+      <w:r>
+        <w:t>origin</w:t>
+      </w:r>
+      <w:r>
+        <w:t>HTML</w:t>
+      </w:r>
+      <w:proofErr w:type="spellEnd"/>
+      <w:r>
+        <w:t xml:space="preserve"> </w:t>
+      </w:r>
+      <w:r>
+        <w:t>https://github.com/bb3413/TaxTools.git</w:t>
       </w:r>
     </w:p>
     <w:p>
@@ -5275,7 +5348,7 @@
       <w:pPr>
         <w:pStyle w:val="Heading2"/>
       </w:pPr>
-      <w:bookmarkStart w:id="5" w:name="_Toc230285575"/>
+      <w:bookmarkStart w:id="5" w:name="_Toc230347867"/>
       <w:r>
         <w:t xml:space="preserve">Using Git </w:t>
       </w:r>
@@ -5291,7 +5364,7 @@
       <w:pPr>
         <w:pStyle w:val="Heading3"/>
       </w:pPr>
-      <w:bookmarkStart w:id="6" w:name="_Toc230285576"/>
+      <w:bookmarkStart w:id="6" w:name="_Toc230347868"/>
       <w:r>
         <w:t>Configuration</w:t>
       </w:r>
@@ -5525,6 +5598,7 @@
         <w:pStyle w:val="Heading4"/>
       </w:pPr>
       <w:r>
+        <w:lastRenderedPageBreak/>
         <w:t>User Settings</w:t>
       </w:r>
     </w:p>
@@ -5607,7 +5681,6 @@
         <w:rPr>
           <w:lang w:eastAsia="ar-SA"/>
         </w:rPr>
-        <w:lastRenderedPageBreak/>
         <w:t xml:space="preserve">$ </w:t>
       </w:r>
       <w:proofErr w:type="spellStart"/>
@@ -5954,7 +6027,7 @@
       <w:pPr>
         <w:pStyle w:val="Heading3"/>
       </w:pPr>
-      <w:bookmarkStart w:id="7" w:name="_Toc230285577"/>
+      <w:bookmarkStart w:id="7" w:name="_Toc230347869"/>
       <w:r>
         <w:t>Create</w:t>
       </w:r>
@@ -6139,7 +6212,7 @@
       <w:pPr>
         <w:pStyle w:val="Heading3"/>
       </w:pPr>
-      <w:bookmarkStart w:id="8" w:name="_Toc230285578"/>
+      <w:bookmarkStart w:id="8" w:name="_Toc230347870"/>
       <w:r>
         <w:t>Create</w:t>
       </w:r>
@@ -6274,7 +6347,7 @@
       <w:pPr>
         <w:pStyle w:val="Heading3"/>
       </w:pPr>
-      <w:bookmarkStart w:id="9" w:name="_Toc230285579"/>
+      <w:bookmarkStart w:id="9" w:name="_Toc230347871"/>
       <w:r>
         <w:t>Synchronize with Remote Repository</w:t>
       </w:r>
@@ -6384,7 +6457,7 @@
       <w:pPr>
         <w:pStyle w:val="Heading3"/>
       </w:pPr>
-      <w:bookmarkStart w:id="10" w:name="_Toc230285580"/>
+      <w:bookmarkStart w:id="10" w:name="_Toc230347872"/>
       <w:r>
         <w:t>Get Status</w:t>
       </w:r>
@@ -6578,6 +6651,7 @@
         <w:pStyle w:val="SourceCode"/>
       </w:pPr>
       <w:r>
+        <w:lastRenderedPageBreak/>
         <w:t xml:space="preserve">$ </w:t>
       </w:r>
       <w:proofErr w:type="spellStart"/>
@@ -6619,7 +6693,6 @@
         <w:pStyle w:val="Body-Text"/>
       </w:pPr>
       <w:r>
-        <w:lastRenderedPageBreak/>
         <w:t xml:space="preserve">From the files that are listed, if they are already being tracked by Git, then you can use the </w:t>
       </w:r>
       <w:proofErr w:type="spellStart"/>
@@ -6855,7 +6928,7 @@
       <w:pPr>
         <w:pStyle w:val="Heading3"/>
       </w:pPr>
-      <w:bookmarkStart w:id="11" w:name="_Toc230285581"/>
+      <w:bookmarkStart w:id="11" w:name="_Toc230347873"/>
       <w:r>
         <w:t>Select a Branch</w:t>
       </w:r>
@@ -7518,7 +7591,7 @@
       <w:pPr>
         <w:pStyle w:val="Heading3"/>
       </w:pPr>
-      <w:bookmarkStart w:id="12" w:name="_Toc230285582"/>
+      <w:bookmarkStart w:id="12" w:name="_Toc230347874"/>
       <w:r>
         <w:t>Create a New Branch</w:t>
       </w:r>
@@ -7659,7 +7732,6 @@
         <w:pStyle w:val="SourceCode"/>
       </w:pPr>
       <w:r>
-        <w:lastRenderedPageBreak/>
         <w:t xml:space="preserve">$ </w:t>
       </w:r>
       <w:proofErr w:type="spellStart"/>
@@ -7695,7 +7767,7 @@
       <w:pPr>
         <w:pStyle w:val="Heading3"/>
       </w:pPr>
-      <w:bookmarkStart w:id="13" w:name="_Toc230285583"/>
+      <w:bookmarkStart w:id="13" w:name="_Toc230347875"/>
       <w:r>
         <w:t>Add</w:t>
       </w:r>
@@ -7932,7 +8004,7 @@
       <w:pPr>
         <w:pStyle w:val="Heading3"/>
       </w:pPr>
-      <w:bookmarkStart w:id="14" w:name="_Toc230285584"/>
+      <w:bookmarkStart w:id="14" w:name="_Toc230347876"/>
       <w:r>
         <w:t>Delete a file</w:t>
       </w:r>
@@ -8071,7 +8143,7 @@
       <w:pPr>
         <w:pStyle w:val="Heading3"/>
       </w:pPr>
-      <w:bookmarkStart w:id="15" w:name="_Toc230285585"/>
+      <w:bookmarkStart w:id="15" w:name="_Toc230347877"/>
       <w:r>
         <w:t>Change a File</w:t>
       </w:r>
@@ -8382,7 +8454,7 @@
       <w:pPr>
         <w:pStyle w:val="Heading3"/>
       </w:pPr>
-      <w:bookmarkStart w:id="16" w:name="_Toc230285586"/>
+      <w:bookmarkStart w:id="16" w:name="_Toc230347878"/>
       <w:r>
         <w:t>Stage a File</w:t>
       </w:r>
@@ -8494,6 +8566,7 @@
         </w:rPr>
       </w:pPr>
       <w:r>
+        <w:lastRenderedPageBreak/>
         <w:t xml:space="preserve">$ </w:t>
       </w:r>
       <w:proofErr w:type="spellStart"/>
@@ -8532,7 +8605,6 @@
         <w:rPr>
           <w:lang w:eastAsia="ar-SA"/>
         </w:rPr>
-        <w:lastRenderedPageBreak/>
         <w:t>If you stage a file and then make another change to the file, you need to re-stage the file; otherwise, only the first change will be committed, but the second change will remain in the file in the working directory.</w:t>
       </w:r>
     </w:p>
@@ -8769,7 +8841,7 @@
       <w:pPr>
         <w:pStyle w:val="Heading3"/>
       </w:pPr>
-      <w:bookmarkStart w:id="17" w:name="_Toc230285587"/>
+      <w:bookmarkStart w:id="17" w:name="_Toc230347879"/>
       <w:r>
         <w:t xml:space="preserve">Commit a </w:t>
       </w:r>
@@ -8900,7 +8972,7 @@
       <w:pPr>
         <w:pStyle w:val="Heading3"/>
       </w:pPr>
-      <w:bookmarkStart w:id="18" w:name="_Toc230285588"/>
+      <w:bookmarkStart w:id="18" w:name="_Toc230347880"/>
       <w:r>
         <w:t>Push Changes to the Remote Repository</w:t>
       </w:r>
@@ -9039,7 +9111,7 @@
       <w:pPr>
         <w:pStyle w:val="Heading3"/>
       </w:pPr>
-      <w:bookmarkStart w:id="19" w:name="_Toc230285589"/>
+      <w:bookmarkStart w:id="19" w:name="_Toc230347881"/>
       <w:r>
         <w:t>Make a Change</w:t>
       </w:r>
@@ -9373,7 +9445,6 @@
         <w:pStyle w:val="SourceCode"/>
       </w:pPr>
       <w:r>
-        <w:lastRenderedPageBreak/>
         <w:t xml:space="preserve">$ </w:t>
       </w:r>
       <w:proofErr w:type="spellStart"/>
@@ -9546,7 +9617,7 @@
       <w:pPr>
         <w:pStyle w:val="Heading3"/>
       </w:pPr>
-      <w:bookmarkStart w:id="20" w:name="_Toc230285590"/>
+      <w:bookmarkStart w:id="20" w:name="_Toc230347882"/>
       <w:r>
         <w:t>Make Change to Main Branch</w:t>
       </w:r>
@@ -9857,7 +9928,7 @@
       <w:pPr>
         <w:pStyle w:val="Heading3"/>
       </w:pPr>
-      <w:bookmarkStart w:id="21" w:name="_Toc230285591"/>
+      <w:bookmarkStart w:id="21" w:name="_Toc230347883"/>
       <w:r>
         <w:t xml:space="preserve">Merge Development Branch into </w:t>
       </w:r>
@@ -10054,6 +10125,7 @@
         <w:pStyle w:val="SourceCode"/>
       </w:pPr>
       <w:r>
+        <w:lastRenderedPageBreak/>
         <w:t xml:space="preserve">$ </w:t>
       </w:r>
       <w:proofErr w:type="spellStart"/>
@@ -10081,7 +10153,6 @@
         </w:numPr>
       </w:pPr>
       <w:r>
-        <w:lastRenderedPageBreak/>
         <w:t>Update Version Information. Edit the version files directly in the main branch. Increment version number (second number) and update version log.</w:t>
       </w:r>
     </w:p>
@@ -10895,7 +10966,7 @@
       <w:pPr>
         <w:pStyle w:val="Heading3"/>
       </w:pPr>
-      <w:bookmarkStart w:id="22" w:name="_Toc230285592"/>
+      <w:bookmarkStart w:id="22" w:name="_Toc230347884"/>
       <w:r>
         <w:t>Get</w:t>
       </w:r>
@@ -10914,7 +10985,7 @@
       <w:pPr>
         <w:pStyle w:val="Heading2"/>
       </w:pPr>
-      <w:bookmarkStart w:id="23" w:name="_Toc230285593"/>
+      <w:bookmarkStart w:id="23" w:name="_Toc230347885"/>
       <w:r>
         <w:rPr>
           <w:lang w:eastAsia="ar-SA"/>
@@ -11002,6 +11073,7 @@
         <w:rPr>
           <w:lang w:eastAsia="ar-SA"/>
         </w:rPr>
+        <w:lastRenderedPageBreak/>
         <w:t>To show the command line syntax and a list of common Git commands:</w:t>
       </w:r>
     </w:p>
@@ -11010,7 +11082,6 @@
         <w:pStyle w:val="SourceCode"/>
       </w:pPr>
       <w:r>
-        <w:lastRenderedPageBreak/>
         <w:t xml:space="preserve">$ </w:t>
       </w:r>
       <w:proofErr w:type="spellStart"/>
@@ -11223,7 +11294,7 @@
       <w:pPr>
         <w:pStyle w:val="Heading2"/>
       </w:pPr>
-      <w:bookmarkStart w:id="24" w:name="_Toc230285594"/>
+      <w:bookmarkStart w:id="24" w:name="_Toc230347886"/>
       <w:r>
         <w:t>Git Terminology</w:t>
       </w:r>
@@ -11521,7 +11592,7 @@
       <w:pPr>
         <w:pStyle w:val="Heading1"/>
       </w:pPr>
-      <w:bookmarkStart w:id="25" w:name="_Toc230285595"/>
+      <w:bookmarkStart w:id="25" w:name="_Toc230347887"/>
       <w:r>
         <w:t>Editing Tools</w:t>
       </w:r>
@@ -11532,7 +11603,7 @@
         <w:pStyle w:val="Heading2"/>
       </w:pPr>
       <w:bookmarkStart w:id="26" w:name="_Toc227669204"/>
-      <w:bookmarkStart w:id="27" w:name="_Toc230285596"/>
+      <w:bookmarkStart w:id="27" w:name="_Toc230347888"/>
       <w:r>
         <w:t>VS Code</w:t>
       </w:r>
@@ -11562,7 +11633,7 @@
       <w:pPr>
         <w:pStyle w:val="Heading3"/>
       </w:pPr>
-      <w:bookmarkStart w:id="28" w:name="_Toc230285597"/>
+      <w:bookmarkStart w:id="28" w:name="_Toc230347889"/>
       <w:r>
         <w:t>Installation</w:t>
       </w:r>
@@ -11621,6 +11692,7 @@
         </w:numPr>
       </w:pPr>
       <w:r>
+        <w:lastRenderedPageBreak/>
         <w:t>Execute the installer</w:t>
       </w:r>
     </w:p>
@@ -11633,7 +11705,6 @@
         </w:numPr>
       </w:pPr>
       <w:r>
-        <w:lastRenderedPageBreak/>
         <w:t xml:space="preserve">Check </w:t>
       </w:r>
       <w:r>
@@ -11734,7 +11805,7 @@
       <w:pPr>
         <w:pStyle w:val="Heading3"/>
       </w:pPr>
-      <w:bookmarkStart w:id="29" w:name="_Toc230285598"/>
+      <w:bookmarkStart w:id="29" w:name="_Toc230347890"/>
       <w:r>
         <w:t>Configuration Settings</w:t>
       </w:r>
@@ -12167,7 +12238,7 @@
       <w:pPr>
         <w:pStyle w:val="Heading3"/>
       </w:pPr>
-      <w:bookmarkStart w:id="30" w:name="_Toc230285599"/>
+      <w:bookmarkStart w:id="30" w:name="_Toc230347891"/>
       <w:r>
         <w:t>Extensions</w:t>
       </w:r>
@@ -12280,6 +12351,7 @@
         <w:spacing w:after="0"/>
       </w:pPr>
       <w:r>
+        <w:lastRenderedPageBreak/>
         <w:t>GitHub Copilot</w:t>
       </w:r>
     </w:p>
@@ -12298,7 +12370,6 @@
         <w:spacing w:after="0"/>
       </w:pPr>
       <w:r>
-        <w:lastRenderedPageBreak/>
         <w:t xml:space="preserve">Open in Browser (by </w:t>
       </w:r>
       <w:proofErr w:type="spellStart"/>
@@ -12314,7 +12385,7 @@
       <w:pPr>
         <w:pStyle w:val="Heading3"/>
       </w:pPr>
-      <w:bookmarkStart w:id="31" w:name="_Toc230285600"/>
+      <w:bookmarkStart w:id="31" w:name="_Toc230347892"/>
       <w:r>
         <w:t>Command Summary</w:t>
       </w:r>
@@ -12483,12 +12554,12 @@
       <w:pPr>
         <w:pStyle w:val="Heading2"/>
       </w:pPr>
-      <w:bookmarkStart w:id="32" w:name="_Toc230285601"/>
-      <w:bookmarkStart w:id="33" w:name="_Toc227669205"/>
+      <w:bookmarkStart w:id="32" w:name="_Toc227669205"/>
+      <w:bookmarkStart w:id="33" w:name="_Toc230347893"/>
       <w:r>
         <w:t>Node and NPM</w:t>
       </w:r>
-      <w:bookmarkEnd w:id="32"/>
+      <w:bookmarkEnd w:id="33"/>
     </w:p>
     <w:p>
       <w:pPr>
@@ -12524,7 +12595,7 @@
       <w:pPr>
         <w:pStyle w:val="Heading3"/>
       </w:pPr>
-      <w:bookmarkStart w:id="34" w:name="_Toc230285602"/>
+      <w:bookmarkStart w:id="34" w:name="_Toc230347894"/>
       <w:r>
         <w:t>Installation</w:t>
       </w:r>
@@ -12783,7 +12854,7 @@
       <w:pPr>
         <w:pStyle w:val="Heading3"/>
       </w:pPr>
-      <w:bookmarkStart w:id="35" w:name="_Toc230285603"/>
+      <w:bookmarkStart w:id="35" w:name="_Toc230347895"/>
       <w:r>
         <w:t>Prettier</w:t>
       </w:r>
@@ -12887,6 +12958,7 @@
         <w:rPr>
           <w:lang w:eastAsia="ar-SA"/>
         </w:rPr>
+        <w:lastRenderedPageBreak/>
         <w:t xml:space="preserve">$ </w:t>
       </w:r>
       <w:proofErr w:type="spellStart"/>
@@ -12929,7 +13001,6 @@
         <w:rPr>
           <w:lang w:eastAsia="ar-SA"/>
         </w:rPr>
-        <w:lastRenderedPageBreak/>
         <w:t>Run Prettier on a file.</w:t>
       </w:r>
     </w:p>
@@ -13092,7 +13163,7 @@
       <w:pPr>
         <w:pStyle w:val="Heading3"/>
       </w:pPr>
-      <w:bookmarkStart w:id="36" w:name="_Toc230285604"/>
+      <w:bookmarkStart w:id="36" w:name="_Toc230347896"/>
       <w:proofErr w:type="spellStart"/>
       <w:r>
         <w:t>ESLint</w:t>
@@ -13438,7 +13509,7 @@
         <w:pStyle w:val="SourceCode"/>
       </w:pPr>
     </w:p>
-    <w:bookmarkEnd w:id="33"/>
+    <w:bookmarkEnd w:id="32"/>
     <w:p>
       <w:pPr>
         <w:pStyle w:val="Body-Text"/>
@@ -13463,7 +13534,7 @@
       <w:pPr>
         <w:pStyle w:val="Heading2"/>
       </w:pPr>
-      <w:bookmarkStart w:id="37" w:name="_Toc230285605"/>
+      <w:bookmarkStart w:id="37" w:name="_Toc230347897"/>
       <w:r>
         <w:t>Git</w:t>
       </w:r>
@@ -13481,7 +13552,7 @@
       <w:pPr>
         <w:pStyle w:val="Heading3"/>
       </w:pPr>
-      <w:bookmarkStart w:id="38" w:name="_Toc230285606"/>
+      <w:bookmarkStart w:id="38" w:name="_Toc230347898"/>
       <w:r>
         <w:t>Inst</w:t>
       </w:r>
@@ -13607,7 +13678,7 @@
       <w:pPr>
         <w:pStyle w:val="Heading1"/>
       </w:pPr>
-      <w:bookmarkStart w:id="39" w:name="_Toc230285607"/>
+      <w:bookmarkStart w:id="39" w:name="_Toc230347899"/>
       <w:r>
         <w:t>Notes</w:t>
       </w:r>
@@ -13617,7 +13688,7 @@
       <w:pPr>
         <w:pStyle w:val="Heading2"/>
       </w:pPr>
-      <w:bookmarkStart w:id="40" w:name="_Toc230285608"/>
+      <w:bookmarkStart w:id="40" w:name="_Toc230347900"/>
       <w:r>
         <w:t>Coding Conventions</w:t>
       </w:r>
@@ -13656,6 +13727,7 @@
         </w:numPr>
       </w:pPr>
       <w:r>
+        <w:lastRenderedPageBreak/>
         <w:t>Function and method names begin with a lower case letter.</w:t>
       </w:r>
     </w:p>
@@ -13668,7 +13740,6 @@
         </w:numPr>
       </w:pPr>
       <w:r>
-        <w:lastRenderedPageBreak/>
         <w:t>Class</w:t>
       </w:r>
       <w:r>
@@ -13867,7 +13938,7 @@
         <w:szCs w:val="24"/>
         <w:lang w:eastAsia="en-US"/>
       </w:rPr>
-      <w:t>11</w:t>
+      <w:t>15</w:t>
     </w:r>
     <w:r>
       <w:rPr>
@@ -17101,7 +17172,7 @@
 </file>
 
 <file path=customXml/itemProps1.xml><?xml version="1.0" encoding="utf-8"?>
-<ds:datastoreItem xmlns:ds="http://schemas.openxmlformats.org/officeDocument/2006/customXml" ds:itemID="{5A1AE78D-AA9B-4AF1-B8BF-DC47FB46A9F4}">
+<ds:datastoreItem xmlns:ds="http://schemas.openxmlformats.org/officeDocument/2006/customXml" ds:itemID="{318D069D-1BE9-4D2F-990F-19CFA005431D}">
   <ds:schemaRefs>
     <ds:schemaRef ds:uri="http://schemas.openxmlformats.org/officeDocument/2006/bibliography"/>
   </ds:schemaRefs>

</xml_diff>

<commit_message>
Start new development version.
</commit_message>
<xml_diff>
--- a/Documentation/DevelopmentEnvironment.docx
+++ b/Documentation/DevelopmentEnvironment.docx
@@ -2026,7 +2026,7 @@
             <w:noProof/>
             <w:webHidden/>
           </w:rPr>
-          <w:t>12</w:t>
+          <w:t>13</w:t>
         </w:r>
         <w:r>
           <w:rPr>
@@ -2440,7 +2440,7 @@
             <w:noProof/>
             <w:webHidden/>
           </w:rPr>
-          <w:t>14</w:t>
+          <w:t>15</w:t>
         </w:r>
         <w:r>
           <w:rPr>
@@ -2836,15 +2836,25 @@
       <w:r>
         <w:t xml:space="preserve"> </w:t>
       </w:r>
-      <w:hyperlink r:id="rId8" w:history="1">
-        <w:r>
-          <w:rPr>
-            <w:rStyle w:val="Hyperlink"/>
-            <w:sz w:val="18"/>
-          </w:rPr>
-          <w:t>git-scm.com</w:t>
-        </w:r>
-      </w:hyperlink>
+      <w:r>
+        <w:fldChar w:fldCharType="begin"/>
+      </w:r>
+      <w:r>
+        <w:instrText>HYPERLINK "https://git-scm.com/"</w:instrText>
+      </w:r>
+      <w:r>
+        <w:fldChar w:fldCharType="separate"/>
+      </w:r>
+      <w:r>
+        <w:rPr>
+          <w:rStyle w:val="Hyperlink"/>
+          <w:sz w:val="18"/>
+        </w:rPr>
+        <w:t>git-scm.com</w:t>
+      </w:r>
+      <w:r>
+        <w:fldChar w:fldCharType="end"/>
+      </w:r>
       <w:r>
         <w:t>.</w:t>
       </w:r>
@@ -2880,15 +2890,25 @@
       <w:r>
         <w:t xml:space="preserve">at </w:t>
       </w:r>
-      <w:hyperlink r:id="rId9" w:history="1">
-        <w:r>
-          <w:rPr>
-            <w:rStyle w:val="Hyperlink"/>
-            <w:sz w:val="18"/>
-          </w:rPr>
-          <w:t>github.com</w:t>
-        </w:r>
-      </w:hyperlink>
+      <w:r>
+        <w:fldChar w:fldCharType="begin"/>
+      </w:r>
+      <w:r>
+        <w:instrText>HYPERLINK "https://github.com/"</w:instrText>
+      </w:r>
+      <w:r>
+        <w:fldChar w:fldCharType="separate"/>
+      </w:r>
+      <w:r>
+        <w:rPr>
+          <w:rStyle w:val="Hyperlink"/>
+          <w:sz w:val="18"/>
+        </w:rPr>
+        <w:t>github.com</w:t>
+      </w:r>
+      <w:r>
+        <w:fldChar w:fldCharType="end"/>
+      </w:r>
       <w:r>
         <w:t>.</w:t>
       </w:r>
@@ -10265,6 +10285,24 @@
       <w:pPr>
         <w:pStyle w:val="SourceCode"/>
       </w:pPr>
+      <w:r>
+        <w:t xml:space="preserve">$ </w:t>
+      </w:r>
+      <w:proofErr w:type="spellStart"/>
+      <w:proofErr w:type="gramStart"/>
+      <w:r>
+        <w:t>git</w:t>
+      </w:r>
+      <w:proofErr w:type="spellEnd"/>
+      <w:proofErr w:type="gramEnd"/>
+      <w:r>
+        <w:t xml:space="preserve"> push</w:t>
+      </w:r>
+    </w:p>
+    <w:p>
+      <w:pPr>
+        <w:pStyle w:val="SourceCode"/>
+      </w:pPr>
     </w:p>
     <w:p>
       <w:pPr>
@@ -10713,13 +10751,18 @@
         <w:pStyle w:val="SourceCode"/>
       </w:pPr>
       <w:r>
-        <w:t xml:space="preserve">$ $ </w:t>
-      </w:r>
-      <w:proofErr w:type="spellStart"/>
+        <w:t>$</w:t>
+      </w:r>
+      <w:r>
+        <w:t xml:space="preserve"> </w:t>
+      </w:r>
+      <w:proofErr w:type="spellStart"/>
+      <w:proofErr w:type="gramStart"/>
       <w:r>
         <w:t>mv</w:t>
       </w:r>
       <w:proofErr w:type="spellEnd"/>
+      <w:proofErr w:type="gramEnd"/>
       <w:r>
         <w:t xml:space="preserve"> </w:t>
       </w:r>
@@ -10760,7 +10803,13 @@
       </w:r>
       <w:proofErr w:type="spellStart"/>
       <w:r>
-        <w:t>cvf</w:t>
+        <w:t>cv</w:t>
+      </w:r>
+      <w:r>
+        <w:t>z</w:t>
+      </w:r>
+      <w:r>
+        <w:t>f</w:t>
       </w:r>
       <w:proofErr w:type="spellEnd"/>
       <w:r>
@@ -10926,13 +10975,22 @@
         <w:t xml:space="preserve"># </w:t>
       </w:r>
       <w:r>
-        <w:t xml:space="preserve">Push </w:t>
+        <w:t>Copy</w:t>
+      </w:r>
+      <w:r>
+        <w:t xml:space="preserve"> </w:t>
       </w:r>
       <w:r>
         <w:t xml:space="preserve">the </w:t>
       </w:r>
       <w:r>
-        <w:t>new TaxTools to web</w:t>
+        <w:t xml:space="preserve">new TaxTools to </w:t>
+      </w:r>
+      <w:r>
+        <w:t xml:space="preserve">the </w:t>
+      </w:r>
+      <w:r>
+        <w:t>web</w:t>
       </w:r>
     </w:p>
     <w:p>
@@ -11149,7 +11207,7 @@
         <w:pStyle w:val="Body-Text-tight"/>
         <w:ind w:left="1440"/>
       </w:pPr>
-      <w:hyperlink r:id="rId10" w:history="1">
+      <w:hyperlink r:id="rId8" w:history="1">
         <w:r>
           <w:rPr>
             <w:rStyle w:val="Hyperlink"/>
@@ -11165,7 +11223,7 @@
         <w:pStyle w:val="Body-Text-tight"/>
         <w:ind w:left="1440"/>
       </w:pPr>
-      <w:hyperlink r:id="rId11" w:history="1">
+      <w:hyperlink r:id="rId9" w:history="1">
         <w:r>
           <w:rPr>
             <w:rStyle w:val="Hyperlink"/>
@@ -11749,7 +11807,7 @@
       <w:r>
         <w:t xml:space="preserve">Visual Studio Code, usually called VS Code, is a popular, free editor for developers. There are many extensions that give it additional capabilities and interoperability with other tools, but it comes with build in support for HTML, CSS, and JavaScript. For more information on VS Code, go to </w:t>
       </w:r>
-      <w:hyperlink r:id="rId12" w:history="1">
+      <w:hyperlink r:id="rId10" w:history="1">
         <w:r>
           <w:rPr>
             <w:rStyle w:val="Hyperlink"/>
@@ -11767,6 +11825,7 @@
       </w:pPr>
       <w:bookmarkStart w:id="28" w:name="_Toc230681468"/>
       <w:r>
+        <w:lastRenderedPageBreak/>
         <w:t>Installation</w:t>
       </w:r>
       <w:bookmarkEnd w:id="28"/>
@@ -11782,7 +11841,7 @@
       <w:r>
         <w:t xml:space="preserve">Go to </w:t>
       </w:r>
-      <w:hyperlink r:id="rId13" w:history="1">
+      <w:hyperlink r:id="rId11" w:history="1">
         <w:r>
           <w:rPr>
             <w:rStyle w:val="Hyperlink"/>
@@ -11800,7 +11859,6 @@
         </w:numPr>
       </w:pPr>
       <w:r>
-        <w:lastRenderedPageBreak/>
         <w:t>Click on the correct install option (for Windows, all the options result in the same installer).</w:t>
       </w:r>
     </w:p>
@@ -12455,7 +12513,6 @@
       </w:pPr>
       <w:proofErr w:type="spellStart"/>
       <w:r>
-        <w:lastRenderedPageBreak/>
         <w:t>GitLens</w:t>
       </w:r>
       <w:proofErr w:type="spellEnd"/>
@@ -12686,12 +12743,12 @@
       <w:pPr>
         <w:pStyle w:val="Heading2"/>
       </w:pPr>
-      <w:bookmarkStart w:id="32" w:name="_Toc227669205"/>
-      <w:bookmarkStart w:id="33" w:name="_Toc230681472"/>
+      <w:bookmarkStart w:id="32" w:name="_Toc230681472"/>
+      <w:bookmarkStart w:id="33" w:name="_Toc227669205"/>
       <w:r>
         <w:t>Node and NPM</w:t>
       </w:r>
-      <w:bookmarkEnd w:id="33"/>
+      <w:bookmarkEnd w:id="32"/>
     </w:p>
     <w:p>
       <w:pPr>
@@ -12744,7 +12801,7 @@
       <w:r>
         <w:t xml:space="preserve">Go to </w:t>
       </w:r>
-      <w:hyperlink r:id="rId14" w:history="1">
+      <w:hyperlink r:id="rId12" w:history="1">
         <w:r>
           <w:rPr>
             <w:rStyle w:val="Hyperlink"/>
@@ -12988,6 +13045,7 @@
       </w:pPr>
       <w:bookmarkStart w:id="35" w:name="_Toc230681474"/>
       <w:r>
+        <w:lastRenderedPageBreak/>
         <w:t>Prettier</w:t>
       </w:r>
       <w:bookmarkEnd w:id="35"/>
@@ -13021,7 +13079,6 @@
         <w:rPr>
           <w:lang w:eastAsia="ar-SA"/>
         </w:rPr>
-        <w:lastRenderedPageBreak/>
         <w:t xml:space="preserve">Install the prettier package. The </w:t>
       </w:r>
       <w:r>
@@ -13641,7 +13698,7 @@
         <w:pStyle w:val="SourceCode"/>
       </w:pPr>
     </w:p>
-    <w:bookmarkEnd w:id="32"/>
+    <w:bookmarkEnd w:id="33"/>
     <w:p>
       <w:pPr>
         <w:pStyle w:val="Body-Text"/>
@@ -13707,7 +13764,7 @@
       <w:r>
         <w:t xml:space="preserve">Go to </w:t>
       </w:r>
-      <w:hyperlink r:id="rId15" w:history="1">
+      <w:hyperlink r:id="rId13" w:history="1">
         <w:r>
           <w:rPr>
             <w:rStyle w:val="Hyperlink"/>
@@ -13911,7 +13968,7 @@
       </w:pPr>
     </w:p>
     <w:sectPr>
-      <w:footerReference w:type="default" r:id="rId16"/>
+      <w:footerReference w:type="default" r:id="rId14"/>
       <w:pgSz w:w="12240" w:h="15840"/>
       <w:pgMar w:top="1440" w:right="1440" w:bottom="1440" w:left="1440" w:header="720" w:footer="720" w:gutter="0"/>
       <w:cols w:space="720"/>
@@ -17304,7 +17361,7 @@
 </file>
 
 <file path=customXml/itemProps1.xml><?xml version="1.0" encoding="utf-8"?>
-<ds:datastoreItem xmlns:ds="http://schemas.openxmlformats.org/officeDocument/2006/customXml" ds:itemID="{C1467773-C6BF-4385-8226-0AF8A07530A6}">
+<ds:datastoreItem xmlns:ds="http://schemas.openxmlformats.org/officeDocument/2006/customXml" ds:itemID="{A562AB57-CDAC-48D7-BD58-B05543B46A08}">
   <ds:schemaRefs>
     <ds:schemaRef ds:uri="http://schemas.openxmlformats.org/officeDocument/2006/bibliography"/>
   </ds:schemaRefs>

</xml_diff>

<commit_message>
Fix senior deduction calculation with spouse's age when MFJ.
</commit_message>
<xml_diff>
--- a/Documentation/DevelopmentEnvironment.docx
+++ b/Documentation/DevelopmentEnvironment.docx
@@ -47,7 +47,7 @@
         <w:rPr>
           <w:noProof/>
         </w:rPr>
-        <w:t>May 26, 2026</w:t>
+        <w:t>May 31, 2026</w:t>
       </w:r>
       <w:r>
         <w:rPr>
@@ -132,7 +132,7 @@
         </w:rPr>
         <w:fldChar w:fldCharType="separate"/>
       </w:r>
-      <w:hyperlink w:anchor="_Toc230700091" w:history="1">
+      <w:hyperlink w:anchor="_Toc231118424" w:history="1">
         <w:r>
           <w:rPr>
             <w:rStyle w:val="Hyperlink"/>
@@ -155,7 +155,7 @@
           <w:rPr>
             <w:webHidden/>
           </w:rPr>
-          <w:instrText xml:space="preserve"> PAGEREF _Toc230700091 \h </w:instrText>
+          <w:instrText xml:space="preserve"> PAGEREF _Toc231118424 \h </w:instrText>
         </w:r>
         <w:r>
           <w:rPr>
@@ -172,7 +172,7 @@
           <w:rPr>
             <w:webHidden/>
           </w:rPr>
-          <w:t>1</w:t>
+          <w:t>2</w:t>
         </w:r>
         <w:r>
           <w:rPr>
@@ -193,7 +193,7 @@
           <w:lang w:eastAsia="en-US"/>
         </w:rPr>
       </w:pPr>
-      <w:hyperlink w:anchor="_Toc230700092" w:history="1">
+      <w:hyperlink w:anchor="_Toc231118425" w:history="1">
         <w:r>
           <w:rPr>
             <w:rStyle w:val="Hyperlink"/>
@@ -220,7 +220,7 @@
             <w:noProof/>
             <w:webHidden/>
           </w:rPr>
-          <w:instrText xml:space="preserve"> PAGEREF _Toc230700092 \h </w:instrText>
+          <w:instrText xml:space="preserve"> PAGEREF _Toc231118425 \h </w:instrText>
         </w:r>
         <w:r>
           <w:rPr>
@@ -262,7 +262,7 @@
           <w:lang w:eastAsia="en-US"/>
         </w:rPr>
       </w:pPr>
-      <w:hyperlink w:anchor="_Toc230700093" w:history="1">
+      <w:hyperlink w:anchor="_Toc231118426" w:history="1">
         <w:r>
           <w:rPr>
             <w:rStyle w:val="Hyperlink"/>
@@ -289,7 +289,7 @@
             <w:noProof/>
             <w:webHidden/>
           </w:rPr>
-          <w:instrText xml:space="preserve"> PAGEREF _Toc230700093 \h </w:instrText>
+          <w:instrText xml:space="preserve"> PAGEREF _Toc231118426 \h </w:instrText>
         </w:r>
         <w:r>
           <w:rPr>
@@ -331,7 +331,7 @@
           <w:lang w:eastAsia="en-US"/>
         </w:rPr>
       </w:pPr>
-      <w:hyperlink w:anchor="_Toc230700094" w:history="1">
+      <w:hyperlink w:anchor="_Toc231118427" w:history="1">
         <w:r>
           <w:rPr>
             <w:rStyle w:val="Hyperlink"/>
@@ -358,7 +358,7 @@
             <w:noProof/>
             <w:webHidden/>
           </w:rPr>
-          <w:instrText xml:space="preserve"> PAGEREF _Toc230700094 \h </w:instrText>
+          <w:instrText xml:space="preserve"> PAGEREF _Toc231118427 \h </w:instrText>
         </w:r>
         <w:r>
           <w:rPr>
@@ -400,7 +400,7 @@
           <w:lang w:eastAsia="en-US"/>
         </w:rPr>
       </w:pPr>
-      <w:hyperlink w:anchor="_Toc230700095" w:history="1">
+      <w:hyperlink w:anchor="_Toc231118428" w:history="1">
         <w:r>
           <w:rPr>
             <w:rStyle w:val="Hyperlink"/>
@@ -427,7 +427,7 @@
             <w:noProof/>
             <w:webHidden/>
           </w:rPr>
-          <w:instrText xml:space="preserve"> PAGEREF _Toc230700095 \h </w:instrText>
+          <w:instrText xml:space="preserve"> PAGEREF _Toc231118428 \h </w:instrText>
         </w:r>
         <w:r>
           <w:rPr>
@@ -469,7 +469,7 @@
           <w:lang w:eastAsia="en-US"/>
         </w:rPr>
       </w:pPr>
-      <w:hyperlink w:anchor="_Toc230700096" w:history="1">
+      <w:hyperlink w:anchor="_Toc231118429" w:history="1">
         <w:r>
           <w:rPr>
             <w:rStyle w:val="Hyperlink"/>
@@ -496,7 +496,7 @@
             <w:noProof/>
             <w:webHidden/>
           </w:rPr>
-          <w:instrText xml:space="preserve"> PAGEREF _Toc230700096 \h </w:instrText>
+          <w:instrText xml:space="preserve"> PAGEREF _Toc231118429 \h </w:instrText>
         </w:r>
         <w:r>
           <w:rPr>
@@ -538,7 +538,7 @@
           <w:lang w:eastAsia="en-US"/>
         </w:rPr>
       </w:pPr>
-      <w:hyperlink w:anchor="_Toc230700097" w:history="1">
+      <w:hyperlink w:anchor="_Toc231118430" w:history="1">
         <w:r>
           <w:rPr>
             <w:rStyle w:val="Hyperlink"/>
@@ -565,7 +565,7 @@
             <w:noProof/>
             <w:webHidden/>
           </w:rPr>
-          <w:instrText xml:space="preserve"> PAGEREF _Toc230700097 \h </w:instrText>
+          <w:instrText xml:space="preserve"> PAGEREF _Toc231118430 \h </w:instrText>
         </w:r>
         <w:r>
           <w:rPr>
@@ -607,7 +607,7 @@
           <w:lang w:eastAsia="en-US"/>
         </w:rPr>
       </w:pPr>
-      <w:hyperlink w:anchor="_Toc230700098" w:history="1">
+      <w:hyperlink w:anchor="_Toc231118431" w:history="1">
         <w:r>
           <w:rPr>
             <w:rStyle w:val="Hyperlink"/>
@@ -634,7 +634,7 @@
             <w:noProof/>
             <w:webHidden/>
           </w:rPr>
-          <w:instrText xml:space="preserve"> PAGEREF _Toc230700098 \h </w:instrText>
+          <w:instrText xml:space="preserve"> PAGEREF _Toc231118431 \h </w:instrText>
         </w:r>
         <w:r>
           <w:rPr>
@@ -676,7 +676,7 @@
           <w:lang w:eastAsia="en-US"/>
         </w:rPr>
       </w:pPr>
-      <w:hyperlink w:anchor="_Toc230700099" w:history="1">
+      <w:hyperlink w:anchor="_Toc231118432" w:history="1">
         <w:r>
           <w:rPr>
             <w:rStyle w:val="Hyperlink"/>
@@ -703,7 +703,7 @@
             <w:noProof/>
             <w:webHidden/>
           </w:rPr>
-          <w:instrText xml:space="preserve"> PAGEREF _Toc230700099 \h </w:instrText>
+          <w:instrText xml:space="preserve"> PAGEREF _Toc231118432 \h </w:instrText>
         </w:r>
         <w:r>
           <w:rPr>
@@ -745,7 +745,7 @@
           <w:lang w:eastAsia="en-US"/>
         </w:rPr>
       </w:pPr>
-      <w:hyperlink w:anchor="_Toc230700100" w:history="1">
+      <w:hyperlink w:anchor="_Toc231118433" w:history="1">
         <w:r>
           <w:rPr>
             <w:rStyle w:val="Hyperlink"/>
@@ -772,7 +772,7 @@
             <w:noProof/>
             <w:webHidden/>
           </w:rPr>
-          <w:instrText xml:space="preserve"> PAGEREF _Toc230700100 \h </w:instrText>
+          <w:instrText xml:space="preserve"> PAGEREF _Toc231118433 \h </w:instrText>
         </w:r>
         <w:r>
           <w:rPr>
@@ -814,7 +814,7 @@
           <w:lang w:eastAsia="en-US"/>
         </w:rPr>
       </w:pPr>
-      <w:hyperlink w:anchor="_Toc230700101" w:history="1">
+      <w:hyperlink w:anchor="_Toc231118434" w:history="1">
         <w:r>
           <w:rPr>
             <w:rStyle w:val="Hyperlink"/>
@@ -841,7 +841,7 @@
             <w:noProof/>
             <w:webHidden/>
           </w:rPr>
-          <w:instrText xml:space="preserve"> PAGEREF _Toc230700101 \h </w:instrText>
+          <w:instrText xml:space="preserve"> PAGEREF _Toc231118434 \h </w:instrText>
         </w:r>
         <w:r>
           <w:rPr>
@@ -883,7 +883,7 @@
           <w:lang w:eastAsia="en-US"/>
         </w:rPr>
       </w:pPr>
-      <w:hyperlink w:anchor="_Toc230700102" w:history="1">
+      <w:hyperlink w:anchor="_Toc231118435" w:history="1">
         <w:r>
           <w:rPr>
             <w:rStyle w:val="Hyperlink"/>
@@ -910,7 +910,7 @@
             <w:noProof/>
             <w:webHidden/>
           </w:rPr>
-          <w:instrText xml:space="preserve"> PAGEREF _Toc230700102 \h </w:instrText>
+          <w:instrText xml:space="preserve"> PAGEREF _Toc231118435 \h </w:instrText>
         </w:r>
         <w:r>
           <w:rPr>
@@ -952,7 +952,7 @@
           <w:lang w:eastAsia="en-US"/>
         </w:rPr>
       </w:pPr>
-      <w:hyperlink w:anchor="_Toc230700103" w:history="1">
+      <w:hyperlink w:anchor="_Toc231118436" w:history="1">
         <w:r>
           <w:rPr>
             <w:rStyle w:val="Hyperlink"/>
@@ -979,7 +979,7 @@
             <w:noProof/>
             <w:webHidden/>
           </w:rPr>
-          <w:instrText xml:space="preserve"> PAGEREF _Toc230700103 \h </w:instrText>
+          <w:instrText xml:space="preserve"> PAGEREF _Toc231118436 \h </w:instrText>
         </w:r>
         <w:r>
           <w:rPr>
@@ -1021,7 +1021,7 @@
           <w:lang w:eastAsia="en-US"/>
         </w:rPr>
       </w:pPr>
-      <w:hyperlink w:anchor="_Toc230700104" w:history="1">
+      <w:hyperlink w:anchor="_Toc231118437" w:history="1">
         <w:r>
           <w:rPr>
             <w:rStyle w:val="Hyperlink"/>
@@ -1048,7 +1048,7 @@
             <w:noProof/>
             <w:webHidden/>
           </w:rPr>
-          <w:instrText xml:space="preserve"> PAGEREF _Toc230700104 \h </w:instrText>
+          <w:instrText xml:space="preserve"> PAGEREF _Toc231118437 \h </w:instrText>
         </w:r>
         <w:r>
           <w:rPr>
@@ -1090,7 +1090,7 @@
           <w:lang w:eastAsia="en-US"/>
         </w:rPr>
       </w:pPr>
-      <w:hyperlink w:anchor="_Toc230700105" w:history="1">
+      <w:hyperlink w:anchor="_Toc231118438" w:history="1">
         <w:r>
           <w:rPr>
             <w:rStyle w:val="Hyperlink"/>
@@ -1117,7 +1117,7 @@
             <w:noProof/>
             <w:webHidden/>
           </w:rPr>
-          <w:instrText xml:space="preserve"> PAGEREF _Toc230700105 \h </w:instrText>
+          <w:instrText xml:space="preserve"> PAGEREF _Toc231118438 \h </w:instrText>
         </w:r>
         <w:r>
           <w:rPr>
@@ -1159,7 +1159,7 @@
           <w:lang w:eastAsia="en-US"/>
         </w:rPr>
       </w:pPr>
-      <w:hyperlink w:anchor="_Toc230700106" w:history="1">
+      <w:hyperlink w:anchor="_Toc231118439" w:history="1">
         <w:r>
           <w:rPr>
             <w:rStyle w:val="Hyperlink"/>
@@ -1186,7 +1186,7 @@
             <w:noProof/>
             <w:webHidden/>
           </w:rPr>
-          <w:instrText xml:space="preserve"> PAGEREF _Toc230700106 \h </w:instrText>
+          <w:instrText xml:space="preserve"> PAGEREF _Toc231118439 \h </w:instrText>
         </w:r>
         <w:r>
           <w:rPr>
@@ -1228,7 +1228,7 @@
           <w:lang w:eastAsia="en-US"/>
         </w:rPr>
       </w:pPr>
-      <w:hyperlink w:anchor="_Toc230700107" w:history="1">
+      <w:hyperlink w:anchor="_Toc231118440" w:history="1">
         <w:r>
           <w:rPr>
             <w:rStyle w:val="Hyperlink"/>
@@ -1255,7 +1255,7 @@
             <w:noProof/>
             <w:webHidden/>
           </w:rPr>
-          <w:instrText xml:space="preserve"> PAGEREF _Toc230700107 \h </w:instrText>
+          <w:instrText xml:space="preserve"> PAGEREF _Toc231118440 \h </w:instrText>
         </w:r>
         <w:r>
           <w:rPr>
@@ -1297,7 +1297,7 @@
           <w:lang w:eastAsia="en-US"/>
         </w:rPr>
       </w:pPr>
-      <w:hyperlink w:anchor="_Toc230700108" w:history="1">
+      <w:hyperlink w:anchor="_Toc231118441" w:history="1">
         <w:r>
           <w:rPr>
             <w:rStyle w:val="Hyperlink"/>
@@ -1324,7 +1324,7 @@
             <w:noProof/>
             <w:webHidden/>
           </w:rPr>
-          <w:instrText xml:space="preserve"> PAGEREF _Toc230700108 \h </w:instrText>
+          <w:instrText xml:space="preserve"> PAGEREF _Toc231118441 \h </w:instrText>
         </w:r>
         <w:r>
           <w:rPr>
@@ -1366,7 +1366,7 @@
           <w:lang w:eastAsia="en-US"/>
         </w:rPr>
       </w:pPr>
-      <w:hyperlink w:anchor="_Toc230700109" w:history="1">
+      <w:hyperlink w:anchor="_Toc231118442" w:history="1">
         <w:r>
           <w:rPr>
             <w:rStyle w:val="Hyperlink"/>
@@ -1393,7 +1393,7 @@
             <w:noProof/>
             <w:webHidden/>
           </w:rPr>
-          <w:instrText xml:space="preserve"> PAGEREF _Toc230700109 \h </w:instrText>
+          <w:instrText xml:space="preserve"> PAGEREF _Toc231118442 \h </w:instrText>
         </w:r>
         <w:r>
           <w:rPr>
@@ -1435,7 +1435,7 @@
           <w:lang w:eastAsia="en-US"/>
         </w:rPr>
       </w:pPr>
-      <w:hyperlink w:anchor="_Toc230700110" w:history="1">
+      <w:hyperlink w:anchor="_Toc231118443" w:history="1">
         <w:r>
           <w:rPr>
             <w:rStyle w:val="Hyperlink"/>
@@ -1462,7 +1462,7 @@
             <w:noProof/>
             <w:webHidden/>
           </w:rPr>
-          <w:instrText xml:space="preserve"> PAGEREF _Toc230700110 \h </w:instrText>
+          <w:instrText xml:space="preserve"> PAGEREF _Toc231118443 \h </w:instrText>
         </w:r>
         <w:r>
           <w:rPr>
@@ -1504,7 +1504,7 @@
           <w:lang w:eastAsia="en-US"/>
         </w:rPr>
       </w:pPr>
-      <w:hyperlink w:anchor="_Toc230700111" w:history="1">
+      <w:hyperlink w:anchor="_Toc231118444" w:history="1">
         <w:r>
           <w:rPr>
             <w:rStyle w:val="Hyperlink"/>
@@ -1531,7 +1531,7 @@
             <w:noProof/>
             <w:webHidden/>
           </w:rPr>
-          <w:instrText xml:space="preserve"> PAGEREF _Toc230700111 \h </w:instrText>
+          <w:instrText xml:space="preserve"> PAGEREF _Toc231118444 \h </w:instrText>
         </w:r>
         <w:r>
           <w:rPr>
@@ -1573,7 +1573,7 @@
           <w:lang w:eastAsia="en-US"/>
         </w:rPr>
       </w:pPr>
-      <w:hyperlink w:anchor="_Toc230700112" w:history="1">
+      <w:hyperlink w:anchor="_Toc231118445" w:history="1">
         <w:r>
           <w:rPr>
             <w:rStyle w:val="Hyperlink"/>
@@ -1600,7 +1600,7 @@
             <w:noProof/>
             <w:webHidden/>
           </w:rPr>
-          <w:instrText xml:space="preserve"> PAGEREF _Toc230700112 \h </w:instrText>
+          <w:instrText xml:space="preserve"> PAGEREF _Toc231118445 \h </w:instrText>
         </w:r>
         <w:r>
           <w:rPr>
@@ -1642,7 +1642,7 @@
           <w:lang w:eastAsia="en-US"/>
         </w:rPr>
       </w:pPr>
-      <w:hyperlink w:anchor="_Toc230700113" w:history="1">
+      <w:hyperlink w:anchor="_Toc231118446" w:history="1">
         <w:r>
           <w:rPr>
             <w:rStyle w:val="Hyperlink"/>
@@ -1669,7 +1669,7 @@
             <w:noProof/>
             <w:webHidden/>
           </w:rPr>
-          <w:instrText xml:space="preserve"> PAGEREF _Toc230700113 \h </w:instrText>
+          <w:instrText xml:space="preserve"> PAGEREF _Toc231118446 \h </w:instrText>
         </w:r>
         <w:r>
           <w:rPr>
@@ -1711,7 +1711,7 @@
           <w:lang w:eastAsia="en-US"/>
         </w:rPr>
       </w:pPr>
-      <w:hyperlink w:anchor="_Toc230700114" w:history="1">
+      <w:hyperlink w:anchor="_Toc231118447" w:history="1">
         <w:r>
           <w:rPr>
             <w:rStyle w:val="Hyperlink"/>
@@ -1738,7 +1738,7 @@
             <w:noProof/>
             <w:webHidden/>
           </w:rPr>
-          <w:instrText xml:space="preserve"> PAGEREF _Toc230700114 \h </w:instrText>
+          <w:instrText xml:space="preserve"> PAGEREF _Toc231118447 \h </w:instrText>
         </w:r>
         <w:r>
           <w:rPr>
@@ -1780,7 +1780,7 @@
           <w:lang w:eastAsia="en-US"/>
         </w:rPr>
       </w:pPr>
-      <w:hyperlink w:anchor="_Toc230700115" w:history="1">
+      <w:hyperlink w:anchor="_Toc231118448" w:history="1">
         <w:r>
           <w:rPr>
             <w:rStyle w:val="Hyperlink"/>
@@ -1807,7 +1807,7 @@
             <w:noProof/>
             <w:webHidden/>
           </w:rPr>
-          <w:instrText xml:space="preserve"> PAGEREF _Toc230700115 \h </w:instrText>
+          <w:instrText xml:space="preserve"> PAGEREF _Toc231118448 \h </w:instrText>
         </w:r>
         <w:r>
           <w:rPr>
@@ -1849,7 +1849,7 @@
           <w:lang w:eastAsia="en-US"/>
         </w:rPr>
       </w:pPr>
-      <w:hyperlink w:anchor="_Toc230700116" w:history="1">
+      <w:hyperlink w:anchor="_Toc231118449" w:history="1">
         <w:r>
           <w:rPr>
             <w:rStyle w:val="Hyperlink"/>
@@ -1876,7 +1876,7 @@
             <w:noProof/>
             <w:webHidden/>
           </w:rPr>
-          <w:instrText xml:space="preserve"> PAGEREF _Toc230700116 \h </w:instrText>
+          <w:instrText xml:space="preserve"> PAGEREF _Toc231118449 \h </w:instrText>
         </w:r>
         <w:r>
           <w:rPr>
@@ -1918,7 +1918,7 @@
           <w:lang w:eastAsia="en-US"/>
         </w:rPr>
       </w:pPr>
-      <w:hyperlink w:anchor="_Toc230700117" w:history="1">
+      <w:hyperlink w:anchor="_Toc231118450" w:history="1">
         <w:r>
           <w:rPr>
             <w:rStyle w:val="Hyperlink"/>
@@ -1941,7 +1941,7 @@
           <w:rPr>
             <w:webHidden/>
           </w:rPr>
-          <w:instrText xml:space="preserve"> PAGEREF _Toc230700117 \h </w:instrText>
+          <w:instrText xml:space="preserve"> PAGEREF _Toc231118450 \h </w:instrText>
         </w:r>
         <w:r>
           <w:rPr>
@@ -1979,7 +1979,7 @@
           <w:lang w:eastAsia="en-US"/>
         </w:rPr>
       </w:pPr>
-      <w:hyperlink w:anchor="_Toc230700118" w:history="1">
+      <w:hyperlink w:anchor="_Toc231118451" w:history="1">
         <w:r>
           <w:rPr>
             <w:rStyle w:val="Hyperlink"/>
@@ -2006,7 +2006,7 @@
             <w:noProof/>
             <w:webHidden/>
           </w:rPr>
-          <w:instrText xml:space="preserve"> PAGEREF _Toc230700118 \h </w:instrText>
+          <w:instrText xml:space="preserve"> PAGEREF _Toc231118451 \h </w:instrText>
         </w:r>
         <w:r>
           <w:rPr>
@@ -2048,7 +2048,7 @@
           <w:lang w:eastAsia="en-US"/>
         </w:rPr>
       </w:pPr>
-      <w:hyperlink w:anchor="_Toc230700119" w:history="1">
+      <w:hyperlink w:anchor="_Toc231118452" w:history="1">
         <w:r>
           <w:rPr>
             <w:rStyle w:val="Hyperlink"/>
@@ -2075,7 +2075,7 @@
             <w:noProof/>
             <w:webHidden/>
           </w:rPr>
-          <w:instrText xml:space="preserve"> PAGEREF _Toc230700119 \h </w:instrText>
+          <w:instrText xml:space="preserve"> PAGEREF _Toc231118452 \h </w:instrText>
         </w:r>
         <w:r>
           <w:rPr>
@@ -2117,7 +2117,7 @@
           <w:lang w:eastAsia="en-US"/>
         </w:rPr>
       </w:pPr>
-      <w:hyperlink w:anchor="_Toc230700120" w:history="1">
+      <w:hyperlink w:anchor="_Toc231118453" w:history="1">
         <w:r>
           <w:rPr>
             <w:rStyle w:val="Hyperlink"/>
@@ -2144,7 +2144,7 @@
             <w:noProof/>
             <w:webHidden/>
           </w:rPr>
-          <w:instrText xml:space="preserve"> PAGEREF _Toc230700120 \h </w:instrText>
+          <w:instrText xml:space="preserve"> PAGEREF _Toc231118453 \h </w:instrText>
         </w:r>
         <w:r>
           <w:rPr>
@@ -2186,7 +2186,7 @@
           <w:lang w:eastAsia="en-US"/>
         </w:rPr>
       </w:pPr>
-      <w:hyperlink w:anchor="_Toc230700121" w:history="1">
+      <w:hyperlink w:anchor="_Toc231118454" w:history="1">
         <w:r>
           <w:rPr>
             <w:rStyle w:val="Hyperlink"/>
@@ -2213,7 +2213,7 @@
             <w:noProof/>
             <w:webHidden/>
           </w:rPr>
-          <w:instrText xml:space="preserve"> PAGEREF _Toc230700121 \h </w:instrText>
+          <w:instrText xml:space="preserve"> PAGEREF _Toc231118454 \h </w:instrText>
         </w:r>
         <w:r>
           <w:rPr>
@@ -2255,7 +2255,7 @@
           <w:lang w:eastAsia="en-US"/>
         </w:rPr>
       </w:pPr>
-      <w:hyperlink w:anchor="_Toc230700122" w:history="1">
+      <w:hyperlink w:anchor="_Toc231118455" w:history="1">
         <w:r>
           <w:rPr>
             <w:rStyle w:val="Hyperlink"/>
@@ -2282,7 +2282,7 @@
             <w:noProof/>
             <w:webHidden/>
           </w:rPr>
-          <w:instrText xml:space="preserve"> PAGEREF _Toc230700122 \h </w:instrText>
+          <w:instrText xml:space="preserve"> PAGEREF _Toc231118455 \h </w:instrText>
         </w:r>
         <w:r>
           <w:rPr>
@@ -2324,7 +2324,7 @@
           <w:lang w:eastAsia="en-US"/>
         </w:rPr>
       </w:pPr>
-      <w:hyperlink w:anchor="_Toc230700123" w:history="1">
+      <w:hyperlink w:anchor="_Toc231118456" w:history="1">
         <w:r>
           <w:rPr>
             <w:rStyle w:val="Hyperlink"/>
@@ -2351,7 +2351,7 @@
             <w:noProof/>
             <w:webHidden/>
           </w:rPr>
-          <w:instrText xml:space="preserve"> PAGEREF _Toc230700123 \h </w:instrText>
+          <w:instrText xml:space="preserve"> PAGEREF _Toc231118456 \h </w:instrText>
         </w:r>
         <w:r>
           <w:rPr>
@@ -2393,7 +2393,7 @@
           <w:lang w:eastAsia="en-US"/>
         </w:rPr>
       </w:pPr>
-      <w:hyperlink w:anchor="_Toc230700124" w:history="1">
+      <w:hyperlink w:anchor="_Toc231118457" w:history="1">
         <w:r>
           <w:rPr>
             <w:rStyle w:val="Hyperlink"/>
@@ -2420,7 +2420,7 @@
             <w:noProof/>
             <w:webHidden/>
           </w:rPr>
-          <w:instrText xml:space="preserve"> PAGEREF _Toc230700124 \h </w:instrText>
+          <w:instrText xml:space="preserve"> PAGEREF _Toc231118457 \h </w:instrText>
         </w:r>
         <w:r>
           <w:rPr>
@@ -2462,7 +2462,7 @@
           <w:lang w:eastAsia="en-US"/>
         </w:rPr>
       </w:pPr>
-      <w:hyperlink w:anchor="_Toc230700125" w:history="1">
+      <w:hyperlink w:anchor="_Toc231118458" w:history="1">
         <w:r>
           <w:rPr>
             <w:rStyle w:val="Hyperlink"/>
@@ -2489,7 +2489,7 @@
             <w:noProof/>
             <w:webHidden/>
           </w:rPr>
-          <w:instrText xml:space="preserve"> PAGEREF _Toc230700125 \h </w:instrText>
+          <w:instrText xml:space="preserve"> PAGEREF _Toc231118458 \h </w:instrText>
         </w:r>
         <w:r>
           <w:rPr>
@@ -2531,7 +2531,7 @@
           <w:lang w:eastAsia="en-US"/>
         </w:rPr>
       </w:pPr>
-      <w:hyperlink w:anchor="_Toc230700126" w:history="1">
+      <w:hyperlink w:anchor="_Toc231118459" w:history="1">
         <w:r>
           <w:rPr>
             <w:rStyle w:val="Hyperlink"/>
@@ -2558,7 +2558,7 @@
             <w:noProof/>
             <w:webHidden/>
           </w:rPr>
-          <w:instrText xml:space="preserve"> PAGEREF _Toc230700126 \h </w:instrText>
+          <w:instrText xml:space="preserve"> PAGEREF _Toc231118459 \h </w:instrText>
         </w:r>
         <w:r>
           <w:rPr>
@@ -2600,7 +2600,7 @@
           <w:lang w:eastAsia="en-US"/>
         </w:rPr>
       </w:pPr>
-      <w:hyperlink w:anchor="_Toc230700127" w:history="1">
+      <w:hyperlink w:anchor="_Toc231118460" w:history="1">
         <w:r>
           <w:rPr>
             <w:rStyle w:val="Hyperlink"/>
@@ -2627,7 +2627,7 @@
             <w:noProof/>
             <w:webHidden/>
           </w:rPr>
-          <w:instrText xml:space="preserve"> PAGEREF _Toc230700127 \h </w:instrText>
+          <w:instrText xml:space="preserve"> PAGEREF _Toc231118460 \h </w:instrText>
         </w:r>
         <w:r>
           <w:rPr>
@@ -2669,7 +2669,7 @@
           <w:lang w:eastAsia="en-US"/>
         </w:rPr>
       </w:pPr>
-      <w:hyperlink w:anchor="_Toc230700128" w:history="1">
+      <w:hyperlink w:anchor="_Toc231118461" w:history="1">
         <w:r>
           <w:rPr>
             <w:rStyle w:val="Hyperlink"/>
@@ -2696,7 +2696,7 @@
             <w:noProof/>
             <w:webHidden/>
           </w:rPr>
-          <w:instrText xml:space="preserve"> PAGEREF _Toc230700128 \h </w:instrText>
+          <w:instrText xml:space="preserve"> PAGEREF _Toc231118461 \h </w:instrText>
         </w:r>
         <w:r>
           <w:rPr>
@@ -2738,7 +2738,7 @@
           <w:lang w:eastAsia="en-US"/>
         </w:rPr>
       </w:pPr>
-      <w:hyperlink w:anchor="_Toc230700129" w:history="1">
+      <w:hyperlink w:anchor="_Toc231118462" w:history="1">
         <w:r>
           <w:rPr>
             <w:rStyle w:val="Hyperlink"/>
@@ -2761,7 +2761,7 @@
           <w:rPr>
             <w:webHidden/>
           </w:rPr>
-          <w:instrText xml:space="preserve"> PAGEREF _Toc230700129 \h </w:instrText>
+          <w:instrText xml:space="preserve"> PAGEREF _Toc231118462 \h </w:instrText>
         </w:r>
         <w:r>
           <w:rPr>
@@ -2799,7 +2799,7 @@
           <w:lang w:eastAsia="en-US"/>
         </w:rPr>
       </w:pPr>
-      <w:hyperlink w:anchor="_Toc230700130" w:history="1">
+      <w:hyperlink w:anchor="_Toc231118463" w:history="1">
         <w:r>
           <w:rPr>
             <w:rStyle w:val="Hyperlink"/>
@@ -2826,7 +2826,7 @@
             <w:noProof/>
             <w:webHidden/>
           </w:rPr>
-          <w:instrText xml:space="preserve"> PAGEREF _Toc230700130 \h </w:instrText>
+          <w:instrText xml:space="preserve"> PAGEREF _Toc231118463 \h </w:instrText>
         </w:r>
         <w:r>
           <w:rPr>
@@ -2879,7 +2879,7 @@
       <w:pPr>
         <w:pStyle w:val="Heading1"/>
       </w:pPr>
-      <w:bookmarkStart w:id="0" w:name="_Toc230700091"/>
+      <w:bookmarkStart w:id="0" w:name="_Toc231118424"/>
       <w:r>
         <w:lastRenderedPageBreak/>
         <w:t>Source Control</w:t>
@@ -2966,7 +2966,7 @@
       <w:pPr>
         <w:pStyle w:val="Heading2"/>
       </w:pPr>
-      <w:bookmarkStart w:id="1" w:name="_Toc230700092"/>
+      <w:bookmarkStart w:id="1" w:name="_Toc231118425"/>
       <w:r>
         <w:t>Repositories</w:t>
       </w:r>
@@ -3176,7 +3176,7 @@
       <w:pPr>
         <w:pStyle w:val="Heading3"/>
       </w:pPr>
-      <w:bookmarkStart w:id="2" w:name="_Toc230700093"/>
+      <w:bookmarkStart w:id="2" w:name="_Toc231118426"/>
       <w:r>
         <w:t>Authentication</w:t>
       </w:r>
@@ -3561,7 +3561,7 @@
       <w:pPr>
         <w:pStyle w:val="Heading2"/>
       </w:pPr>
-      <w:bookmarkStart w:id="3" w:name="_Toc230700094"/>
+      <w:bookmarkStart w:id="3" w:name="_Toc231118427"/>
       <w:r>
         <w:t>Branches</w:t>
       </w:r>
@@ -3800,7 +3800,7 @@
       <w:pPr>
         <w:pStyle w:val="Heading2"/>
       </w:pPr>
-      <w:bookmarkStart w:id="4" w:name="_Toc230700095"/>
+      <w:bookmarkStart w:id="4" w:name="_Toc231118428"/>
       <w:r>
         <w:t>Creat</w:t>
       </w:r>
@@ -5451,7 +5451,7 @@
       <w:pPr>
         <w:pStyle w:val="Heading2"/>
       </w:pPr>
-      <w:bookmarkStart w:id="5" w:name="_Toc230700096"/>
+      <w:bookmarkStart w:id="5" w:name="_Toc231118429"/>
       <w:r>
         <w:t xml:space="preserve">Using Git </w:t>
       </w:r>
@@ -5467,7 +5467,7 @@
       <w:pPr>
         <w:pStyle w:val="Heading3"/>
       </w:pPr>
-      <w:bookmarkStart w:id="6" w:name="_Toc230700097"/>
+      <w:bookmarkStart w:id="6" w:name="_Toc231118430"/>
       <w:r>
         <w:t>Configuration</w:t>
       </w:r>
@@ -6130,7 +6130,7 @@
       <w:pPr>
         <w:pStyle w:val="Heading3"/>
       </w:pPr>
-      <w:bookmarkStart w:id="7" w:name="_Toc230700098"/>
+      <w:bookmarkStart w:id="7" w:name="_Toc231118431"/>
       <w:r>
         <w:t>Create</w:t>
       </w:r>
@@ -6321,7 +6321,7 @@
       <w:pPr>
         <w:pStyle w:val="Heading3"/>
       </w:pPr>
-      <w:bookmarkStart w:id="8" w:name="_Toc230700099"/>
+      <w:bookmarkStart w:id="8" w:name="_Toc231118432"/>
       <w:r>
         <w:t>Create</w:t>
       </w:r>
@@ -6456,7 +6456,7 @@
       <w:pPr>
         <w:pStyle w:val="Heading3"/>
       </w:pPr>
-      <w:bookmarkStart w:id="9" w:name="_Toc230700100"/>
+      <w:bookmarkStart w:id="9" w:name="_Toc231118433"/>
       <w:r>
         <w:t>Synchronize with Remote Repository</w:t>
       </w:r>
@@ -6566,7 +6566,7 @@
       <w:pPr>
         <w:pStyle w:val="Heading3"/>
       </w:pPr>
-      <w:bookmarkStart w:id="10" w:name="_Toc230700101"/>
+      <w:bookmarkStart w:id="10" w:name="_Toc231118434"/>
       <w:r>
         <w:t>Get Status</w:t>
       </w:r>
@@ -7037,7 +7037,7 @@
       <w:pPr>
         <w:pStyle w:val="Heading3"/>
       </w:pPr>
-      <w:bookmarkStart w:id="11" w:name="_Toc230700102"/>
+      <w:bookmarkStart w:id="11" w:name="_Toc231118435"/>
       <w:r>
         <w:t>Select a Branch</w:t>
       </w:r>
@@ -7700,7 +7700,7 @@
       <w:pPr>
         <w:pStyle w:val="Heading3"/>
       </w:pPr>
-      <w:bookmarkStart w:id="12" w:name="_Toc230700103"/>
+      <w:bookmarkStart w:id="12" w:name="_Toc231118436"/>
       <w:r>
         <w:t>Create a New Branch</w:t>
       </w:r>
@@ -7876,7 +7876,7 @@
       <w:pPr>
         <w:pStyle w:val="Heading3"/>
       </w:pPr>
-      <w:bookmarkStart w:id="13" w:name="_Toc230700104"/>
+      <w:bookmarkStart w:id="13" w:name="_Toc231118437"/>
       <w:r>
         <w:t>Add</w:t>
       </w:r>
@@ -8113,7 +8113,7 @@
       <w:pPr>
         <w:pStyle w:val="Heading3"/>
       </w:pPr>
-      <w:bookmarkStart w:id="14" w:name="_Toc230700105"/>
+      <w:bookmarkStart w:id="14" w:name="_Toc231118438"/>
       <w:r>
         <w:t>Delete a file</w:t>
       </w:r>
@@ -8252,7 +8252,7 @@
       <w:pPr>
         <w:pStyle w:val="Heading3"/>
       </w:pPr>
-      <w:bookmarkStart w:id="15" w:name="_Toc230700106"/>
+      <w:bookmarkStart w:id="15" w:name="_Toc231118439"/>
       <w:r>
         <w:t>Change a File</w:t>
       </w:r>
@@ -8563,7 +8563,7 @@
       <w:pPr>
         <w:pStyle w:val="Heading3"/>
       </w:pPr>
-      <w:bookmarkStart w:id="16" w:name="_Toc230700107"/>
+      <w:bookmarkStart w:id="16" w:name="_Toc231118440"/>
       <w:r>
         <w:t>Stage a File</w:t>
       </w:r>
@@ -8950,7 +8950,7 @@
       <w:pPr>
         <w:pStyle w:val="Heading3"/>
       </w:pPr>
-      <w:bookmarkStart w:id="17" w:name="_Toc230700108"/>
+      <w:bookmarkStart w:id="17" w:name="_Toc231118441"/>
       <w:r>
         <w:t xml:space="preserve">Commit a </w:t>
       </w:r>
@@ -9081,7 +9081,7 @@
       <w:pPr>
         <w:pStyle w:val="Heading3"/>
       </w:pPr>
-      <w:bookmarkStart w:id="18" w:name="_Toc230700109"/>
+      <w:bookmarkStart w:id="18" w:name="_Toc231118442"/>
       <w:r>
         <w:t>Push Changes to the Remote Repository</w:t>
       </w:r>
@@ -9220,7 +9220,7 @@
       <w:pPr>
         <w:pStyle w:val="Heading3"/>
       </w:pPr>
-      <w:bookmarkStart w:id="19" w:name="_Toc230700110"/>
+      <w:bookmarkStart w:id="19" w:name="_Toc231118443"/>
       <w:r>
         <w:t>Make a Change</w:t>
       </w:r>
@@ -9737,7 +9737,7 @@
       <w:pPr>
         <w:pStyle w:val="Heading3"/>
       </w:pPr>
-      <w:bookmarkStart w:id="20" w:name="_Toc230700111"/>
+      <w:bookmarkStart w:id="20" w:name="_Toc231118444"/>
       <w:r>
         <w:t>Make Change to Main Branch</w:t>
       </w:r>
@@ -10048,7 +10048,7 @@
       <w:pPr>
         <w:pStyle w:val="Heading3"/>
       </w:pPr>
-      <w:bookmarkStart w:id="21" w:name="_Toc230700112"/>
+      <w:bookmarkStart w:id="21" w:name="_Toc231118445"/>
       <w:r>
         <w:t xml:space="preserve">Merge Development Branch into </w:t>
       </w:r>
@@ -11206,7 +11206,7 @@
       <w:pPr>
         <w:pStyle w:val="Heading3"/>
       </w:pPr>
-      <w:bookmarkStart w:id="22" w:name="_Toc230700113"/>
+      <w:bookmarkStart w:id="22" w:name="_Toc231118446"/>
       <w:r>
         <w:t>Get a Past Version of TaxTools</w:t>
       </w:r>
@@ -11216,7 +11216,7 @@
       <w:pPr>
         <w:pStyle w:val="Heading3"/>
       </w:pPr>
-      <w:bookmarkStart w:id="23" w:name="_Toc230700114"/>
+      <w:bookmarkStart w:id="23" w:name="_Toc231118447"/>
       <w:r>
         <w:t>Create a Tag</w:t>
       </w:r>
@@ -11510,7 +11510,7 @@
       <w:pPr>
         <w:pStyle w:val="Heading2"/>
       </w:pPr>
-      <w:bookmarkStart w:id="24" w:name="_Toc230700115"/>
+      <w:bookmarkStart w:id="24" w:name="_Toc231118448"/>
       <w:r>
         <w:rPr>
           <w:lang w:eastAsia="ar-SA"/>
@@ -11818,7 +11818,7 @@
       <w:pPr>
         <w:pStyle w:val="Heading2"/>
       </w:pPr>
-      <w:bookmarkStart w:id="25" w:name="_Toc230700116"/>
+      <w:bookmarkStart w:id="25" w:name="_Toc231118449"/>
       <w:r>
         <w:t>Git Terminology</w:t>
       </w:r>
@@ -12116,7 +12116,7 @@
       <w:pPr>
         <w:pStyle w:val="Heading1"/>
       </w:pPr>
-      <w:bookmarkStart w:id="26" w:name="_Toc230700117"/>
+      <w:bookmarkStart w:id="26" w:name="_Toc231118450"/>
       <w:r>
         <w:lastRenderedPageBreak/>
         <w:t>Editing Tools</w:t>
@@ -12128,7 +12128,7 @@
         <w:pStyle w:val="Heading2"/>
       </w:pPr>
       <w:bookmarkStart w:id="27" w:name="_Toc227669204"/>
-      <w:bookmarkStart w:id="28" w:name="_Toc230700118"/>
+      <w:bookmarkStart w:id="28" w:name="_Toc231118451"/>
       <w:r>
         <w:t>VS Code</w:t>
       </w:r>
@@ -12158,7 +12158,7 @@
       <w:pPr>
         <w:pStyle w:val="Heading3"/>
       </w:pPr>
-      <w:bookmarkStart w:id="29" w:name="_Toc230700119"/>
+      <w:bookmarkStart w:id="29" w:name="_Toc231118452"/>
       <w:r>
         <w:t>Installation</w:t>
       </w:r>
@@ -12329,7 +12329,7 @@
       <w:pPr>
         <w:pStyle w:val="Heading3"/>
       </w:pPr>
-      <w:bookmarkStart w:id="30" w:name="_Toc230700120"/>
+      <w:bookmarkStart w:id="30" w:name="_Toc231118453"/>
       <w:r>
         <w:t>Configuration Settings</w:t>
       </w:r>
@@ -12763,7 +12763,7 @@
       <w:pPr>
         <w:pStyle w:val="Heading3"/>
       </w:pPr>
-      <w:bookmarkStart w:id="31" w:name="_Toc230700121"/>
+      <w:bookmarkStart w:id="31" w:name="_Toc231118454"/>
       <w:r>
         <w:t>Extensions</w:t>
       </w:r>
@@ -12909,7 +12909,7 @@
       <w:pPr>
         <w:pStyle w:val="Heading3"/>
       </w:pPr>
-      <w:bookmarkStart w:id="32" w:name="_Toc230700122"/>
+      <w:bookmarkStart w:id="32" w:name="_Toc231118455"/>
       <w:r>
         <w:t>Command Summary</w:t>
       </w:r>
@@ -13078,12 +13078,12 @@
       <w:pPr>
         <w:pStyle w:val="Heading2"/>
       </w:pPr>
-      <w:bookmarkStart w:id="33" w:name="_Toc230700123"/>
-      <w:bookmarkStart w:id="34" w:name="_Toc227669205"/>
+      <w:bookmarkStart w:id="33" w:name="_Toc227669205"/>
+      <w:bookmarkStart w:id="34" w:name="_Toc231118456"/>
       <w:r>
         <w:t>Node and NPM</w:t>
       </w:r>
-      <w:bookmarkEnd w:id="33"/>
+      <w:bookmarkEnd w:id="34"/>
     </w:p>
     <w:p>
       <w:pPr>
@@ -13119,7 +13119,7 @@
       <w:pPr>
         <w:pStyle w:val="Heading3"/>
       </w:pPr>
-      <w:bookmarkStart w:id="35" w:name="_Toc230700124"/>
+      <w:bookmarkStart w:id="35" w:name="_Toc231118457"/>
       <w:r>
         <w:t>Installation</w:t>
       </w:r>
@@ -13379,7 +13379,7 @@
       <w:pPr>
         <w:pStyle w:val="Heading3"/>
       </w:pPr>
-      <w:bookmarkStart w:id="36" w:name="_Toc230700125"/>
+      <w:bookmarkStart w:id="36" w:name="_Toc231118458"/>
       <w:r>
         <w:t>Prettier</w:t>
       </w:r>
@@ -13687,7 +13687,7 @@
       <w:pPr>
         <w:pStyle w:val="Heading3"/>
       </w:pPr>
-      <w:bookmarkStart w:id="37" w:name="_Toc230700126"/>
+      <w:bookmarkStart w:id="37" w:name="_Toc231118459"/>
       <w:proofErr w:type="spellStart"/>
       <w:r>
         <w:t>ESLint</w:t>
@@ -14033,7 +14033,7 @@
         <w:pStyle w:val="SourceCode"/>
       </w:pPr>
     </w:p>
-    <w:bookmarkEnd w:id="34"/>
+    <w:bookmarkEnd w:id="33"/>
     <w:p>
       <w:pPr>
         <w:pStyle w:val="Body-Text"/>
@@ -14058,7 +14058,7 @@
       <w:pPr>
         <w:pStyle w:val="Heading2"/>
       </w:pPr>
-      <w:bookmarkStart w:id="38" w:name="_Toc230700127"/>
+      <w:bookmarkStart w:id="38" w:name="_Toc231118460"/>
       <w:r>
         <w:t>Git</w:t>
       </w:r>
@@ -14076,7 +14076,7 @@
       <w:pPr>
         <w:pStyle w:val="Heading3"/>
       </w:pPr>
-      <w:bookmarkStart w:id="39" w:name="_Toc230700128"/>
+      <w:bookmarkStart w:id="39" w:name="_Toc231118461"/>
       <w:r>
         <w:t>Inst</w:t>
       </w:r>
@@ -14203,7 +14203,7 @@
       <w:pPr>
         <w:pStyle w:val="Heading1"/>
       </w:pPr>
-      <w:bookmarkStart w:id="40" w:name="_Toc230700129"/>
+      <w:bookmarkStart w:id="40" w:name="_Toc231118462"/>
       <w:r>
         <w:t>Notes</w:t>
       </w:r>
@@ -14213,7 +14213,7 @@
       <w:pPr>
         <w:pStyle w:val="Heading2"/>
       </w:pPr>
-      <w:bookmarkStart w:id="41" w:name="_Toc230700130"/>
+      <w:bookmarkStart w:id="41" w:name="_Toc231118463"/>
       <w:r>
         <w:t>Coding Conventions</w:t>
       </w:r>
@@ -14240,7 +14240,22 @@
         </w:numPr>
       </w:pPr>
       <w:r>
-        <w:t>Variable, function, property, and method names use camel case.</w:t>
+        <w:t>Variable names are all lower case with words separated by underscores.</w:t>
+      </w:r>
+    </w:p>
+    <w:p>
+      <w:pPr>
+        <w:pStyle w:val="Body-Text"/>
+        <w:numPr>
+          <w:ilvl w:val="0"/>
+          <w:numId w:val="18"/>
+        </w:numPr>
+      </w:pPr>
+      <w:r>
+        <w:t>F</w:t>
+      </w:r>
+      <w:r>
+        <w:t>unction, property, and method names use camel case.</w:t>
       </w:r>
     </w:p>
     <w:p>
@@ -14462,7 +14477,7 @@
         <w:szCs w:val="24"/>
         <w:lang w:eastAsia="en-US"/>
       </w:rPr>
-      <w:t>12</w:t>
+      <w:t>15</w:t>
     </w:r>
     <w:r>
       <w:rPr>
@@ -17785,7 +17800,7 @@
 </file>
 
 <file path=customXml/itemProps1.xml><?xml version="1.0" encoding="utf-8"?>
-<ds:datastoreItem xmlns:ds="http://schemas.openxmlformats.org/officeDocument/2006/customXml" ds:itemID="{FE71F5B3-1A0D-4D73-B0A0-7D1F187375C0}">
+<ds:datastoreItem xmlns:ds="http://schemas.openxmlformats.org/officeDocument/2006/customXml" ds:itemID="{612DA385-1603-4E27-B6DD-6D217654FA3E}">
   <ds:schemaRefs>
     <ds:schemaRef ds:uri="http://schemas.openxmlformats.org/officeDocument/2006/bibliography"/>
   </ds:schemaRefs>

</xml_diff>